<commit_message>
fix(p1): align buyer files, print layouts and release checks
</commit_message>
<xml_diff>
--- a/products-storage/01-zakrytie-rabot/00-INSTRUKCIYA.docx
+++ b/products-storage/01-zakrytie-rabot/00-INSTRUKCIYA.docx
@@ -86,13 +86,23 @@
         <w:gridCol w:w="3120"/>
       </w:tblGrid>
       <w:tr>
+        <w:trPr>
+          <w:cantSplit/>
+          <w:tblHeader/>
+        </w:trPr>
         <w:tc>
           <w:tcPr>
             <w:tcW w:type="dxa" w:w="3120"/>
             <w:shd w:fill="E9E5DC"/>
           </w:tcPr>
           <w:p>
+            <w:pPr>
+              <w:spacing w:after="0"/>
+            </w:pPr>
             <w:r>
+              <w:rPr>
+                <w:sz w:val="18"/>
+              </w:rPr>
               <w:t>Файл</w:t>
             </w:r>
           </w:p>
@@ -103,7 +113,13 @@
             <w:shd w:fill="E9E5DC"/>
           </w:tcPr>
           <w:p>
+            <w:pPr>
+              <w:spacing w:after="0"/>
+            </w:pPr>
             <w:r>
+              <w:rPr>
+                <w:sz w:val="18"/>
+              </w:rPr>
               <w:t>Когда использовать</w:t>
             </w:r>
           </w:p>
@@ -114,19 +130,34 @@
             <w:shd w:fill="E9E5DC"/>
           </w:tcPr>
           <w:p>
+            <w:pPr>
+              <w:spacing w:after="0"/>
+            </w:pPr>
             <w:r>
+              <w:rPr>
+                <w:sz w:val="18"/>
+              </w:rPr>
               <w:t>Результат</w:t>
             </w:r>
           </w:p>
         </w:tc>
       </w:tr>
       <w:tr>
+        <w:trPr>
+          <w:cantSplit/>
+        </w:trPr>
         <w:tc>
           <w:tcPr>
             <w:tcW w:type="dxa" w:w="3120"/>
           </w:tcPr>
           <w:p>
+            <w:pPr>
+              <w:spacing w:after="0"/>
+            </w:pPr>
             <w:r>
+              <w:rPr>
+                <w:sz w:val="18"/>
+              </w:rPr>
               <w:t>01-ks-2.docx</w:t>
             </w:r>
           </w:p>
@@ -136,8 +167,14 @@
             <w:tcW w:type="dxa" w:w="3120"/>
           </w:tcPr>
           <w:p>
+            <w:pPr>
+              <w:spacing w:after="0"/>
+            </w:pPr>
             <w:r>
-              <w:t>Для оформления позиции, уведомления или соглашения</w:t>
+              <w:rPr>
+                <w:sz w:val="18"/>
+              </w:rPr>
+              <w:t>При оформлении объёмов работ</w:t>
             </w:r>
           </w:p>
         </w:tc>
@@ -146,19 +183,34 @@
             <w:tcW w:type="dxa" w:w="3120"/>
           </w:tcPr>
           <w:p>
+            <w:pPr>
+              <w:spacing w:after="0"/>
+            </w:pPr>
             <w:r>
-              <w:t>Заполненный документ/реестр с ответственным и датой</w:t>
+              <w:rPr>
+                <w:sz w:val="18"/>
+              </w:rPr>
+              <w:t>Проект КС-2 с проверенными объёмами</w:t>
             </w:r>
           </w:p>
         </w:tc>
       </w:tr>
       <w:tr>
+        <w:trPr>
+          <w:cantSplit/>
+        </w:trPr>
         <w:tc>
           <w:tcPr>
             <w:tcW w:type="dxa" w:w="3120"/>
           </w:tcPr>
           <w:p>
+            <w:pPr>
+              <w:spacing w:after="0"/>
+            </w:pPr>
             <w:r>
+              <w:rPr>
+                <w:sz w:val="18"/>
+              </w:rPr>
               <w:t>02-ks-3.docx</w:t>
             </w:r>
           </w:p>
@@ -168,8 +220,14 @@
             <w:tcW w:type="dxa" w:w="3120"/>
           </w:tcPr>
           <w:p>
+            <w:pPr>
+              <w:spacing w:after="0"/>
+            </w:pPr>
             <w:r>
-              <w:t>Для оформления позиции, уведомления или соглашения</w:t>
+              <w:rPr>
+                <w:sz w:val="18"/>
+              </w:rPr>
+              <w:t>При своде стоимости по КС-2</w:t>
             </w:r>
           </w:p>
         </w:tc>
@@ -178,19 +236,34 @@
             <w:tcW w:type="dxa" w:w="3120"/>
           </w:tcPr>
           <w:p>
+            <w:pPr>
+              <w:spacing w:after="0"/>
+            </w:pPr>
             <w:r>
-              <w:t>Заполненный документ/реестр с ответственным и датой</w:t>
+              <w:rPr>
+                <w:sz w:val="18"/>
+              </w:rPr>
+              <w:t>Проект КС-3 с проверенной суммой</w:t>
             </w:r>
           </w:p>
         </w:tc>
       </w:tr>
       <w:tr>
+        <w:trPr>
+          <w:cantSplit/>
+        </w:trPr>
         <w:tc>
           <w:tcPr>
             <w:tcW w:type="dxa" w:w="3120"/>
           </w:tcPr>
           <w:p>
+            <w:pPr>
+              <w:spacing w:after="0"/>
+            </w:pPr>
             <w:r>
+              <w:rPr>
+                <w:sz w:val="18"/>
+              </w:rPr>
               <w:t>03-akt-vypolnennyh-rabot.docx</w:t>
             </w:r>
           </w:p>
@@ -200,8 +273,14 @@
             <w:tcW w:type="dxa" w:w="3120"/>
           </w:tcPr>
           <w:p>
+            <w:pPr>
+              <w:spacing w:after="0"/>
+            </w:pPr>
             <w:r>
-              <w:t>Для оформления позиции, уведомления или соглашения</w:t>
+              <w:rPr>
+                <w:sz w:val="18"/>
+              </w:rPr>
+              <w:t>Для фиксации выполненных работ</w:t>
             </w:r>
           </w:p>
         </w:tc>
@@ -210,19 +289,34 @@
             <w:tcW w:type="dxa" w:w="3120"/>
           </w:tcPr>
           <w:p>
+            <w:pPr>
+              <w:spacing w:after="0"/>
+            </w:pPr>
             <w:r>
-              <w:t>Заполненный документ/реестр с ответственным и датой</w:t>
+              <w:rPr>
+                <w:sz w:val="18"/>
+              </w:rPr>
+              <w:t>Акт с датой и подписями</w:t>
             </w:r>
           </w:p>
         </w:tc>
       </w:tr>
       <w:tr>
+        <w:trPr>
+          <w:cantSplit/>
+        </w:trPr>
         <w:tc>
           <w:tcPr>
             <w:tcW w:type="dxa" w:w="3120"/>
           </w:tcPr>
           <w:p>
+            <w:pPr>
+              <w:spacing w:after="0"/>
+            </w:pPr>
             <w:r>
+              <w:rPr>
+                <w:sz w:val="18"/>
+              </w:rPr>
               <w:t>04-akt-priemki.docx</w:t>
             </w:r>
           </w:p>
@@ -232,8 +326,14 @@
             <w:tcW w:type="dxa" w:w="3120"/>
           </w:tcPr>
           <w:p>
+            <w:pPr>
+              <w:spacing w:after="0"/>
+            </w:pPr>
             <w:r>
-              <w:t>Для оформления позиции, уведомления или соглашения</w:t>
+              <w:rPr>
+                <w:sz w:val="18"/>
+              </w:rPr>
+              <w:t>При согласовании результата работ</w:t>
             </w:r>
           </w:p>
         </w:tc>
@@ -242,19 +342,34 @@
             <w:tcW w:type="dxa" w:w="3120"/>
           </w:tcPr>
           <w:p>
+            <w:pPr>
+              <w:spacing w:after="0"/>
+            </w:pPr>
             <w:r>
-              <w:t>Заполненный документ/реестр с ответственным и датой</w:t>
+              <w:rPr>
+                <w:sz w:val="18"/>
+              </w:rPr>
+              <w:t>Акт приёмки с замечаниями или подписями</w:t>
             </w:r>
           </w:p>
         </w:tc>
       </w:tr>
       <w:tr>
+        <w:trPr>
+          <w:cantSplit/>
+        </w:trPr>
         <w:tc>
           <w:tcPr>
             <w:tcW w:type="dxa" w:w="3120"/>
           </w:tcPr>
           <w:p>
+            <w:pPr>
+              <w:spacing w:after="0"/>
+            </w:pPr>
             <w:r>
+              <w:rPr>
+                <w:sz w:val="18"/>
+              </w:rPr>
               <w:t>05-peredatochnyy-akt.docx</w:t>
             </w:r>
           </w:p>
@@ -264,8 +379,14 @@
             <w:tcW w:type="dxa" w:w="3120"/>
           </w:tcPr>
           <w:p>
+            <w:pPr>
+              <w:spacing w:after="0"/>
+            </w:pPr>
             <w:r>
-              <w:t>Для оформления позиции, уведомления или соглашения</w:t>
+              <w:rPr>
+                <w:sz w:val="18"/>
+              </w:rPr>
+              <w:t>При передаче пакета заказчику</w:t>
             </w:r>
           </w:p>
         </w:tc>
@@ -274,19 +395,34 @@
             <w:tcW w:type="dxa" w:w="3120"/>
           </w:tcPr>
           <w:p>
+            <w:pPr>
+              <w:spacing w:after="0"/>
+            </w:pPr>
             <w:r>
-              <w:t>Заполненный документ/реестр с ответственным и датой</w:t>
+              <w:rPr>
+                <w:sz w:val="18"/>
+              </w:rPr>
+              <w:t>Состав переданного и подтверждение вручения</w:t>
             </w:r>
           </w:p>
         </w:tc>
       </w:tr>
       <w:tr>
+        <w:trPr>
+          <w:cantSplit/>
+        </w:trPr>
         <w:tc>
           <w:tcPr>
             <w:tcW w:type="dxa" w:w="3120"/>
           </w:tcPr>
           <w:p>
+            <w:pPr>
+              <w:spacing w:after="0"/>
+            </w:pPr>
             <w:r>
+              <w:rPr>
+                <w:sz w:val="18"/>
+              </w:rPr>
               <w:t>06-zhurnal-obemov.xlsx</w:t>
             </w:r>
           </w:p>
@@ -296,8 +432,14 @@
             <w:tcW w:type="dxa" w:w="3120"/>
           </w:tcPr>
           <w:p>
+            <w:pPr>
+              <w:spacing w:after="0"/>
+            </w:pPr>
             <w:r>
-              <w:t>Для постоянного контроля статуса, сумм и сроков</w:t>
+              <w:rPr>
+                <w:sz w:val="18"/>
+              </w:rPr>
+              <w:t>Для фиксации выполненных объёмов</w:t>
             </w:r>
           </w:p>
         </w:tc>
@@ -306,19 +448,34 @@
             <w:tcW w:type="dxa" w:w="3120"/>
           </w:tcPr>
           <w:p>
+            <w:pPr>
+              <w:spacing w:after="0"/>
+            </w:pPr>
             <w:r>
-              <w:t>Заполненный документ/реестр с ответственным и датой</w:t>
+              <w:rPr>
+                <w:sz w:val="18"/>
+              </w:rPr>
+              <w:t>Журнал и ссылки на доказательства</w:t>
             </w:r>
           </w:p>
         </w:tc>
       </w:tr>
       <w:tr>
+        <w:trPr>
+          <w:cantSplit/>
+        </w:trPr>
         <w:tc>
           <w:tcPr>
             <w:tcW w:type="dxa" w:w="3120"/>
           </w:tcPr>
           <w:p>
+            <w:pPr>
+              <w:spacing w:after="0"/>
+            </w:pPr>
             <w:r>
+              <w:rPr>
+                <w:sz w:val="18"/>
+              </w:rPr>
               <w:t>07-reestr-zamechaniy.xlsx</w:t>
             </w:r>
           </w:p>
@@ -328,8 +485,14 @@
             <w:tcW w:type="dxa" w:w="3120"/>
           </w:tcPr>
           <w:p>
+            <w:pPr>
+              <w:spacing w:after="0"/>
+            </w:pPr>
             <w:r>
-              <w:t>Для постоянного контроля статуса, сумм и сроков</w:t>
+              <w:rPr>
+                <w:sz w:val="18"/>
+              </w:rPr>
+              <w:t>Для учёта и закрытия замечаний</w:t>
             </w:r>
           </w:p>
         </w:tc>
@@ -338,19 +501,34 @@
             <w:tcW w:type="dxa" w:w="3120"/>
           </w:tcPr>
           <w:p>
+            <w:pPr>
+              <w:spacing w:after="0"/>
+            </w:pPr>
             <w:r>
-              <w:t>Заполненный документ/реестр с ответственным и датой</w:t>
+              <w:rPr>
+                <w:sz w:val="18"/>
+              </w:rPr>
+              <w:t>Статусы, сроки и доказательства закрытия</w:t>
             </w:r>
           </w:p>
         </w:tc>
       </w:tr>
       <w:tr>
+        <w:trPr>
+          <w:cantSplit/>
+        </w:trPr>
         <w:tc>
           <w:tcPr>
             <w:tcW w:type="dxa" w:w="3120"/>
           </w:tcPr>
           <w:p>
+            <w:pPr>
+              <w:spacing w:after="0"/>
+            </w:pPr>
             <w:r>
+              <w:rPr>
+                <w:sz w:val="18"/>
+              </w:rPr>
               <w:t>08-reestr-peredachi.xlsx</w:t>
             </w:r>
           </w:p>
@@ -360,8 +538,14 @@
             <w:tcW w:type="dxa" w:w="3120"/>
           </w:tcPr>
           <w:p>
+            <w:pPr>
+              <w:spacing w:after="0"/>
+            </w:pPr>
             <w:r>
-              <w:t>Для постоянного контроля статуса, сумм и сроков</w:t>
+              <w:rPr>
+                <w:sz w:val="18"/>
+              </w:rPr>
+              <w:t>Для фиксации состава и передачи</w:t>
             </w:r>
           </w:p>
         </w:tc>
@@ -370,19 +554,34 @@
             <w:tcW w:type="dxa" w:w="3120"/>
           </w:tcPr>
           <w:p>
+            <w:pPr>
+              <w:spacing w:after="0"/>
+            </w:pPr>
             <w:r>
-              <w:t>Заполненный документ/реестр с ответственным и датой</w:t>
+              <w:rPr>
+                <w:sz w:val="18"/>
+              </w:rPr>
+              <w:t>Дата, канал, получатель и подтверждение</w:t>
             </w:r>
           </w:p>
         </w:tc>
       </w:tr>
       <w:tr>
+        <w:trPr>
+          <w:cantSplit/>
+        </w:trPr>
         <w:tc>
           <w:tcPr>
             <w:tcW w:type="dxa" w:w="3120"/>
           </w:tcPr>
           <w:p>
+            <w:pPr>
+              <w:spacing w:after="0"/>
+            </w:pPr>
             <w:r>
+              <w:rPr>
+                <w:sz w:val="18"/>
+              </w:rPr>
               <w:t>09-checklist-peredachi.pdf</w:t>
             </w:r>
           </w:p>
@@ -392,8 +591,14 @@
             <w:tcW w:type="dxa" w:w="3120"/>
           </w:tcPr>
           <w:p>
+            <w:pPr>
+              <w:spacing w:after="0"/>
+            </w:pPr>
             <w:r>
-              <w:t>Для быстрой проверки последовательности действий</w:t>
+              <w:rPr>
+                <w:sz w:val="18"/>
+              </w:rPr>
+              <w:t>Перед передачей комплекта</w:t>
             </w:r>
           </w:p>
         </w:tc>
@@ -402,19 +607,34 @@
             <w:tcW w:type="dxa" w:w="3120"/>
           </w:tcPr>
           <w:p>
+            <w:pPr>
+              <w:spacing w:after="0"/>
+            </w:pPr>
             <w:r>
-              <w:t>Заполненный документ/реестр с ответственным и датой</w:t>
+              <w:rPr>
+                <w:sz w:val="18"/>
+              </w:rPr>
+              <w:t>Отмеченные проверки и пробелы</w:t>
             </w:r>
           </w:p>
         </w:tc>
       </w:tr>
       <w:tr>
+        <w:trPr>
+          <w:cantSplit/>
+        </w:trPr>
         <w:tc>
           <w:tcPr>
             <w:tcW w:type="dxa" w:w="3120"/>
           </w:tcPr>
           <w:p>
+            <w:pPr>
+              <w:spacing w:after="0"/>
+            </w:pPr>
             <w:r>
+              <w:rPr>
+                <w:sz w:val="18"/>
+              </w:rPr>
               <w:t>10-sroki-hraneniya.pdf</w:t>
             </w:r>
           </w:p>
@@ -424,8 +644,14 @@
             <w:tcW w:type="dxa" w:w="3120"/>
           </w:tcPr>
           <w:p>
+            <w:pPr>
+              <w:spacing w:after="0"/>
+            </w:pPr>
             <w:r>
-              <w:t>Для быстрой проверки последовательности действий</w:t>
+              <w:rPr>
+                <w:sz w:val="18"/>
+              </w:rPr>
+              <w:t>Для организации хранения и подтверждений передачи</w:t>
             </w:r>
           </w:p>
         </w:tc>
@@ -434,8 +660,332 @@
             <w:tcW w:type="dxa" w:w="3120"/>
           </w:tcPr>
           <w:p>
+            <w:pPr>
+              <w:spacing w:after="0"/>
+            </w:pPr>
             <w:r>
-              <w:t>Заполненный документ/реестр с ответственным и датой</w:t>
+              <w:rPr>
+                <w:sz w:val="18"/>
+              </w:rPr>
+              <w:t>Определены правила хранения по виду документов</w:t>
+            </w:r>
+          </w:p>
+        </w:tc>
+      </w:tr>
+      <w:tr>
+        <w:trPr>
+          <w:cantSplit/>
+        </w:trPr>
+        <w:tc>
+          <w:tcPr>
+            <w:tcW w:type="dxa" w:w="3120"/>
+          </w:tcPr>
+          <w:p>
+            <w:pPr>
+              <w:spacing w:after="0"/>
+            </w:pPr>
+            <w:r>
+              <w:rPr>
+                <w:sz w:val="18"/>
+              </w:rPr>
+              <w:t>11-slovar-poley.docx</w:t>
+            </w:r>
+          </w:p>
+        </w:tc>
+        <w:tc>
+          <w:tcPr>
+            <w:tcW w:type="dxa" w:w="3120"/>
+          </w:tcPr>
+          <w:p>
+            <w:pPr>
+              <w:spacing w:after="0"/>
+            </w:pPr>
+            <w:r>
+              <w:rPr>
+                <w:sz w:val="18"/>
+              </w:rPr>
+              <w:t>Перед заполнением шаблонов: значения полей и источники данных</w:t>
+            </w:r>
+          </w:p>
+        </w:tc>
+        <w:tc>
+          <w:tcPr>
+            <w:tcW w:type="dxa" w:w="3120"/>
+          </w:tcPr>
+          <w:p>
+            <w:pPr>
+              <w:spacing w:after="0"/>
+            </w:pPr>
+            <w:r>
+              <w:rPr>
+                <w:sz w:val="18"/>
+              </w:rPr>
+              <w:t>Проверены исходные данные для заполнения</w:t>
+            </w:r>
+          </w:p>
+        </w:tc>
+      </w:tr>
+      <w:tr>
+        <w:trPr>
+          <w:cantSplit/>
+        </w:trPr>
+        <w:tc>
+          <w:tcPr>
+            <w:tcW w:type="dxa" w:w="3120"/>
+          </w:tcPr>
+          <w:p>
+            <w:pPr>
+              <w:spacing w:after="0"/>
+            </w:pPr>
+            <w:r>
+              <w:rPr>
+                <w:sz w:val="18"/>
+              </w:rPr>
+              <w:t>12-pretenziya-na-neoplatu-po-ks-2.docx</w:t>
+            </w:r>
+          </w:p>
+        </w:tc>
+        <w:tc>
+          <w:tcPr>
+            <w:tcW w:type="dxa" w:w="3120"/>
+          </w:tcPr>
+          <w:p>
+            <w:pPr>
+              <w:spacing w:after="0"/>
+            </w:pPr>
+            <w:r>
+              <w:rPr>
+                <w:sz w:val="18"/>
+              </w:rPr>
+              <w:t>После проверки приёмки, срока оплаты и претензионного порядка</w:t>
+            </w:r>
+          </w:p>
+        </w:tc>
+        <w:tc>
+          <w:tcPr>
+            <w:tcW w:type="dxa" w:w="3120"/>
+          </w:tcPr>
+          <w:p>
+            <w:pPr>
+              <w:spacing w:after="0"/>
+            </w:pPr>
+            <w:r>
+              <w:rPr>
+                <w:sz w:val="18"/>
+              </w:rPr>
+              <w:t>Адаптированная претензия с приложениями</w:t>
+            </w:r>
+          </w:p>
+        </w:tc>
+      </w:tr>
+      <w:tr>
+        <w:trPr>
+          <w:cantSplit/>
+        </w:trPr>
+        <w:tc>
+          <w:tcPr>
+            <w:tcW w:type="dxa" w:w="3120"/>
+          </w:tcPr>
+          <w:p>
+            <w:pPr>
+              <w:spacing w:after="0"/>
+            </w:pPr>
+            <w:r>
+              <w:rPr>
+                <w:sz w:val="18"/>
+              </w:rPr>
+              <w:t>13-uvedomlenie-o-prosrochke-oplaty.docx</w:t>
+            </w:r>
+          </w:p>
+        </w:tc>
+        <w:tc>
+          <w:tcPr>
+            <w:tcW w:type="dxa" w:w="3120"/>
+          </w:tcPr>
+          <w:p>
+            <w:pPr>
+              <w:spacing w:after="0"/>
+            </w:pPr>
+            <w:r>
+              <w:rPr>
+                <w:sz w:val="18"/>
+              </w:rPr>
+              <w:t>При наступлении просрочки оплаты по договору</w:t>
+            </w:r>
+          </w:p>
+        </w:tc>
+        <w:tc>
+          <w:tcPr>
+            <w:tcW w:type="dxa" w:w="3120"/>
+          </w:tcPr>
+          <w:p>
+            <w:pPr>
+              <w:spacing w:after="0"/>
+            </w:pPr>
+            <w:r>
+              <w:rPr>
+                <w:sz w:val="18"/>
+              </w:rPr>
+              <w:t>Адаптированное уведомление и доказательство отправки</w:t>
+            </w:r>
+          </w:p>
+        </w:tc>
+      </w:tr>
+      <w:tr>
+        <w:trPr>
+          <w:cantSplit/>
+        </w:trPr>
+        <w:tc>
+          <w:tcPr>
+            <w:tcW w:type="dxa" w:w="3120"/>
+          </w:tcPr>
+          <w:p>
+            <w:pPr>
+              <w:spacing w:after="0"/>
+            </w:pPr>
+            <w:r>
+              <w:rPr>
+                <w:sz w:val="18"/>
+              </w:rPr>
+              <w:t>14-raschet-procentov-395-gk.xlsx</w:t>
+            </w:r>
+          </w:p>
+        </w:tc>
+        <w:tc>
+          <w:tcPr>
+            <w:tcW w:type="dxa" w:w="3120"/>
+          </w:tcPr>
+          <w:p>
+            <w:pPr>
+              <w:spacing w:after="0"/>
+            </w:pPr>
+            <w:r>
+              <w:rPr>
+                <w:sz w:val="18"/>
+              </w:rPr>
+              <w:t>Для расчёта процентов по ст. 395 ГК РФ по периодам</w:t>
+            </w:r>
+          </w:p>
+        </w:tc>
+        <w:tc>
+          <w:tcPr>
+            <w:tcW w:type="dxa" w:w="3120"/>
+          </w:tcPr>
+          <w:p>
+            <w:pPr>
+              <w:spacing w:after="0"/>
+            </w:pPr>
+            <w:r>
+              <w:rPr>
+                <w:sz w:val="18"/>
+              </w:rPr>
+              <w:t>Проверенный расчёт с исходными данными</w:t>
+            </w:r>
+          </w:p>
+        </w:tc>
+      </w:tr>
+      <w:tr>
+        <w:trPr>
+          <w:cantSplit/>
+        </w:trPr>
+        <w:tc>
+          <w:tcPr>
+            <w:tcW w:type="dxa" w:w="3120"/>
+          </w:tcPr>
+          <w:p>
+            <w:pPr>
+              <w:spacing w:after="0"/>
+            </w:pPr>
+            <w:r>
+              <w:rPr>
+                <w:sz w:val="18"/>
+              </w:rPr>
+              <w:t>15-algoritm-pri-zaderzhke-oplaty.docx</w:t>
+            </w:r>
+          </w:p>
+        </w:tc>
+        <w:tc>
+          <w:tcPr>
+            <w:tcW w:type="dxa" w:w="3120"/>
+          </w:tcPr>
+          <w:p>
+            <w:pPr>
+              <w:spacing w:after="0"/>
+            </w:pPr>
+            <w:r>
+              <w:rPr>
+                <w:sz w:val="18"/>
+              </w:rPr>
+              <w:t>Для выбора следующего шага при задержке оплаты</w:t>
+            </w:r>
+          </w:p>
+        </w:tc>
+        <w:tc>
+          <w:tcPr>
+            <w:tcW w:type="dxa" w:w="3120"/>
+          </w:tcPr>
+          <w:p>
+            <w:pPr>
+              <w:spacing w:after="0"/>
+            </w:pPr>
+            <w:r>
+              <w:rPr>
+                <w:sz w:val="18"/>
+              </w:rPr>
+              <w:t>План действий и контроль сроков</w:t>
+            </w:r>
+          </w:p>
+        </w:tc>
+      </w:tr>
+      <w:tr>
+        <w:trPr>
+          <w:cantSplit/>
+        </w:trPr>
+        <w:tc>
+          <w:tcPr>
+            <w:tcW w:type="dxa" w:w="3120"/>
+          </w:tcPr>
+          <w:p>
+            <w:pPr>
+              <w:spacing w:after="0"/>
+            </w:pPr>
+            <w:r>
+              <w:rPr>
+                <w:sz w:val="18"/>
+              </w:rPr>
+              <w:t>16-iskovoe-zayavlenie-o-vzyskanii.docx</w:t>
+            </w:r>
+          </w:p>
+        </w:tc>
+        <w:tc>
+          <w:tcPr>
+            <w:tcW w:type="dxa" w:w="3120"/>
+          </w:tcPr>
+          <w:p>
+            <w:pPr>
+              <w:spacing w:after="0"/>
+            </w:pPr>
+            <w:r>
+              <w:rPr>
+                <w:sz w:val="18"/>
+              </w:rPr>
+              <w:t>Перед подготовкой обращения в арбитражный суд</w:t>
+            </w:r>
+          </w:p>
+        </w:tc>
+        <w:tc>
+          <w:tcPr>
+            <w:tcW w:type="dxa" w:w="3120"/>
+          </w:tcPr>
+          <w:p>
+            <w:pPr>
+              <w:spacing w:after="0"/>
+            </w:pPr>
+            <w:r>
+              <w:rPr>
+                <w:sz w:val="18"/>
+              </w:rPr>
+              <w:t>Адаптированный проект иска и список приложений</w:t>
             </w:r>
           </w:p>
         </w:tc>
@@ -491,6 +1041,14 @@
     </w:p>
     <w:p>
       <w:pPr>
+        <w:pStyle w:val="ListBullet"/>
+      </w:pPr>
+      <w:r>
+        <w:t>Сверьте правовые нормы на дату использования: исходная проверка расширения проведена 16.08.2026; ставки, сроки и реквизиты уточняйте по делу.</w:t>
+      </w:r>
+    </w:p>
+    <w:p>
+      <w:pPr>
         <w:pStyle w:val="Heading1"/>
       </w:pPr>
       <w:r>
@@ -540,7 +1098,7 @@
         <w:color w:val="787878"/>
         <w:sz w:val="16"/>
       </w:rPr>
-      <w:t>Инструкция — Закрытие работ  •  версия 21.07.2026  •  marzhavbetone.ru</w:t>
+      <w:t>Инструкция — Закрытие работ  •  редакция 08.10.2026  •  marzhavbetone.ru</w:t>
     </w:r>
   </w:p>
 </w:ftr>
@@ -997,7 +1555,7 @@
       <w:rFonts w:asciiTheme="majorHAnsi" w:eastAsiaTheme="majorEastAsia" w:hAnsiTheme="majorHAnsi" w:cstheme="majorBidi" w:ascii="Arial" w:hAnsi="Arial"/>
       <w:b/>
       <w:bCs/>
-      <w:color w:val="2E74B5"/>
+      <w:color w:val="34383B"/>
       <w:sz w:val="32"/>
       <w:szCs w:val="28"/>
     </w:rPr>
@@ -1021,7 +1579,7 @@
       <w:rFonts w:asciiTheme="majorHAnsi" w:eastAsiaTheme="majorEastAsia" w:hAnsiTheme="majorHAnsi" w:cstheme="majorBidi" w:ascii="Arial" w:hAnsi="Arial"/>
       <w:b/>
       <w:bCs/>
-      <w:color w:val="2E74B5"/>
+      <w:color w:val="34383B"/>
       <w:sz w:val="26"/>
       <w:szCs w:val="26"/>
     </w:rPr>
@@ -1277,7 +1835,7 @@
     <w:rsid w:val="00FC693F"/>
     <w:pPr>
       <w:pBdr>
-        <w:bottom w:val="single" w:sz="8" w:space="4" w:color="4F81BD" w:themeColor="accent1"/>
+        <w:bottom w:val="single" w:sz="8" w:space="4" w:color="B49A65"/>
       </w:pBdr>
       <w:spacing w:after="240" w:line="240" w:lineRule="auto" w:before="0"/>
       <w:contextualSpacing/>

</xml_diff>

<commit_message>
fix(p1): map instruction to real fields and synchronize navigation PDF
</commit_message>
<xml_diff>
--- a/products-storage/01-zakrytie-rabot/00-INSTRUKCIYA.docx
+++ b/products-storage/01-zakrytie-rabot/00-INSTRUKCIYA.docx
@@ -1044,7 +1044,7 @@
         <w:pStyle w:val="ListBullet"/>
       </w:pPr>
       <w:r>
-        <w:t>Сверьте правовые нормы на дату использования: исходная проверка расширения проведена 16.08.2026; ставки, сроки и реквизиты уточняйте по делу.</w:t>
+        <w:t>Сверьте правовые нормы и реквизиты на дату использования; ставки, сроки и порядок берите из источников, указанных в соответствующем файле.</w:t>
       </w:r>
     </w:p>
     <w:p>
@@ -1070,7 +1070,7 @@
     </w:p>
     <w:p>
       <w:r>
-        <w:t>Пакет внедрён, когда по каждому объёму видны: основание, факт выполнения, комплект доказательств, дата передачи, статус замечаний, сумма и контрольная дата оплаты.</w:t>
+        <w:t>Пакет внедрён, когда по каждому объёму зафиксированы основание, факт выполнения и доказательства в журнале 06, суммы согласованы в формах 01–03, состав и передача отмечены в 05 и 08, замечания отражены в 07. Срок оплаты берите из договора и проверяйте по словарю 11. Частичные оплаты сверяйте с банковскими выписками перед расчётом в 14.</w:t>
       </w:r>
     </w:p>
     <w:sectPr>

</xml_diff>

<commit_message>
Save accepted R3 publication masters, 13 product positions and owner approval
</commit_message>
<xml_diff>
--- a/products-storage/01-zakrytie-rabot/00-INSTRUKCIYA.docx
+++ b/products-storage/01-zakrytie-rabot/00-INSTRUKCIYA.docx
@@ -8,14 +8,21 @@
       </w:pPr>
       <w:r>
         <w:rPr>
-          <w:b/>
+          <w:rFonts w:ascii="Arial" w:hAnsi="Arial"/>
+          <w:color w:val="AE8031"/>
         </w:rPr>
-        <w:t>Как внедрить пакет «Закрытие работ»</w:t>
+        <w:t>Система получения оплаты за выполненные работы</w:t>
       </w:r>
     </w:p>
     <w:p>
+      <w:pPr>
+        <w:spacing w:after="60"/>
+      </w:pPr>
       <w:r>
-        <w:t>Провести выполненный объём через проверку, приёмку и запуск оплаты.</w:t>
+        <w:rPr>
+          <w:rFonts w:ascii="Arial" w:hAnsi="Arial"/>
+        </w:rPr>
+        <w:t>Подтвердить выполненный объём, оформить сдачу результата работ и предъявить обоснованное требование об оплате.</w:t>
       </w:r>
     </w:p>
     <w:p>
@@ -23,47 +30,70 @@
         <w:pStyle w:val="Heading1"/>
       </w:pPr>
       <w:r>
-        <w:t>Быстрый запуск за 60 минут</w:t>
+        <w:rPr>
+          <w:rFonts w:ascii="Arial" w:hAnsi="Arial"/>
+        </w:rPr>
+        <w:t>Организация документального сопровождения</w:t>
       </w:r>
     </w:p>
     <w:p>
       <w:pPr>
         <w:pStyle w:val="ListNumber"/>
+        <w:spacing w:after="60"/>
       </w:pPr>
       <w:r>
-        <w:t>Скопируйте папку и назовите её по объекту и договору.</w:t>
+        <w:rPr>
+          <w:rFonts w:ascii="Arial" w:hAnsi="Arial"/>
+        </w:rPr>
+        <w:t>Систематизируйте документы по объектам, договорам и отчётным периодам. Для каждого комплекта укажите номер договора и наименование объекта.</w:t>
       </w:r>
     </w:p>
     <w:p>
       <w:pPr>
         <w:pStyle w:val="ListNumber"/>
+        <w:spacing w:after="60"/>
       </w:pPr>
       <w:r>
-        <w:t>Назначьте владельца каждого реестра и резервного исполнителя.</w:t>
+        <w:rPr>
+          <w:rFonts w:ascii="Arial" w:hAnsi="Arial"/>
+        </w:rPr>
+        <w:t>Назначьте ответственных за учёт объёмов, передачу документов, устранение замечаний и контроль оплаты.</w:t>
       </w:r>
     </w:p>
     <w:p>
       <w:pPr>
         <w:pStyle w:val="ListNumber"/>
+        <w:spacing w:after="60"/>
       </w:pPr>
       <w:r>
-        <w:t>Заполните постоянные данные: стороны, договор, объект, каналы уведомлений.</w:t>
+        <w:rPr>
+          <w:rFonts w:ascii="Arial" w:hAnsi="Arial"/>
+        </w:rPr>
+        <w:t>Внесите реквизиты сторон, договора и объекта. Проверьте согласованные адреса и способы направления юридически значимых сообщений.</w:t>
       </w:r>
     </w:p>
     <w:p>
       <w:pPr>
         <w:pStyle w:val="ListNumber"/>
+        <w:spacing w:after="60"/>
       </w:pPr>
       <w:r>
-        <w:t>Выберите один текущий объём и проведите его по документам пакета.</w:t>
+        <w:rPr>
+          <w:rFonts w:ascii="Arial" w:hAnsi="Arial"/>
+        </w:rPr>
+        <w:t>Определите предъявляемый к сдаче объём. Сопоставьте журнал работ, смету, акты, исполнительную документацию и документы о передаче.</w:t>
       </w:r>
     </w:p>
     <w:p>
       <w:pPr>
         <w:pStyle w:val="ListNumber"/>
+        <w:spacing w:after="60"/>
       </w:pPr>
       <w:r>
-        <w:t>Поставьте контрольные даты в календарь и проводите короткую проверку дважды в неделю.</w:t>
+        <w:rPr>
+          <w:rFonts w:ascii="Arial" w:hAnsi="Arial"/>
+        </w:rPr>
+        <w:t>Зафиксируйте договорные сроки приёмки, устранения замечаний и оплаты. Назначьте даты внутреннего контроля до истечения соответствующих сроков.</w:t>
       </w:r>
     </w:p>
     <w:p>
@@ -71,6 +101,9 @@
         <w:pStyle w:val="Heading1"/>
       </w:pPr>
       <w:r>
+        <w:rPr>
+          <w:rFonts w:ascii="Arial" w:hAnsi="Arial"/>
+        </w:rPr>
         <w:t>Состав и назначение</w:t>
       </w:r>
     </w:p>
@@ -78,12 +111,13 @@
       <w:tblPr>
         <w:tblW w:type="auto" w:w="0"/>
         <w:jc w:val="center"/>
+        <w:tblLayout w:type="fixed"/>
         <w:tblLook w:firstColumn="1" w:firstRow="1" w:lastColumn="0" w:lastRow="0" w:noHBand="0" w:noVBand="1" w:val="04A0"/>
       </w:tblPr>
       <w:tblGrid>
-        <w:gridCol w:w="3120"/>
-        <w:gridCol w:w="3120"/>
-        <w:gridCol w:w="3120"/>
+        <w:gridCol w:w="3009"/>
+        <w:gridCol w:w="3009"/>
+        <w:gridCol w:w="3009"/>
       </w:tblGrid>
       <w:tr>
         <w:trPr>
@@ -92,7 +126,7 @@
         </w:trPr>
         <w:tc>
           <w:tcPr>
-            <w:tcW w:type="dxa" w:w="3120"/>
+            <w:tcW w:type="dxa" w:w="3009"/>
             <w:shd w:fill="E9E5DC"/>
           </w:tcPr>
           <w:p>
@@ -101,6 +135,7 @@
             </w:pPr>
             <w:r>
               <w:rPr>
+                <w:rFonts w:ascii="Arial" w:hAnsi="Arial"/>
                 <w:sz w:val="18"/>
               </w:rPr>
               <w:t>Файл</w:t>
@@ -109,7 +144,7 @@
         </w:tc>
         <w:tc>
           <w:tcPr>
-            <w:tcW w:type="dxa" w:w="3120"/>
+            <w:tcW w:type="dxa" w:w="3009"/>
             <w:shd w:fill="E9E5DC"/>
           </w:tcPr>
           <w:p>
@@ -118,6 +153,7 @@
             </w:pPr>
             <w:r>
               <w:rPr>
+                <w:rFonts w:ascii="Arial" w:hAnsi="Arial"/>
                 <w:sz w:val="18"/>
               </w:rPr>
               <w:t>Когда использовать</w:t>
@@ -126,7 +162,7 @@
         </w:tc>
         <w:tc>
           <w:tcPr>
-            <w:tcW w:type="dxa" w:w="3120"/>
+            <w:tcW w:type="dxa" w:w="3009"/>
             <w:shd w:fill="E9E5DC"/>
           </w:tcPr>
           <w:p>
@@ -135,6 +171,7 @@
             </w:pPr>
             <w:r>
               <w:rPr>
+                <w:rFonts w:ascii="Arial" w:hAnsi="Arial"/>
                 <w:sz w:val="18"/>
               </w:rPr>
               <w:t>Результат</w:t>
@@ -148,7 +185,7 @@
         </w:trPr>
         <w:tc>
           <w:tcPr>
-            <w:tcW w:type="dxa" w:w="3120"/>
+            <w:tcW w:type="dxa" w:w="3009"/>
           </w:tcPr>
           <w:p>
             <w:pPr>
@@ -156,15 +193,16 @@
             </w:pPr>
             <w:r>
               <w:rPr>
+                <w:rFonts w:ascii="Arial" w:hAnsi="Arial"/>
                 <w:sz w:val="18"/>
               </w:rPr>
-              <w:t>01-ks-2.docx</w:t>
+              <w:t>01-ks-2.xls</w:t>
             </w:r>
           </w:p>
         </w:tc>
         <w:tc>
           <w:tcPr>
-            <w:tcW w:type="dxa" w:w="3120"/>
+            <w:tcW w:type="dxa" w:w="3009"/>
           </w:tcPr>
           <w:p>
             <w:pPr>
@@ -172,6 +210,7 @@
             </w:pPr>
             <w:r>
               <w:rPr>
+                <w:rFonts w:ascii="Arial" w:hAnsi="Arial"/>
                 <w:sz w:val="18"/>
               </w:rPr>
               <w:t>При оформлении объёмов работ</w:t>
@@ -180,7 +219,7 @@
         </w:tc>
         <w:tc>
           <w:tcPr>
-            <w:tcW w:type="dxa" w:w="3120"/>
+            <w:tcW w:type="dxa" w:w="3009"/>
           </w:tcPr>
           <w:p>
             <w:pPr>
@@ -188,6 +227,7 @@
             </w:pPr>
             <w:r>
               <w:rPr>
+                <w:rFonts w:ascii="Arial" w:hAnsi="Arial"/>
                 <w:sz w:val="18"/>
               </w:rPr>
               <w:t>Проект КС-2 с проверенными объёмами</w:t>
@@ -201,7 +241,7 @@
         </w:trPr>
         <w:tc>
           <w:tcPr>
-            <w:tcW w:type="dxa" w:w="3120"/>
+            <w:tcW w:type="dxa" w:w="3009"/>
           </w:tcPr>
           <w:p>
             <w:pPr>
@@ -209,15 +249,16 @@
             </w:pPr>
             <w:r>
               <w:rPr>
+                <w:rFonts w:ascii="Arial" w:hAnsi="Arial"/>
                 <w:sz w:val="18"/>
               </w:rPr>
-              <w:t>02-ks-3.docx</w:t>
+              <w:t>02-ks-3.xls</w:t>
             </w:r>
           </w:p>
         </w:tc>
         <w:tc>
           <w:tcPr>
-            <w:tcW w:type="dxa" w:w="3120"/>
+            <w:tcW w:type="dxa" w:w="3009"/>
           </w:tcPr>
           <w:p>
             <w:pPr>
@@ -225,6 +266,7 @@
             </w:pPr>
             <w:r>
               <w:rPr>
+                <w:rFonts w:ascii="Arial" w:hAnsi="Arial"/>
                 <w:sz w:val="18"/>
               </w:rPr>
               <w:t>При своде стоимости по КС-2</w:t>
@@ -233,7 +275,7 @@
         </w:tc>
         <w:tc>
           <w:tcPr>
-            <w:tcW w:type="dxa" w:w="3120"/>
+            <w:tcW w:type="dxa" w:w="3009"/>
           </w:tcPr>
           <w:p>
             <w:pPr>
@@ -241,6 +283,7 @@
             </w:pPr>
             <w:r>
               <w:rPr>
+                <w:rFonts w:ascii="Arial" w:hAnsi="Arial"/>
                 <w:sz w:val="18"/>
               </w:rPr>
               <w:t>Проект КС-3 с проверенной суммой</w:t>
@@ -254,7 +297,7 @@
         </w:trPr>
         <w:tc>
           <w:tcPr>
-            <w:tcW w:type="dxa" w:w="3120"/>
+            <w:tcW w:type="dxa" w:w="3009"/>
           </w:tcPr>
           <w:p>
             <w:pPr>
@@ -262,6 +305,7 @@
             </w:pPr>
             <w:r>
               <w:rPr>
+                <w:rFonts w:ascii="Arial" w:hAnsi="Arial"/>
                 <w:sz w:val="18"/>
               </w:rPr>
               <w:t>03-akt-vypolnennyh-rabot.docx</w:t>
@@ -270,7 +314,7 @@
         </w:tc>
         <w:tc>
           <w:tcPr>
-            <w:tcW w:type="dxa" w:w="3120"/>
+            <w:tcW w:type="dxa" w:w="3009"/>
           </w:tcPr>
           <w:p>
             <w:pPr>
@@ -278,6 +322,7 @@
             </w:pPr>
             <w:r>
               <w:rPr>
+                <w:rFonts w:ascii="Arial" w:hAnsi="Arial"/>
                 <w:sz w:val="18"/>
               </w:rPr>
               <w:t>Для фиксации выполненных работ</w:t>
@@ -286,7 +331,7 @@
         </w:tc>
         <w:tc>
           <w:tcPr>
-            <w:tcW w:type="dxa" w:w="3120"/>
+            <w:tcW w:type="dxa" w:w="3009"/>
           </w:tcPr>
           <w:p>
             <w:pPr>
@@ -294,6 +339,7 @@
             </w:pPr>
             <w:r>
               <w:rPr>
+                <w:rFonts w:ascii="Arial" w:hAnsi="Arial"/>
                 <w:sz w:val="18"/>
               </w:rPr>
               <w:t>Акт с датой и подписями</w:t>
@@ -307,7 +353,7 @@
         </w:trPr>
         <w:tc>
           <w:tcPr>
-            <w:tcW w:type="dxa" w:w="3120"/>
+            <w:tcW w:type="dxa" w:w="3009"/>
           </w:tcPr>
           <w:p>
             <w:pPr>
@@ -315,6 +361,7 @@
             </w:pPr>
             <w:r>
               <w:rPr>
+                <w:rFonts w:ascii="Arial" w:hAnsi="Arial"/>
                 <w:sz w:val="18"/>
               </w:rPr>
               <w:t>04-akt-priemki.docx</w:t>
@@ -323,7 +370,7 @@
         </w:tc>
         <w:tc>
           <w:tcPr>
-            <w:tcW w:type="dxa" w:w="3120"/>
+            <w:tcW w:type="dxa" w:w="3009"/>
           </w:tcPr>
           <w:p>
             <w:pPr>
@@ -331,6 +378,7 @@
             </w:pPr>
             <w:r>
               <w:rPr>
+                <w:rFonts w:ascii="Arial" w:hAnsi="Arial"/>
                 <w:sz w:val="18"/>
               </w:rPr>
               <w:t>При согласовании результата работ</w:t>
@@ -339,7 +387,7 @@
         </w:tc>
         <w:tc>
           <w:tcPr>
-            <w:tcW w:type="dxa" w:w="3120"/>
+            <w:tcW w:type="dxa" w:w="3009"/>
           </w:tcPr>
           <w:p>
             <w:pPr>
@@ -347,6 +395,7 @@
             </w:pPr>
             <w:r>
               <w:rPr>
+                <w:rFonts w:ascii="Arial" w:hAnsi="Arial"/>
                 <w:sz w:val="18"/>
               </w:rPr>
               <w:t>Акт приёмки с замечаниями или подписями</w:t>
@@ -360,7 +409,7 @@
         </w:trPr>
         <w:tc>
           <w:tcPr>
-            <w:tcW w:type="dxa" w:w="3120"/>
+            <w:tcW w:type="dxa" w:w="3009"/>
           </w:tcPr>
           <w:p>
             <w:pPr>
@@ -368,6 +417,7 @@
             </w:pPr>
             <w:r>
               <w:rPr>
+                <w:rFonts w:ascii="Arial" w:hAnsi="Arial"/>
                 <w:sz w:val="18"/>
               </w:rPr>
               <w:t>05-peredatochnyy-akt.docx</w:t>
@@ -376,7 +426,7 @@
         </w:tc>
         <w:tc>
           <w:tcPr>
-            <w:tcW w:type="dxa" w:w="3120"/>
+            <w:tcW w:type="dxa" w:w="3009"/>
           </w:tcPr>
           <w:p>
             <w:pPr>
@@ -384,6 +434,7 @@
             </w:pPr>
             <w:r>
               <w:rPr>
+                <w:rFonts w:ascii="Arial" w:hAnsi="Arial"/>
                 <w:sz w:val="18"/>
               </w:rPr>
               <w:t>При передаче пакета заказчику</w:t>
@@ -392,7 +443,7 @@
         </w:tc>
         <w:tc>
           <w:tcPr>
-            <w:tcW w:type="dxa" w:w="3120"/>
+            <w:tcW w:type="dxa" w:w="3009"/>
           </w:tcPr>
           <w:p>
             <w:pPr>
@@ -400,6 +451,7 @@
             </w:pPr>
             <w:r>
               <w:rPr>
+                <w:rFonts w:ascii="Arial" w:hAnsi="Arial"/>
                 <w:sz w:val="18"/>
               </w:rPr>
               <w:t>Состав переданного и подтверждение вручения</w:t>
@@ -413,7 +465,7 @@
         </w:trPr>
         <w:tc>
           <w:tcPr>
-            <w:tcW w:type="dxa" w:w="3120"/>
+            <w:tcW w:type="dxa" w:w="3009"/>
           </w:tcPr>
           <w:p>
             <w:pPr>
@@ -421,15 +473,16 @@
             </w:pPr>
             <w:r>
               <w:rPr>
+                <w:rFonts w:ascii="Arial" w:hAnsi="Arial"/>
                 <w:sz w:val="18"/>
               </w:rPr>
-              <w:t>06-zhurnal-obemov.xlsx</w:t>
+              <w:t>06-zhurnal-ucheta-rabot-ks-6a.xls</w:t>
             </w:r>
           </w:p>
         </w:tc>
         <w:tc>
           <w:tcPr>
-            <w:tcW w:type="dxa" w:w="3120"/>
+            <w:tcW w:type="dxa" w:w="3009"/>
           </w:tcPr>
           <w:p>
             <w:pPr>
@@ -437,15 +490,16 @@
             </w:pPr>
             <w:r>
               <w:rPr>
+                <w:rFonts w:ascii="Arial" w:hAnsi="Arial"/>
                 <w:sz w:val="18"/>
               </w:rPr>
-              <w:t>Для фиксации выполненных объёмов</w:t>
+              <w:t>Для учёта выполненных работ</w:t>
             </w:r>
           </w:p>
         </w:tc>
         <w:tc>
           <w:tcPr>
-            <w:tcW w:type="dxa" w:w="3120"/>
+            <w:tcW w:type="dxa" w:w="3009"/>
           </w:tcPr>
           <w:p>
             <w:pPr>
@@ -453,9 +507,10 @@
             </w:pPr>
             <w:r>
               <w:rPr>
+                <w:rFonts w:ascii="Arial" w:hAnsi="Arial"/>
                 <w:sz w:val="18"/>
               </w:rPr>
-              <w:t>Журнал и ссылки на доказательства</w:t>
+              <w:t>Журнал по форме КС-6а</w:t>
             </w:r>
           </w:p>
         </w:tc>
@@ -466,7 +521,7 @@
         </w:trPr>
         <w:tc>
           <w:tcPr>
-            <w:tcW w:type="dxa" w:w="3120"/>
+            <w:tcW w:type="dxa" w:w="3009"/>
           </w:tcPr>
           <w:p>
             <w:pPr>
@@ -474,6 +529,63 @@
             </w:pPr>
             <w:r>
               <w:rPr>
+                <w:rFonts w:ascii="Arial" w:hAnsi="Arial"/>
+                <w:sz w:val="18"/>
+              </w:rPr>
+              <w:t>06A-rabochiy-reestr-obemov.xlsx</w:t>
+            </w:r>
+          </w:p>
+        </w:tc>
+        <w:tc>
+          <w:tcPr>
+            <w:tcW w:type="dxa" w:w="3009"/>
+          </w:tcPr>
+          <w:p>
+            <w:pPr>
+              <w:spacing w:after="0"/>
+            </w:pPr>
+            <w:r>
+              <w:rPr>
+                <w:rFonts w:ascii="Arial" w:hAnsi="Arial"/>
+                <w:sz w:val="18"/>
+              </w:rPr>
+              <w:t>Для оперативного учёта объёмов</w:t>
+            </w:r>
+          </w:p>
+        </w:tc>
+        <w:tc>
+          <w:tcPr>
+            <w:tcW w:type="dxa" w:w="3009"/>
+          </w:tcPr>
+          <w:p>
+            <w:pPr>
+              <w:spacing w:after="0"/>
+            </w:pPr>
+            <w:r>
+              <w:rPr>
+                <w:rFonts w:ascii="Arial" w:hAnsi="Arial"/>
+                <w:sz w:val="18"/>
+              </w:rPr>
+              <w:t>Записи и ссылки на подтверждения</w:t>
+            </w:r>
+          </w:p>
+        </w:tc>
+      </w:tr>
+      <w:tr>
+        <w:trPr>
+          <w:cantSplit/>
+        </w:trPr>
+        <w:tc>
+          <w:tcPr>
+            <w:tcW w:type="dxa" w:w="3009"/>
+          </w:tcPr>
+          <w:p>
+            <w:pPr>
+              <w:spacing w:after="0"/>
+            </w:pPr>
+            <w:r>
+              <w:rPr>
+                <w:rFonts w:ascii="Arial" w:hAnsi="Arial"/>
                 <w:sz w:val="18"/>
               </w:rPr>
               <w:t>07-reestr-zamechaniy.xlsx</w:t>
@@ -482,7 +594,7 @@
         </w:tc>
         <w:tc>
           <w:tcPr>
-            <w:tcW w:type="dxa" w:w="3120"/>
+            <w:tcW w:type="dxa" w:w="3009"/>
           </w:tcPr>
           <w:p>
             <w:pPr>
@@ -490,6 +602,7 @@
             </w:pPr>
             <w:r>
               <w:rPr>
+                <w:rFonts w:ascii="Arial" w:hAnsi="Arial"/>
                 <w:sz w:val="18"/>
               </w:rPr>
               <w:t>Для учёта и закрытия замечаний</w:t>
@@ -498,7 +611,7 @@
         </w:tc>
         <w:tc>
           <w:tcPr>
-            <w:tcW w:type="dxa" w:w="3120"/>
+            <w:tcW w:type="dxa" w:w="3009"/>
           </w:tcPr>
           <w:p>
             <w:pPr>
@@ -506,6 +619,7 @@
             </w:pPr>
             <w:r>
               <w:rPr>
+                <w:rFonts w:ascii="Arial" w:hAnsi="Arial"/>
                 <w:sz w:val="18"/>
               </w:rPr>
               <w:t>Статусы, сроки и доказательства закрытия</w:t>
@@ -519,7 +633,7 @@
         </w:trPr>
         <w:tc>
           <w:tcPr>
-            <w:tcW w:type="dxa" w:w="3120"/>
+            <w:tcW w:type="dxa" w:w="3009"/>
           </w:tcPr>
           <w:p>
             <w:pPr>
@@ -527,6 +641,7 @@
             </w:pPr>
             <w:r>
               <w:rPr>
+                <w:rFonts w:ascii="Arial" w:hAnsi="Arial"/>
                 <w:sz w:val="18"/>
               </w:rPr>
               <w:t>08-reestr-peredachi.xlsx</w:t>
@@ -535,7 +650,7 @@
         </w:tc>
         <w:tc>
           <w:tcPr>
-            <w:tcW w:type="dxa" w:w="3120"/>
+            <w:tcW w:type="dxa" w:w="3009"/>
           </w:tcPr>
           <w:p>
             <w:pPr>
@@ -543,6 +658,7 @@
             </w:pPr>
             <w:r>
               <w:rPr>
+                <w:rFonts w:ascii="Arial" w:hAnsi="Arial"/>
                 <w:sz w:val="18"/>
               </w:rPr>
               <w:t>Для фиксации состава и передачи</w:t>
@@ -551,7 +667,7 @@
         </w:tc>
         <w:tc>
           <w:tcPr>
-            <w:tcW w:type="dxa" w:w="3120"/>
+            <w:tcW w:type="dxa" w:w="3009"/>
           </w:tcPr>
           <w:p>
             <w:pPr>
@@ -559,6 +675,7 @@
             </w:pPr>
             <w:r>
               <w:rPr>
+                <w:rFonts w:ascii="Arial" w:hAnsi="Arial"/>
                 <w:sz w:val="18"/>
               </w:rPr>
               <w:t>Дата, канал, получатель и подтверждение</w:t>
@@ -572,7 +689,7 @@
         </w:trPr>
         <w:tc>
           <w:tcPr>
-            <w:tcW w:type="dxa" w:w="3120"/>
+            <w:tcW w:type="dxa" w:w="3009"/>
           </w:tcPr>
           <w:p>
             <w:pPr>
@@ -580,6 +697,7 @@
             </w:pPr>
             <w:r>
               <w:rPr>
+                <w:rFonts w:ascii="Arial" w:hAnsi="Arial"/>
                 <w:sz w:val="18"/>
               </w:rPr>
               <w:t>09-checklist-peredachi.pdf</w:t>
@@ -588,7 +706,7 @@
         </w:tc>
         <w:tc>
           <w:tcPr>
-            <w:tcW w:type="dxa" w:w="3120"/>
+            <w:tcW w:type="dxa" w:w="3009"/>
           </w:tcPr>
           <w:p>
             <w:pPr>
@@ -596,6 +714,7 @@
             </w:pPr>
             <w:r>
               <w:rPr>
+                <w:rFonts w:ascii="Arial" w:hAnsi="Arial"/>
                 <w:sz w:val="18"/>
               </w:rPr>
               <w:t>Перед передачей комплекта</w:t>
@@ -604,7 +723,7 @@
         </w:tc>
         <w:tc>
           <w:tcPr>
-            <w:tcW w:type="dxa" w:w="3120"/>
+            <w:tcW w:type="dxa" w:w="3009"/>
           </w:tcPr>
           <w:p>
             <w:pPr>
@@ -612,9 +731,10 @@
             </w:pPr>
             <w:r>
               <w:rPr>
+                <w:rFonts w:ascii="Arial" w:hAnsi="Arial"/>
                 <w:sz w:val="18"/>
               </w:rPr>
-              <w:t>Отмеченные проверки и пробелы</w:t>
+              <w:t>Результаты проверки состава и оформления документов</w:t>
             </w:r>
           </w:p>
         </w:tc>
@@ -625,7 +745,7 @@
         </w:trPr>
         <w:tc>
           <w:tcPr>
-            <w:tcW w:type="dxa" w:w="3120"/>
+            <w:tcW w:type="dxa" w:w="3009"/>
           </w:tcPr>
           <w:p>
             <w:pPr>
@@ -633,6 +753,7 @@
             </w:pPr>
             <w:r>
               <w:rPr>
+                <w:rFonts w:ascii="Arial" w:hAnsi="Arial"/>
                 <w:sz w:val="18"/>
               </w:rPr>
               <w:t>10-sroki-hraneniya.pdf</w:t>
@@ -641,7 +762,7 @@
         </w:tc>
         <w:tc>
           <w:tcPr>
-            <w:tcW w:type="dxa" w:w="3120"/>
+            <w:tcW w:type="dxa" w:w="3009"/>
           </w:tcPr>
           <w:p>
             <w:pPr>
@@ -649,6 +770,7 @@
             </w:pPr>
             <w:r>
               <w:rPr>
+                <w:rFonts w:ascii="Arial" w:hAnsi="Arial"/>
                 <w:sz w:val="18"/>
               </w:rPr>
               <w:t>Для организации хранения и подтверждений передачи</w:t>
@@ -657,7 +779,7 @@
         </w:tc>
         <w:tc>
           <w:tcPr>
-            <w:tcW w:type="dxa" w:w="3120"/>
+            <w:tcW w:type="dxa" w:w="3009"/>
           </w:tcPr>
           <w:p>
             <w:pPr>
@@ -665,6 +787,7 @@
             </w:pPr>
             <w:r>
               <w:rPr>
+                <w:rFonts w:ascii="Arial" w:hAnsi="Arial"/>
                 <w:sz w:val="18"/>
               </w:rPr>
               <w:t>Определены правила хранения по виду документов</w:t>
@@ -678,7 +801,7 @@
         </w:trPr>
         <w:tc>
           <w:tcPr>
-            <w:tcW w:type="dxa" w:w="3120"/>
+            <w:tcW w:type="dxa" w:w="3009"/>
           </w:tcPr>
           <w:p>
             <w:pPr>
@@ -686,6 +809,7 @@
             </w:pPr>
             <w:r>
               <w:rPr>
+                <w:rFonts w:ascii="Arial" w:hAnsi="Arial"/>
                 <w:sz w:val="18"/>
               </w:rPr>
               <w:t>11-slovar-poley.docx</w:t>
@@ -694,17 +818,20 @@
         </w:tc>
         <w:tc>
           <w:tcPr>
-            <w:tcW w:type="dxa" w:w="3120"/>
+            <w:tcW w:type="dxa" w:w="3009"/>
           </w:tcPr>
           <w:p>
             <w:r>
+              <w:rPr>
+                <w:rFonts w:ascii="Arial" w:hAnsi="Arial"/>
+              </w:rPr>
               <w:t>Для заполнения форм: значения полей и источники данных</w:t>
             </w:r>
           </w:p>
         </w:tc>
         <w:tc>
           <w:tcPr>
-            <w:tcW w:type="dxa" w:w="3120"/>
+            <w:tcW w:type="dxa" w:w="3009"/>
           </w:tcPr>
           <w:p>
             <w:pPr>
@@ -712,6 +839,7 @@
             </w:pPr>
             <w:r>
               <w:rPr>
+                <w:rFonts w:ascii="Arial" w:hAnsi="Arial"/>
                 <w:sz w:val="18"/>
               </w:rPr>
               <w:t>Проверены исходные данные для заполнения</w:t>
@@ -725,7 +853,7 @@
         </w:trPr>
         <w:tc>
           <w:tcPr>
-            <w:tcW w:type="dxa" w:w="3120"/>
+            <w:tcW w:type="dxa" w:w="3009"/>
           </w:tcPr>
           <w:p>
             <w:pPr>
@@ -733,6 +861,7 @@
             </w:pPr>
             <w:r>
               <w:rPr>
+                <w:rFonts w:ascii="Arial" w:hAnsi="Arial"/>
                 <w:sz w:val="18"/>
               </w:rPr>
               <w:t>12-pretenziya-na-neoplatu-po-ks-2.docx</w:t>
@@ -741,7 +870,7 @@
         </w:tc>
         <w:tc>
           <w:tcPr>
-            <w:tcW w:type="dxa" w:w="3120"/>
+            <w:tcW w:type="dxa" w:w="3009"/>
           </w:tcPr>
           <w:p>
             <w:pPr>
@@ -749,6 +878,7 @@
             </w:pPr>
             <w:r>
               <w:rPr>
+                <w:rFonts w:ascii="Arial" w:hAnsi="Arial"/>
                 <w:sz w:val="18"/>
               </w:rPr>
               <w:t>После проверки приёмки, срока оплаты и претензионного порядка</w:t>
@@ -757,7 +887,7 @@
         </w:tc>
         <w:tc>
           <w:tcPr>
-            <w:tcW w:type="dxa" w:w="3120"/>
+            <w:tcW w:type="dxa" w:w="3009"/>
           </w:tcPr>
           <w:p>
             <w:pPr>
@@ -765,6 +895,7 @@
             </w:pPr>
             <w:r>
               <w:rPr>
+                <w:rFonts w:ascii="Arial" w:hAnsi="Arial"/>
                 <w:sz w:val="18"/>
               </w:rPr>
               <w:t>Адаптированная претензия с приложениями</w:t>
@@ -778,7 +909,7 @@
         </w:trPr>
         <w:tc>
           <w:tcPr>
-            <w:tcW w:type="dxa" w:w="3120"/>
+            <w:tcW w:type="dxa" w:w="3009"/>
           </w:tcPr>
           <w:p>
             <w:pPr>
@@ -786,6 +917,7 @@
             </w:pPr>
             <w:r>
               <w:rPr>
+                <w:rFonts w:ascii="Arial" w:hAnsi="Arial"/>
                 <w:sz w:val="18"/>
               </w:rPr>
               <w:t>13-uvedomlenie-o-prosrochke-oplaty.docx</w:t>
@@ -794,7 +926,7 @@
         </w:tc>
         <w:tc>
           <w:tcPr>
-            <w:tcW w:type="dxa" w:w="3120"/>
+            <w:tcW w:type="dxa" w:w="3009"/>
           </w:tcPr>
           <w:p>
             <w:pPr>
@@ -802,6 +934,7 @@
             </w:pPr>
             <w:r>
               <w:rPr>
+                <w:rFonts w:ascii="Arial" w:hAnsi="Arial"/>
                 <w:sz w:val="18"/>
               </w:rPr>
               <w:t>При наступлении просрочки оплаты по договору</w:t>
@@ -810,7 +943,7 @@
         </w:tc>
         <w:tc>
           <w:tcPr>
-            <w:tcW w:type="dxa" w:w="3120"/>
+            <w:tcW w:type="dxa" w:w="3009"/>
           </w:tcPr>
           <w:p>
             <w:pPr>
@@ -818,6 +951,7 @@
             </w:pPr>
             <w:r>
               <w:rPr>
+                <w:rFonts w:ascii="Arial" w:hAnsi="Arial"/>
                 <w:sz w:val="18"/>
               </w:rPr>
               <w:t>Адаптированное уведомление и доказательство отправки</w:t>
@@ -831,7 +965,7 @@
         </w:trPr>
         <w:tc>
           <w:tcPr>
-            <w:tcW w:type="dxa" w:w="3120"/>
+            <w:tcW w:type="dxa" w:w="3009"/>
           </w:tcPr>
           <w:p>
             <w:pPr>
@@ -839,6 +973,7 @@
             </w:pPr>
             <w:r>
               <w:rPr>
+                <w:rFonts w:ascii="Arial" w:hAnsi="Arial"/>
                 <w:sz w:val="18"/>
               </w:rPr>
               <w:t>14-raschet-procentov-395-gk.xlsx</w:t>
@@ -847,7 +982,7 @@
         </w:tc>
         <w:tc>
           <w:tcPr>
-            <w:tcW w:type="dxa" w:w="3120"/>
+            <w:tcW w:type="dxa" w:w="3009"/>
           </w:tcPr>
           <w:p>
             <w:pPr>
@@ -855,6 +990,7 @@
             </w:pPr>
             <w:r>
               <w:rPr>
+                <w:rFonts w:ascii="Arial" w:hAnsi="Arial"/>
                 <w:sz w:val="18"/>
               </w:rPr>
               <w:t>Для расчёта процентов по ст. 395 ГК РФ по периодам</w:t>
@@ -863,7 +999,7 @@
         </w:tc>
         <w:tc>
           <w:tcPr>
-            <w:tcW w:type="dxa" w:w="3120"/>
+            <w:tcW w:type="dxa" w:w="3009"/>
           </w:tcPr>
           <w:p>
             <w:pPr>
@@ -871,6 +1007,7 @@
             </w:pPr>
             <w:r>
               <w:rPr>
+                <w:rFonts w:ascii="Arial" w:hAnsi="Arial"/>
                 <w:sz w:val="18"/>
               </w:rPr>
               <w:t>Проверенный расчёт с исходными данными</w:t>
@@ -884,7 +1021,7 @@
         </w:trPr>
         <w:tc>
           <w:tcPr>
-            <w:tcW w:type="dxa" w:w="3120"/>
+            <w:tcW w:type="dxa" w:w="3009"/>
           </w:tcPr>
           <w:p>
             <w:pPr>
@@ -892,6 +1029,7 @@
             </w:pPr>
             <w:r>
               <w:rPr>
+                <w:rFonts w:ascii="Arial" w:hAnsi="Arial"/>
                 <w:sz w:val="18"/>
               </w:rPr>
               <w:t>15-algoritm-pri-zaderzhke-oplaty.docx</w:t>
@@ -900,7 +1038,7 @@
         </w:tc>
         <w:tc>
           <w:tcPr>
-            <w:tcW w:type="dxa" w:w="3120"/>
+            <w:tcW w:type="dxa" w:w="3009"/>
           </w:tcPr>
           <w:p>
             <w:pPr>
@@ -908,6 +1046,7 @@
             </w:pPr>
             <w:r>
               <w:rPr>
+                <w:rFonts w:ascii="Arial" w:hAnsi="Arial"/>
                 <w:sz w:val="18"/>
               </w:rPr>
               <w:t>Для выбора следующего шага при задержке оплаты</w:t>
@@ -916,7 +1055,7 @@
         </w:tc>
         <w:tc>
           <w:tcPr>
-            <w:tcW w:type="dxa" w:w="3120"/>
+            <w:tcW w:type="dxa" w:w="3009"/>
           </w:tcPr>
           <w:p>
             <w:pPr>
@@ -924,6 +1063,7 @@
             </w:pPr>
             <w:r>
               <w:rPr>
+                <w:rFonts w:ascii="Arial" w:hAnsi="Arial"/>
                 <w:sz w:val="18"/>
               </w:rPr>
               <w:t>План действий и контроль сроков</w:t>
@@ -937,7 +1077,7 @@
         </w:trPr>
         <w:tc>
           <w:tcPr>
-            <w:tcW w:type="dxa" w:w="3120"/>
+            <w:tcW w:type="dxa" w:w="3009"/>
           </w:tcPr>
           <w:p>
             <w:pPr>
@@ -945,6 +1085,7 @@
             </w:pPr>
             <w:r>
               <w:rPr>
+                <w:rFonts w:ascii="Arial" w:hAnsi="Arial"/>
                 <w:sz w:val="18"/>
               </w:rPr>
               <w:t>16-iskovoe-zayavlenie-o-vzyskanii.docx</w:t>
@@ -953,7 +1094,7 @@
         </w:tc>
         <w:tc>
           <w:tcPr>
-            <w:tcW w:type="dxa" w:w="3120"/>
+            <w:tcW w:type="dxa" w:w="3009"/>
           </w:tcPr>
           <w:p>
             <w:pPr>
@@ -961,6 +1102,7 @@
             </w:pPr>
             <w:r>
               <w:rPr>
+                <w:rFonts w:ascii="Arial" w:hAnsi="Arial"/>
                 <w:sz w:val="18"/>
               </w:rPr>
               <w:t>Перед подготовкой обращения в арбитражный суд</w:t>
@@ -969,7 +1111,7 @@
         </w:tc>
         <w:tc>
           <w:tcPr>
-            <w:tcW w:type="dxa" w:w="3120"/>
+            <w:tcW w:type="dxa" w:w="3009"/>
           </w:tcPr>
           <w:p>
             <w:pPr>
@@ -977,6 +1119,7 @@
             </w:pPr>
             <w:r>
               <w:rPr>
+                <w:rFonts w:ascii="Arial" w:hAnsi="Arial"/>
                 <w:sz w:val="18"/>
               </w:rPr>
               <w:t>Адаптированный проект иска и список приложений</w:t>
@@ -990,54 +1133,81 @@
         <w:pStyle w:val="Heading1"/>
       </w:pPr>
       <w:r>
+        <w:rPr>
+          <w:rFonts w:ascii="Arial" w:hAnsi="Arial"/>
+        </w:rPr>
         <w:t>Правила адаптации</w:t>
       </w:r>
     </w:p>
     <w:p>
       <w:pPr>
         <w:pStyle w:val="ListBullet"/>
+        <w:spacing w:after="60"/>
       </w:pPr>
       <w:r>
+        <w:rPr>
+          <w:rFonts w:ascii="Arial" w:hAnsi="Arial"/>
+        </w:rPr>
         <w:t>Заполните поля в квадратных и двойных фигурных скобках, затем удалите обозначения полей и подсказки. Проверьте заполненную форму перед отправкой.</w:t>
       </w:r>
     </w:p>
     <w:p>
       <w:pPr>
         <w:pStyle w:val="ListBullet"/>
+        <w:spacing w:after="60"/>
       </w:pPr>
       <w:r>
+        <w:rPr>
+          <w:rFonts w:ascii="Arial" w:hAnsi="Arial"/>
+        </w:rPr>
         <w:t>Термины и сроки должны совпадать с договором.</w:t>
       </w:r>
     </w:p>
     <w:p>
       <w:pPr>
         <w:pStyle w:val="ListBullet"/>
+        <w:spacing w:after="60"/>
       </w:pPr>
       <w:r>
+        <w:rPr>
+          <w:rFonts w:ascii="Arial" w:hAnsi="Arial"/>
+        </w:rPr>
         <w:t>Не меняйте факты задним числом; выпускайте новую версию.</w:t>
       </w:r>
     </w:p>
     <w:p>
       <w:pPr>
         <w:pStyle w:val="ListBullet"/>
+        <w:spacing w:after="60"/>
       </w:pPr>
       <w:r>
+        <w:rPr>
+          <w:rFonts w:ascii="Arial" w:hAnsi="Arial"/>
+        </w:rPr>
         <w:t>Сохраняйте подтверждение доставки рядом с отправленным файлом.</w:t>
       </w:r>
     </w:p>
     <w:p>
       <w:pPr>
         <w:pStyle w:val="ListBullet"/>
+        <w:spacing w:after="60"/>
       </w:pPr>
       <w:r>
+        <w:rPr>
+          <w:rFonts w:ascii="Arial" w:hAnsi="Arial"/>
+        </w:rPr>
         <w:t>Сопоставьте формулировки с условиями договора и подтверждающими документами объекта.</w:t>
       </w:r>
     </w:p>
     <w:p>
       <w:pPr>
         <w:pStyle w:val="ListBullet"/>
+        <w:spacing w:after="60"/>
       </w:pPr>
       <w:r>
+        <w:rPr>
+          <w:rFonts w:ascii="Arial" w:hAnsi="Arial"/>
+        </w:rPr>
         <w:t>Сверьте правовые нормы и реквизиты на дату использования; ставки, сроки и порядок берите из источников, указанных в соответствующем файле.</w:t>
       </w:r>
     </w:p>
@@ -1046,25 +1216,21 @@
         <w:pStyle w:val="Heading1"/>
       </w:pPr>
       <w:r>
-        <w:t>Структура папки объекта</w:t>
-      </w:r>
-    </w:p>
-    <w:p>
-      <w:r>
-        <w:t>01_Исходные → 02_Рабочие версии → 03_На согласовании → 04_Подписано → 05_Доказательства передачи → 06_Оплата</w:t>
+        <w:rPr>
+          <w:rFonts w:ascii="Arial" w:hAnsi="Arial"/>
+        </w:rPr>
+        <w:t>Контроль результата</w:t>
       </w:r>
     </w:p>
     <w:p>
       <w:pPr>
-        <w:pStyle w:val="Heading1"/>
+        <w:spacing w:after="60"/>
       </w:pPr>
       <w:r>
-        <w:t>Контроль результата</w:t>
-      </w:r>
-    </w:p>
-    <w:p>
-      <w:r>
-        <w:t>Пакет внедрён, когда по каждому объёму зафиксированы основание, факт выполнения и доказательства в журнале 06, суммы согласованы в формах 01–03, состав и передача отмечены в 05 и 08, замечания отражены в 07. Срок оплаты берите из договора и проверяйте по словарю 11. Частичные оплаты сверяйте с банковскими выписками перед расчётом в 14.</w:t>
+        <w:rPr>
+          <w:rFonts w:ascii="Arial" w:hAnsi="Arial"/>
+        </w:rPr>
+        <w:t>По каждому предъявляемому объёму проверьте основание, подтверждающие документы, стоимость, дату передачи и срок оплаты. Форма КС-6а — файл 06; оперативный учёт объёмов и подтверждений — 06A. Реестр 07 содержит замечания, реестр 08 — передачу документов. До расчёта процентов в файле 14 сверьте остаток с банковскими выписками.</w:t>
       </w:r>
     </w:p>
     <w:p>
@@ -1073,6 +1239,7 @@
       </w:pPr>
       <w:r>
         <w:rPr>
+          <w:rFonts w:ascii="Arial" w:hAnsi="Arial"/>
           <w:color w:val="000000"/>
           <w:sz w:val="20"/>
         </w:rPr>
@@ -1080,27 +1247,42 @@
       </w:r>
     </w:p>
     <w:p>
-      <w:pPr/>
+      <w:pPr>
+        <w:spacing w:after="60"/>
+      </w:pPr>
       <w:r>
-        <w:t>Файлы 01 и 02 воспроизводят реквизиты и структуру унифицированных форм № КС-2 (ОКУД 0322005) и № КС-3 (ОКУД 0322001), утвержденных постановлением Госкомстата России от 11.11.1999 № 100. Перед применением сверьте форму с договором и принятой учетной политикой. Унифицированные формы первичных документов в общем случае не являются обязательными с 2013 года; конкретные требования договора и законодательства для вашего случая проверяются отдельно.</w:t>
+        <w:rPr>
+          <w:rFonts w:ascii="Arial" w:hAnsi="Arial"/>
+        </w:rPr>
+        <w:t>Файлы 01-ks-2.xls, 02-ks-3.xls и 06-zhurnal-ucheta-rabot-ks-6a.xls — опубликованные бланки КС-2, КС-3 и КС-6а по постановлению Госкомстата России от 11.11.1999 № 100. Текст, графы и оформление сохранены. Заполните их в Excel по документам объекта; применимость проверьте по договору и учётной политике.</w:t>
       </w:r>
     </w:p>
     <w:p>
-      <w:pPr/>
+      <w:pPr>
+        <w:spacing w:after="60"/>
+      </w:pPr>
       <w:r>
-        <w:t>КС-2 содержит восемь граф, включая отдельные номер позиции сметы и номер единичной расценки. КС-3 содержит шесть граф, включая код, суммы с начала работ и года и за отчетный период. Заполните реквизиты участников, расчетные суммы, ОКПО и подписи. Если поле не относится к вашей ситуации, отразите это в порядке, согласованном сторонами; не удаляйте графы без согласования.</w:t>
+        <w:rPr>
+          <w:rFonts w:ascii="Arial" w:hAnsi="Arial"/>
+        </w:rPr>
+        <w:t>При заполнении сохраните все предусмотренные графы, реквизиты и подписные строки. Дополнительные расчёты и пояснения оформляйте отдельными приложениями. Пустые поля заполняйте в соответствии с согласованным порядком документооборота.</w:t>
       </w:r>
     </w:p>
     <w:p>
-      <w:pPr/>
+      <w:pPr>
+        <w:spacing w:after="60"/>
+      </w:pPr>
       <w:r>
-        <w:t>Операционный журнал 06 служит сверке объема и доказательств; он не является унифицированной формой КС-6а. Файлы 03–05 и 07–16 — рабочие и договорные документы комплекта, а не формы, утвержденные Госкомстатом или Минстроем. Если договор требует другую форму или специальный порядок приемки, применяйте его. Источник КС-2 и КС-3: https://www.consultant.ru/document/cons_doc_LAW_26303/ .</w:t>
+        <w:rPr>
+          <w:rFonts w:ascii="Arial" w:hAnsi="Arial"/>
+        </w:rPr>
+        <w:t>Файл 06A предназначен для оперативного учёта объёмов и подтверждений. Форму КС-6а заполняйте в файле 06 по документам объекта. Источник бланков КС-2, КС-3 и КС-6а: https://www.consultant.ru/document/cons_doc_LAW_26303/ .</w:t>
       </w:r>
     </w:p>
     <w:sectPr>
       <w:headerReference w:type="default" r:id="rId9"/>
       <w:footerReference w:type="default" r:id="rId10"/>
-      <w:pgSz w:w="12240" w:h="15840"/>
+      <w:pgSz w:w="11906" w:h="16838"/>
       <w:pgMar w:top="1440" w:right="1440" w:bottom="1440" w:left="1440" w:header="708" w:footer="708" w:gutter="0"/>
       <w:cols w:space="720"/>
       <w:docGrid w:linePitch="360"/>
@@ -1137,10 +1319,8 @@
     <w:r>
       <w:rPr>
         <w:rFonts w:ascii="Arial" w:hAnsi="Arial"/>
-        <w:color w:val="646464"/>
-        <w:sz w:val="16"/>
-      </w:rPr>
-      <w:t>МАРЖА В БЕТОНЕ  /  ФОРМЫ И ПОРЯДОК</w:t>
+      </w:rPr>
+      <w:t>НА СТОРОНЕ ПОДРЯДЧИКА  /  ФОРМЫ И ПОРЯДОК</w:t>
     </w:r>
   </w:p>
 </w:hdr>
@@ -1514,7 +1694,7 @@
     </w:pPr>
     <w:rPr>
       <w:rFonts w:ascii="Arial" w:hAnsi="Arial"/>
-      <w:sz w:val="22"/>
+      <w:sz w:val="21"/>
     </w:rPr>
   </w:style>
   <w:style w:type="paragraph" w:styleId="Header">
@@ -1531,6 +1711,9 @@
       </w:tabs>
       <w:spacing w:after="0" w:line="240" w:lineRule="auto"/>
     </w:pPr>
+    <w:rPr>
+      <w:rFonts w:ascii="Arial" w:hAnsi="Arial"/>
+    </w:rPr>
   </w:style>
   <w:style w:type="character" w:customStyle="1" w:styleId="HeaderChar">
     <w:name w:val="Header Char"/>
@@ -1538,6 +1721,9 @@
     <w:link w:val="Header"/>
     <w:uiPriority w:val="99"/>
     <w:rsid w:val="00E618BF"/>
+    <w:rPr>
+      <w:rFonts w:ascii="Arial" w:hAnsi="Arial"/>
+    </w:rPr>
   </w:style>
   <w:style w:type="paragraph" w:styleId="Footer">
     <w:name w:val="footer"/>
@@ -1553,6 +1739,9 @@
       </w:tabs>
       <w:spacing w:after="0" w:line="240" w:lineRule="auto"/>
     </w:pPr>
+    <w:rPr>
+      <w:rFonts w:ascii="Arial" w:hAnsi="Arial"/>
+    </w:rPr>
   </w:style>
   <w:style w:type="character" w:customStyle="1" w:styleId="FooterChar">
     <w:name w:val="Footer Char"/>
@@ -1560,6 +1749,9 @@
     <w:link w:val="Footer"/>
     <w:uiPriority w:val="99"/>
     <w:rsid w:val="00E618BF"/>
+    <w:rPr>
+      <w:rFonts w:ascii="Arial" w:hAnsi="Arial"/>
+    </w:rPr>
   </w:style>
   <w:style w:type="paragraph" w:styleId="Heading1">
     <w:name w:val="heading 1"/>
@@ -1624,7 +1816,7 @@
       <w:outlineLvl w:val="2"/>
     </w:pPr>
     <w:rPr>
-      <w:rFonts w:asciiTheme="majorHAnsi" w:eastAsiaTheme="majorEastAsia" w:hAnsiTheme="majorHAnsi" w:cstheme="majorBidi"/>
+      <w:rFonts w:asciiTheme="majorHAnsi" w:eastAsiaTheme="majorEastAsia" w:hAnsiTheme="majorHAnsi" w:cstheme="majorBidi" w:ascii="Arial" w:hAnsi="Arial"/>
       <w:b/>
       <w:bCs/>
       <w:color w:val="4F81BD" w:themeColor="accent1"/>
@@ -1647,7 +1839,7 @@
       <w:outlineLvl w:val="3"/>
     </w:pPr>
     <w:rPr>
-      <w:rFonts w:asciiTheme="majorHAnsi" w:eastAsiaTheme="majorEastAsia" w:hAnsiTheme="majorHAnsi" w:cstheme="majorBidi"/>
+      <w:rFonts w:asciiTheme="majorHAnsi" w:eastAsiaTheme="majorEastAsia" w:hAnsiTheme="majorHAnsi" w:cstheme="majorBidi" w:ascii="Arial" w:hAnsi="Arial"/>
       <w:b/>
       <w:bCs/>
       <w:i/>
@@ -1672,7 +1864,7 @@
       <w:outlineLvl w:val="4"/>
     </w:pPr>
     <w:rPr>
-      <w:rFonts w:asciiTheme="majorHAnsi" w:eastAsiaTheme="majorEastAsia" w:hAnsiTheme="majorHAnsi" w:cstheme="majorBidi"/>
+      <w:rFonts w:asciiTheme="majorHAnsi" w:eastAsiaTheme="majorEastAsia" w:hAnsiTheme="majorHAnsi" w:cstheme="majorBidi" w:ascii="Arial" w:hAnsi="Arial"/>
       <w:color w:val="243F60" w:themeColor="accent1" w:themeShade="7F"/>
     </w:rPr>
   </w:style>
@@ -1693,7 +1885,7 @@
       <w:outlineLvl w:val="5"/>
     </w:pPr>
     <w:rPr>
-      <w:rFonts w:asciiTheme="majorHAnsi" w:eastAsiaTheme="majorEastAsia" w:hAnsiTheme="majorHAnsi" w:cstheme="majorBidi"/>
+      <w:rFonts w:asciiTheme="majorHAnsi" w:eastAsiaTheme="majorEastAsia" w:hAnsiTheme="majorHAnsi" w:cstheme="majorBidi" w:ascii="Arial" w:hAnsi="Arial"/>
       <w:i/>
       <w:iCs/>
       <w:color w:val="243F60" w:themeColor="accent1" w:themeShade="7F"/>
@@ -1716,7 +1908,7 @@
       <w:outlineLvl w:val="6"/>
     </w:pPr>
     <w:rPr>
-      <w:rFonts w:asciiTheme="majorHAnsi" w:eastAsiaTheme="majorEastAsia" w:hAnsiTheme="majorHAnsi" w:cstheme="majorBidi"/>
+      <w:rFonts w:asciiTheme="majorHAnsi" w:eastAsiaTheme="majorEastAsia" w:hAnsiTheme="majorHAnsi" w:cstheme="majorBidi" w:ascii="Arial" w:hAnsi="Arial"/>
       <w:i/>
       <w:iCs/>
       <w:color w:val="404040" w:themeColor="text1" w:themeTint="BF"/>
@@ -1739,7 +1931,7 @@
       <w:outlineLvl w:val="7"/>
     </w:pPr>
     <w:rPr>
-      <w:rFonts w:asciiTheme="majorHAnsi" w:eastAsiaTheme="majorEastAsia" w:hAnsiTheme="majorHAnsi" w:cstheme="majorBidi"/>
+      <w:rFonts w:asciiTheme="majorHAnsi" w:eastAsiaTheme="majorEastAsia" w:hAnsiTheme="majorHAnsi" w:cstheme="majorBidi" w:ascii="Arial" w:hAnsi="Arial"/>
       <w:color w:val="4F81BD" w:themeColor="accent1"/>
       <w:sz w:val="20"/>
       <w:szCs w:val="20"/>
@@ -1762,7 +1954,7 @@
       <w:outlineLvl w:val="8"/>
     </w:pPr>
     <w:rPr>
-      <w:rFonts w:asciiTheme="majorHAnsi" w:eastAsiaTheme="majorEastAsia" w:hAnsiTheme="majorHAnsi" w:cstheme="majorBidi"/>
+      <w:rFonts w:asciiTheme="majorHAnsi" w:eastAsiaTheme="majorEastAsia" w:hAnsiTheme="majorHAnsi" w:cstheme="majorBidi" w:ascii="Arial" w:hAnsi="Arial"/>
       <w:i/>
       <w:iCs/>
       <w:color w:val="404040" w:themeColor="text1" w:themeTint="BF"/>
@@ -1775,12 +1967,18 @@
     <w:uiPriority w:val="1"/>
     <w:semiHidden/>
     <w:unhideWhenUsed/>
+    <w:rPr>
+      <w:rFonts w:ascii="Arial" w:hAnsi="Arial"/>
+    </w:rPr>
   </w:style>
   <w:style w:type="table" w:default="1" w:styleId="TableNormal">
     <w:name w:val="Normal Table"/>
     <w:uiPriority w:val="99"/>
     <w:semiHidden/>
     <w:unhideWhenUsed/>
+    <w:rPr>
+      <w:rFonts w:ascii="Arial" w:hAnsi="Arial"/>
+    </w:rPr>
     <w:tblPr>
       <w:tblInd w:w="0" w:type="dxa"/>
       <w:tblCellMar>
@@ -1805,6 +2003,9 @@
     <w:pPr>
       <w:spacing w:after="0" w:line="240" w:lineRule="auto"/>
     </w:pPr>
+    <w:rPr>
+      <w:rFonts w:ascii="Arial" w:hAnsi="Arial"/>
+    </w:rPr>
   </w:style>
   <w:style w:type="character" w:customStyle="1" w:styleId="Heading1Char">
     <w:name w:val="Heading 1 Char"/>
@@ -1813,7 +2014,7 @@
     <w:uiPriority w:val="9"/>
     <w:rsid w:val="00FC693F"/>
     <w:rPr>
-      <w:rFonts w:asciiTheme="majorHAnsi" w:eastAsiaTheme="majorEastAsia" w:hAnsiTheme="majorHAnsi" w:cstheme="majorBidi"/>
+      <w:rFonts w:asciiTheme="majorHAnsi" w:eastAsiaTheme="majorEastAsia" w:hAnsiTheme="majorHAnsi" w:cstheme="majorBidi" w:ascii="Arial" w:hAnsi="Arial"/>
       <w:b/>
       <w:bCs/>
       <w:color w:val="365F91" w:themeColor="accent1" w:themeShade="BF"/>
@@ -1828,7 +2029,7 @@
     <w:uiPriority w:val="9"/>
     <w:rsid w:val="00FC693F"/>
     <w:rPr>
-      <w:rFonts w:asciiTheme="majorHAnsi" w:eastAsiaTheme="majorEastAsia" w:hAnsiTheme="majorHAnsi" w:cstheme="majorBidi"/>
+      <w:rFonts w:asciiTheme="majorHAnsi" w:eastAsiaTheme="majorEastAsia" w:hAnsiTheme="majorHAnsi" w:cstheme="majorBidi" w:ascii="Arial" w:hAnsi="Arial"/>
       <w:b/>
       <w:bCs/>
       <w:color w:val="4F81BD" w:themeColor="accent1"/>
@@ -1843,7 +2044,7 @@
     <w:uiPriority w:val="9"/>
     <w:rsid w:val="00FC693F"/>
     <w:rPr>
-      <w:rFonts w:asciiTheme="majorHAnsi" w:eastAsiaTheme="majorEastAsia" w:hAnsiTheme="majorHAnsi" w:cstheme="majorBidi"/>
+      <w:rFonts w:asciiTheme="majorHAnsi" w:eastAsiaTheme="majorEastAsia" w:hAnsiTheme="majorHAnsi" w:cstheme="majorBidi" w:ascii="Arial" w:hAnsi="Arial"/>
       <w:b/>
       <w:bCs/>
       <w:color w:val="4F81BD" w:themeColor="accent1"/>
@@ -1880,7 +2081,7 @@
     <w:uiPriority w:val="10"/>
     <w:rsid w:val="00FC693F"/>
     <w:rPr>
-      <w:rFonts w:asciiTheme="majorHAnsi" w:eastAsiaTheme="majorEastAsia" w:hAnsiTheme="majorHAnsi" w:cstheme="majorBidi"/>
+      <w:rFonts w:asciiTheme="majorHAnsi" w:eastAsiaTheme="majorEastAsia" w:hAnsiTheme="majorHAnsi" w:cstheme="majorBidi" w:ascii="Arial" w:hAnsi="Arial"/>
       <w:color w:val="17365D" w:themeColor="text2" w:themeShade="BF"/>
       <w:spacing w:val="5"/>
       <w:kern w:val="28"/>
@@ -1902,7 +2103,7 @@
       </w:numPr>
     </w:pPr>
     <w:rPr>
-      <w:rFonts w:asciiTheme="majorHAnsi" w:eastAsiaTheme="majorEastAsia" w:hAnsiTheme="majorHAnsi" w:cstheme="majorBidi"/>
+      <w:rFonts w:asciiTheme="majorHAnsi" w:eastAsiaTheme="majorEastAsia" w:hAnsiTheme="majorHAnsi" w:cstheme="majorBidi" w:ascii="Arial" w:hAnsi="Arial"/>
       <w:i/>
       <w:iCs/>
       <w:color w:val="4F81BD" w:themeColor="accent1"/>
@@ -1918,7 +2119,7 @@
     <w:uiPriority w:val="11"/>
     <w:rsid w:val="00FC693F"/>
     <w:rPr>
-      <w:rFonts w:asciiTheme="majorHAnsi" w:eastAsiaTheme="majorEastAsia" w:hAnsiTheme="majorHAnsi" w:cstheme="majorBidi"/>
+      <w:rFonts w:asciiTheme="majorHAnsi" w:eastAsiaTheme="majorEastAsia" w:hAnsiTheme="majorHAnsi" w:cstheme="majorBidi" w:ascii="Arial" w:hAnsi="Arial"/>
       <w:i/>
       <w:iCs/>
       <w:color w:val="4F81BD" w:themeColor="accent1"/>
@@ -1937,6 +2138,9 @@
       <w:ind w:left="720"/>
       <w:contextualSpacing/>
     </w:pPr>
+    <w:rPr>
+      <w:rFonts w:ascii="Arial" w:hAnsi="Arial"/>
+    </w:rPr>
   </w:style>
   <w:style w:type="paragraph" w:styleId="BodyText">
     <w:name w:val="Body Text"/>
@@ -1948,6 +2152,9 @@
     <w:pPr>
       <w:spacing w:after="120"/>
     </w:pPr>
+    <w:rPr>
+      <w:rFonts w:ascii="Arial" w:hAnsi="Arial"/>
+    </w:rPr>
   </w:style>
   <w:style w:type="character" w:customStyle="1" w:styleId="BodyTextChar">
     <w:name w:val="Body Text Char"/>
@@ -1955,6 +2162,9 @@
     <w:link w:val="BodyText"/>
     <w:uiPriority w:val="99"/>
     <w:rsid w:val="00AA1D8D"/>
+    <w:rPr>
+      <w:rFonts w:ascii="Arial" w:hAnsi="Arial"/>
+    </w:rPr>
   </w:style>
   <w:style w:type="paragraph" w:styleId="BodyText2">
     <w:name w:val="Body Text 2"/>
@@ -1966,6 +2176,9 @@
     <w:pPr>
       <w:spacing w:after="120" w:line="480" w:lineRule="auto"/>
     </w:pPr>
+    <w:rPr>
+      <w:rFonts w:ascii="Arial" w:hAnsi="Arial"/>
+    </w:rPr>
   </w:style>
   <w:style w:type="character" w:customStyle="1" w:styleId="BodyText2Char">
     <w:name w:val="Body Text 2 Char"/>
@@ -1973,6 +2186,9 @@
     <w:link w:val="BodyText2"/>
     <w:uiPriority w:val="99"/>
     <w:rsid w:val="00AA1D8D"/>
+    <w:rPr>
+      <w:rFonts w:ascii="Arial" w:hAnsi="Arial"/>
+    </w:rPr>
   </w:style>
   <w:style w:type="paragraph" w:styleId="BodyText3">
     <w:name w:val="Body Text 3"/>
@@ -1985,6 +2201,7 @@
       <w:spacing w:after="120"/>
     </w:pPr>
     <w:rPr>
+      <w:rFonts w:ascii="Arial" w:hAnsi="Arial"/>
       <w:sz w:val="16"/>
       <w:szCs w:val="16"/>
     </w:rPr>
@@ -1996,6 +2213,7 @@
     <w:uiPriority w:val="99"/>
     <w:rsid w:val="00AA1D8D"/>
     <w:rPr>
+      <w:rFonts w:ascii="Arial" w:hAnsi="Arial"/>
       <w:sz w:val="16"/>
       <w:szCs w:val="16"/>
     </w:rPr>
@@ -2010,6 +2228,9 @@
       <w:ind w:left="360" w:hanging="360"/>
       <w:contextualSpacing/>
     </w:pPr>
+    <w:rPr>
+      <w:rFonts w:ascii="Arial" w:hAnsi="Arial"/>
+    </w:rPr>
   </w:style>
   <w:style w:type="paragraph" w:styleId="List2">
     <w:name w:val="List 2"/>
@@ -2021,6 +2242,9 @@
       <w:ind w:left="720" w:hanging="360"/>
       <w:contextualSpacing/>
     </w:pPr>
+    <w:rPr>
+      <w:rFonts w:ascii="Arial" w:hAnsi="Arial"/>
+    </w:rPr>
   </w:style>
   <w:style w:type="paragraph" w:styleId="List3">
     <w:name w:val="List 3"/>
@@ -2032,6 +2256,9 @@
       <w:ind w:left="1080" w:hanging="360"/>
       <w:contextualSpacing/>
     </w:pPr>
+    <w:rPr>
+      <w:rFonts w:ascii="Arial" w:hAnsi="Arial"/>
+    </w:rPr>
   </w:style>
   <w:style w:type="paragraph" w:styleId="ListBullet">
     <w:name w:val="List Bullet"/>
@@ -2045,6 +2272,9 @@
       </w:numPr>
       <w:contextualSpacing/>
     </w:pPr>
+    <w:rPr>
+      <w:rFonts w:ascii="Arial" w:hAnsi="Arial"/>
+    </w:rPr>
   </w:style>
   <w:style w:type="paragraph" w:styleId="ListBullet2">
     <w:name w:val="List Bullet 2"/>
@@ -2058,6 +2288,9 @@
       </w:numPr>
       <w:contextualSpacing/>
     </w:pPr>
+    <w:rPr>
+      <w:rFonts w:ascii="Arial" w:hAnsi="Arial"/>
+    </w:rPr>
   </w:style>
   <w:style w:type="paragraph" w:styleId="ListBullet3">
     <w:name w:val="List Bullet 3"/>
@@ -2071,6 +2304,9 @@
       </w:numPr>
       <w:contextualSpacing/>
     </w:pPr>
+    <w:rPr>
+      <w:rFonts w:ascii="Arial" w:hAnsi="Arial"/>
+    </w:rPr>
   </w:style>
   <w:style w:type="paragraph" w:styleId="ListNumber">
     <w:name w:val="List Number"/>
@@ -2084,6 +2320,9 @@
       </w:numPr>
       <w:contextualSpacing/>
     </w:pPr>
+    <w:rPr>
+      <w:rFonts w:ascii="Arial" w:hAnsi="Arial"/>
+    </w:rPr>
   </w:style>
   <w:style w:type="paragraph" w:styleId="ListNumber2">
     <w:name w:val="List Number 2"/>
@@ -2097,6 +2336,9 @@
       </w:numPr>
       <w:contextualSpacing/>
     </w:pPr>
+    <w:rPr>
+      <w:rFonts w:ascii="Arial" w:hAnsi="Arial"/>
+    </w:rPr>
   </w:style>
   <w:style w:type="paragraph" w:styleId="ListNumber3">
     <w:name w:val="List Number 3"/>
@@ -2110,6 +2352,9 @@
       </w:numPr>
       <w:contextualSpacing/>
     </w:pPr>
+    <w:rPr>
+      <w:rFonts w:ascii="Arial" w:hAnsi="Arial"/>
+    </w:rPr>
   </w:style>
   <w:style w:type="paragraph" w:styleId="ListContinue">
     <w:name w:val="List Continue"/>
@@ -2122,6 +2367,9 @@
       <w:ind w:left="360"/>
       <w:contextualSpacing/>
     </w:pPr>
+    <w:rPr>
+      <w:rFonts w:ascii="Arial" w:hAnsi="Arial"/>
+    </w:rPr>
   </w:style>
   <w:style w:type="paragraph" w:styleId="ListContinue2">
     <w:name w:val="List Continue 2"/>
@@ -2134,6 +2382,9 @@
       <w:ind w:left="720"/>
       <w:contextualSpacing/>
     </w:pPr>
+    <w:rPr>
+      <w:rFonts w:ascii="Arial" w:hAnsi="Arial"/>
+    </w:rPr>
   </w:style>
   <w:style w:type="paragraph" w:styleId="ListContinue3">
     <w:name w:val="List Continue 3"/>
@@ -2146,6 +2397,9 @@
       <w:ind w:left="1080"/>
       <w:contextualSpacing/>
     </w:pPr>
+    <w:rPr>
+      <w:rFonts w:ascii="Arial" w:hAnsi="Arial"/>
+    </w:rPr>
   </w:style>
   <w:style w:type="paragraph" w:styleId="MacroText">
     <w:name w:val="macro"/>
@@ -2165,7 +2419,7 @@
       </w:tabs>
     </w:pPr>
     <w:rPr>
-      <w:rFonts w:ascii="Courier" w:hAnsi="Courier"/>
+      <w:rFonts w:ascii="Arial" w:hAnsi="Arial"/>
       <w:sz w:val="20"/>
       <w:szCs w:val="20"/>
     </w:rPr>
@@ -2177,7 +2431,7 @@
     <w:uiPriority w:val="99"/>
     <w:rsid w:val="0029639D"/>
     <w:rPr>
-      <w:rFonts w:ascii="Courier" w:hAnsi="Courier"/>
+      <w:rFonts w:ascii="Arial" w:hAnsi="Arial"/>
       <w:sz w:val="20"/>
       <w:szCs w:val="20"/>
     </w:rPr>
@@ -2191,6 +2445,7 @@
     <w:qFormat/>
     <w:rsid w:val="00FC693F"/>
     <w:rPr>
+      <w:rFonts w:ascii="Arial" w:hAnsi="Arial"/>
       <w:i/>
       <w:iCs/>
       <w:color w:val="000000" w:themeColor="text1"/>
@@ -2203,6 +2458,7 @@
     <w:uiPriority w:val="29"/>
     <w:rsid w:val="00FC693F"/>
     <w:rPr>
+      <w:rFonts w:ascii="Arial" w:hAnsi="Arial"/>
       <w:i/>
       <w:iCs/>
       <w:color w:val="000000" w:themeColor="text1"/>
@@ -2216,7 +2472,7 @@
     <w:semiHidden/>
     <w:rsid w:val="00FC693F"/>
     <w:rPr>
-      <w:rFonts w:asciiTheme="majorHAnsi" w:eastAsiaTheme="majorEastAsia" w:hAnsiTheme="majorHAnsi" w:cstheme="majorBidi"/>
+      <w:rFonts w:asciiTheme="majorHAnsi" w:eastAsiaTheme="majorEastAsia" w:hAnsiTheme="majorHAnsi" w:cstheme="majorBidi" w:ascii="Arial" w:hAnsi="Arial"/>
       <w:b/>
       <w:bCs/>
       <w:i/>
@@ -2232,7 +2488,7 @@
     <w:semiHidden/>
     <w:rsid w:val="00FC693F"/>
     <w:rPr>
-      <w:rFonts w:asciiTheme="majorHAnsi" w:eastAsiaTheme="majorEastAsia" w:hAnsiTheme="majorHAnsi" w:cstheme="majorBidi"/>
+      <w:rFonts w:asciiTheme="majorHAnsi" w:eastAsiaTheme="majorEastAsia" w:hAnsiTheme="majorHAnsi" w:cstheme="majorBidi" w:ascii="Arial" w:hAnsi="Arial"/>
       <w:color w:val="243F60" w:themeColor="accent1" w:themeShade="7F"/>
     </w:rPr>
   </w:style>
@@ -2244,7 +2500,7 @@
     <w:semiHidden/>
     <w:rsid w:val="00FC693F"/>
     <w:rPr>
-      <w:rFonts w:asciiTheme="majorHAnsi" w:eastAsiaTheme="majorEastAsia" w:hAnsiTheme="majorHAnsi" w:cstheme="majorBidi"/>
+      <w:rFonts w:asciiTheme="majorHAnsi" w:eastAsiaTheme="majorEastAsia" w:hAnsiTheme="majorHAnsi" w:cstheme="majorBidi" w:ascii="Arial" w:hAnsi="Arial"/>
       <w:i/>
       <w:iCs/>
       <w:color w:val="243F60" w:themeColor="accent1" w:themeShade="7F"/>
@@ -2258,7 +2514,7 @@
     <w:semiHidden/>
     <w:rsid w:val="00FC693F"/>
     <w:rPr>
-      <w:rFonts w:asciiTheme="majorHAnsi" w:eastAsiaTheme="majorEastAsia" w:hAnsiTheme="majorHAnsi" w:cstheme="majorBidi"/>
+      <w:rFonts w:asciiTheme="majorHAnsi" w:eastAsiaTheme="majorEastAsia" w:hAnsiTheme="majorHAnsi" w:cstheme="majorBidi" w:ascii="Arial" w:hAnsi="Arial"/>
       <w:i/>
       <w:iCs/>
       <w:color w:val="404040" w:themeColor="text1" w:themeTint="BF"/>
@@ -2272,7 +2528,7 @@
     <w:semiHidden/>
     <w:rsid w:val="00FC693F"/>
     <w:rPr>
-      <w:rFonts w:asciiTheme="majorHAnsi" w:eastAsiaTheme="majorEastAsia" w:hAnsiTheme="majorHAnsi" w:cstheme="majorBidi"/>
+      <w:rFonts w:asciiTheme="majorHAnsi" w:eastAsiaTheme="majorEastAsia" w:hAnsiTheme="majorHAnsi" w:cstheme="majorBidi" w:ascii="Arial" w:hAnsi="Arial"/>
       <w:color w:val="4F81BD" w:themeColor="accent1"/>
       <w:sz w:val="20"/>
       <w:szCs w:val="20"/>
@@ -2286,7 +2542,7 @@
     <w:semiHidden/>
     <w:rsid w:val="00FC693F"/>
     <w:rPr>
-      <w:rFonts w:asciiTheme="majorHAnsi" w:eastAsiaTheme="majorEastAsia" w:hAnsiTheme="majorHAnsi" w:cstheme="majorBidi"/>
+      <w:rFonts w:asciiTheme="majorHAnsi" w:eastAsiaTheme="majorEastAsia" w:hAnsiTheme="majorHAnsi" w:cstheme="majorBidi" w:ascii="Arial" w:hAnsi="Arial"/>
       <w:i/>
       <w:iCs/>
       <w:color w:val="404040" w:themeColor="text1" w:themeTint="BF"/>
@@ -2307,6 +2563,7 @@
       <w:spacing w:line="240" w:lineRule="auto"/>
     </w:pPr>
     <w:rPr>
+      <w:rFonts w:ascii="Arial" w:hAnsi="Arial"/>
       <w:b/>
       <w:bCs/>
       <w:color w:val="4F81BD" w:themeColor="accent1"/>
@@ -2321,6 +2578,7 @@
     <w:qFormat/>
     <w:rsid w:val="00FC693F"/>
     <w:rPr>
+      <w:rFonts w:ascii="Arial" w:hAnsi="Arial"/>
       <w:b/>
       <w:bCs/>
     </w:rPr>
@@ -2332,6 +2590,7 @@
     <w:qFormat/>
     <w:rsid w:val="00FC693F"/>
     <w:rPr>
+      <w:rFonts w:ascii="Arial" w:hAnsi="Arial"/>
       <w:i/>
       <w:iCs/>
     </w:rPr>
@@ -2352,6 +2611,7 @@
       <w:ind w:left="936" w:right="936"/>
     </w:pPr>
     <w:rPr>
+      <w:rFonts w:ascii="Arial" w:hAnsi="Arial"/>
       <w:b/>
       <w:bCs/>
       <w:i/>
@@ -2366,6 +2626,7 @@
     <w:uiPriority w:val="30"/>
     <w:rsid w:val="00FC693F"/>
     <w:rPr>
+      <w:rFonts w:ascii="Arial" w:hAnsi="Arial"/>
       <w:b/>
       <w:bCs/>
       <w:i/>
@@ -2380,6 +2641,7 @@
     <w:qFormat/>
     <w:rsid w:val="00FC693F"/>
     <w:rPr>
+      <w:rFonts w:ascii="Arial" w:hAnsi="Arial"/>
       <w:i/>
       <w:iCs/>
       <w:color w:val="808080" w:themeColor="text1" w:themeTint="7F"/>
@@ -2392,6 +2654,7 @@
     <w:qFormat/>
     <w:rsid w:val="00FC693F"/>
     <w:rPr>
+      <w:rFonts w:ascii="Arial" w:hAnsi="Arial"/>
       <w:b/>
       <w:bCs/>
       <w:i/>
@@ -2406,6 +2669,7 @@
     <w:qFormat/>
     <w:rsid w:val="00FC693F"/>
     <w:rPr>
+      <w:rFonts w:ascii="Arial" w:hAnsi="Arial"/>
       <w:smallCaps/>
       <w:color w:val="C0504D" w:themeColor="accent2"/>
       <w:u w:val="single"/>
@@ -2418,6 +2682,7 @@
     <w:qFormat/>
     <w:rsid w:val="00FC693F"/>
     <w:rPr>
+      <w:rFonts w:ascii="Arial" w:hAnsi="Arial"/>
       <w:b/>
       <w:bCs/>
       <w:smallCaps/>
@@ -2433,6 +2698,7 @@
     <w:qFormat/>
     <w:rsid w:val="00FC693F"/>
     <w:rPr>
+      <w:rFonts w:ascii="Arial" w:hAnsi="Arial"/>
       <w:b/>
       <w:bCs/>
       <w:smallCaps/>
@@ -2451,6 +2717,9 @@
     <w:pPr>
       <w:outlineLvl w:val="9"/>
     </w:pPr>
+    <w:rPr>
+      <w:rFonts w:ascii="Arial" w:hAnsi="Arial"/>
+    </w:rPr>
   </w:style>
   <w:style w:type="table" w:styleId="TableGrid">
     <w:name w:val="Table Grid"/>
@@ -2460,6 +2729,9 @@
     <w:pPr>
       <w:spacing w:after="0" w:line="240" w:lineRule="auto"/>
     </w:pPr>
+    <w:rPr>
+      <w:rFonts w:ascii="Arial" w:hAnsi="Arial"/>
+    </w:rPr>
     <w:tblPr>
       <w:tblInd w:w="0" w:type="dxa"/>
       <w:tblBorders>
@@ -2487,6 +2759,7 @@
       <w:spacing w:after="0" w:line="240" w:lineRule="auto"/>
     </w:pPr>
     <w:rPr>
+      <w:rFonts w:ascii="Arial" w:hAnsi="Arial"/>
       <w:color w:val="000000" w:themeColor="text1" w:themeShade="BF"/>
     </w:rPr>
     <w:tblPr>
@@ -2590,6 +2863,7 @@
       <w:spacing w:after="0" w:line="240" w:lineRule="auto"/>
     </w:pPr>
     <w:rPr>
+      <w:rFonts w:ascii="Arial" w:hAnsi="Arial"/>
       <w:color w:val="365F91" w:themeColor="accent1" w:themeShade="BF"/>
     </w:rPr>
     <w:tblPr>
@@ -2693,6 +2967,7 @@
       <w:spacing w:after="0" w:line="240" w:lineRule="auto"/>
     </w:pPr>
     <w:rPr>
+      <w:rFonts w:ascii="Arial" w:hAnsi="Arial"/>
       <w:color w:val="943634" w:themeColor="accent2" w:themeShade="BF"/>
     </w:rPr>
     <w:tblPr>
@@ -2796,6 +3071,7 @@
       <w:spacing w:after="0" w:line="240" w:lineRule="auto"/>
     </w:pPr>
     <w:rPr>
+      <w:rFonts w:ascii="Arial" w:hAnsi="Arial"/>
       <w:color w:val="76923C" w:themeColor="accent3" w:themeShade="BF"/>
     </w:rPr>
     <w:tblPr>
@@ -2899,6 +3175,7 @@
       <w:spacing w:after="0" w:line="240" w:lineRule="auto"/>
     </w:pPr>
     <w:rPr>
+      <w:rFonts w:ascii="Arial" w:hAnsi="Arial"/>
       <w:color w:val="5F497A" w:themeColor="accent4" w:themeShade="BF"/>
     </w:rPr>
     <w:tblPr>
@@ -3002,6 +3279,7 @@
       <w:spacing w:after="0" w:line="240" w:lineRule="auto"/>
     </w:pPr>
     <w:rPr>
+      <w:rFonts w:ascii="Arial" w:hAnsi="Arial"/>
       <w:color w:val="31849B" w:themeColor="accent5" w:themeShade="BF"/>
     </w:rPr>
     <w:tblPr>
@@ -3105,6 +3383,7 @@
       <w:spacing w:after="0" w:line="240" w:lineRule="auto"/>
     </w:pPr>
     <w:rPr>
+      <w:rFonts w:ascii="Arial" w:hAnsi="Arial"/>
       <w:color w:val="E36C0A" w:themeColor="accent6" w:themeShade="BF"/>
     </w:rPr>
     <w:tblPr>
@@ -3207,6 +3486,9 @@
     <w:pPr>
       <w:spacing w:after="0" w:line="240" w:lineRule="auto"/>
     </w:pPr>
+    <w:rPr>
+      <w:rFonts w:ascii="Arial" w:hAnsi="Arial"/>
+    </w:rPr>
     <w:tblPr>
       <w:tblStyleRowBandSize w:val="1"/>
       <w:tblStyleColBandSize w:val="1"/>
@@ -3299,6 +3581,9 @@
     <w:pPr>
       <w:spacing w:after="0" w:line="240" w:lineRule="auto"/>
     </w:pPr>
+    <w:rPr>
+      <w:rFonts w:ascii="Arial" w:hAnsi="Arial"/>
+    </w:rPr>
     <w:tblPr>
       <w:tblStyleRowBandSize w:val="1"/>
       <w:tblStyleColBandSize w:val="1"/>
@@ -3391,6 +3676,9 @@
     <w:pPr>
       <w:spacing w:after="0" w:line="240" w:lineRule="auto"/>
     </w:pPr>
+    <w:rPr>
+      <w:rFonts w:ascii="Arial" w:hAnsi="Arial"/>
+    </w:rPr>
     <w:tblPr>
       <w:tblStyleRowBandSize w:val="1"/>
       <w:tblStyleColBandSize w:val="1"/>
@@ -3483,6 +3771,9 @@
     <w:pPr>
       <w:spacing w:after="0" w:line="240" w:lineRule="auto"/>
     </w:pPr>
+    <w:rPr>
+      <w:rFonts w:ascii="Arial" w:hAnsi="Arial"/>
+    </w:rPr>
     <w:tblPr>
       <w:tblStyleRowBandSize w:val="1"/>
       <w:tblStyleColBandSize w:val="1"/>
@@ -3575,6 +3866,9 @@
     <w:pPr>
       <w:spacing w:after="0" w:line="240" w:lineRule="auto"/>
     </w:pPr>
+    <w:rPr>
+      <w:rFonts w:ascii="Arial" w:hAnsi="Arial"/>
+    </w:rPr>
     <w:tblPr>
       <w:tblStyleRowBandSize w:val="1"/>
       <w:tblStyleColBandSize w:val="1"/>
@@ -3667,6 +3961,9 @@
     <w:pPr>
       <w:spacing w:after="0" w:line="240" w:lineRule="auto"/>
     </w:pPr>
+    <w:rPr>
+      <w:rFonts w:ascii="Arial" w:hAnsi="Arial"/>
+    </w:rPr>
     <w:tblPr>
       <w:tblStyleRowBandSize w:val="1"/>
       <w:tblStyleColBandSize w:val="1"/>
@@ -3759,6 +4056,9 @@
     <w:pPr>
       <w:spacing w:after="0" w:line="240" w:lineRule="auto"/>
     </w:pPr>
+    <w:rPr>
+      <w:rFonts w:ascii="Arial" w:hAnsi="Arial"/>
+    </w:rPr>
     <w:tblPr>
       <w:tblStyleRowBandSize w:val="1"/>
       <w:tblStyleColBandSize w:val="1"/>
@@ -3851,6 +4151,9 @@
     <w:pPr>
       <w:spacing w:after="0" w:line="240" w:lineRule="auto"/>
     </w:pPr>
+    <w:rPr>
+      <w:rFonts w:ascii="Arial" w:hAnsi="Arial"/>
+    </w:rPr>
     <w:tblPr>
       <w:tblStyleRowBandSize w:val="1"/>
       <w:tblStyleColBandSize w:val="1"/>
@@ -3981,6 +4284,9 @@
     <w:pPr>
       <w:spacing w:after="0" w:line="240" w:lineRule="auto"/>
     </w:pPr>
+    <w:rPr>
+      <w:rFonts w:ascii="Arial" w:hAnsi="Arial"/>
+    </w:rPr>
     <w:tblPr>
       <w:tblStyleRowBandSize w:val="1"/>
       <w:tblStyleColBandSize w:val="1"/>
@@ -4111,6 +4417,9 @@
     <w:pPr>
       <w:spacing w:after="0" w:line="240" w:lineRule="auto"/>
     </w:pPr>
+    <w:rPr>
+      <w:rFonts w:ascii="Arial" w:hAnsi="Arial"/>
+    </w:rPr>
     <w:tblPr>
       <w:tblStyleRowBandSize w:val="1"/>
       <w:tblStyleColBandSize w:val="1"/>
@@ -4241,6 +4550,9 @@
     <w:pPr>
       <w:spacing w:after="0" w:line="240" w:lineRule="auto"/>
     </w:pPr>
+    <w:rPr>
+      <w:rFonts w:ascii="Arial" w:hAnsi="Arial"/>
+    </w:rPr>
     <w:tblPr>
       <w:tblStyleRowBandSize w:val="1"/>
       <w:tblStyleColBandSize w:val="1"/>
@@ -4371,6 +4683,9 @@
     <w:pPr>
       <w:spacing w:after="0" w:line="240" w:lineRule="auto"/>
     </w:pPr>
+    <w:rPr>
+      <w:rFonts w:ascii="Arial" w:hAnsi="Arial"/>
+    </w:rPr>
     <w:tblPr>
       <w:tblStyleRowBandSize w:val="1"/>
       <w:tblStyleColBandSize w:val="1"/>
@@ -4501,6 +4816,9 @@
     <w:pPr>
       <w:spacing w:after="0" w:line="240" w:lineRule="auto"/>
     </w:pPr>
+    <w:rPr>
+      <w:rFonts w:ascii="Arial" w:hAnsi="Arial"/>
+    </w:rPr>
     <w:tblPr>
       <w:tblStyleRowBandSize w:val="1"/>
       <w:tblStyleColBandSize w:val="1"/>
@@ -4631,6 +4949,9 @@
     <w:pPr>
       <w:spacing w:after="0" w:line="240" w:lineRule="auto"/>
     </w:pPr>
+    <w:rPr>
+      <w:rFonts w:ascii="Arial" w:hAnsi="Arial"/>
+    </w:rPr>
     <w:tblPr>
       <w:tblStyleRowBandSize w:val="1"/>
       <w:tblStyleColBandSize w:val="1"/>
@@ -4761,6 +5082,9 @@
     <w:pPr>
       <w:spacing w:after="0" w:line="240" w:lineRule="auto"/>
     </w:pPr>
+    <w:rPr>
+      <w:rFonts w:ascii="Arial" w:hAnsi="Arial"/>
+    </w:rPr>
     <w:tblPr>
       <w:tblStyleRowBandSize w:val="1"/>
       <w:tblStyleColBandSize w:val="1"/>
@@ -4867,6 +5191,9 @@
     <w:pPr>
       <w:spacing w:after="0" w:line="240" w:lineRule="auto"/>
     </w:pPr>
+    <w:rPr>
+      <w:rFonts w:ascii="Arial" w:hAnsi="Arial"/>
+    </w:rPr>
     <w:tblPr>
       <w:tblStyleRowBandSize w:val="1"/>
       <w:tblStyleColBandSize w:val="1"/>
@@ -4973,6 +5300,9 @@
     <w:pPr>
       <w:spacing w:after="0" w:line="240" w:lineRule="auto"/>
     </w:pPr>
+    <w:rPr>
+      <w:rFonts w:ascii="Arial" w:hAnsi="Arial"/>
+    </w:rPr>
     <w:tblPr>
       <w:tblStyleRowBandSize w:val="1"/>
       <w:tblStyleColBandSize w:val="1"/>
@@ -5079,6 +5409,9 @@
     <w:pPr>
       <w:spacing w:after="0" w:line="240" w:lineRule="auto"/>
     </w:pPr>
+    <w:rPr>
+      <w:rFonts w:ascii="Arial" w:hAnsi="Arial"/>
+    </w:rPr>
     <w:tblPr>
       <w:tblStyleRowBandSize w:val="1"/>
       <w:tblStyleColBandSize w:val="1"/>
@@ -5185,6 +5518,9 @@
     <w:pPr>
       <w:spacing w:after="0" w:line="240" w:lineRule="auto"/>
     </w:pPr>
+    <w:rPr>
+      <w:rFonts w:ascii="Arial" w:hAnsi="Arial"/>
+    </w:rPr>
     <w:tblPr>
       <w:tblStyleRowBandSize w:val="1"/>
       <w:tblStyleColBandSize w:val="1"/>
@@ -5291,6 +5627,9 @@
     <w:pPr>
       <w:spacing w:after="0" w:line="240" w:lineRule="auto"/>
     </w:pPr>
+    <w:rPr>
+      <w:rFonts w:ascii="Arial" w:hAnsi="Arial"/>
+    </w:rPr>
     <w:tblPr>
       <w:tblStyleRowBandSize w:val="1"/>
       <w:tblStyleColBandSize w:val="1"/>
@@ -5397,6 +5736,9 @@
     <w:pPr>
       <w:spacing w:after="0" w:line="240" w:lineRule="auto"/>
     </w:pPr>
+    <w:rPr>
+      <w:rFonts w:ascii="Arial" w:hAnsi="Arial"/>
+    </w:rPr>
     <w:tblPr>
       <w:tblStyleRowBandSize w:val="1"/>
       <w:tblStyleColBandSize w:val="1"/>
@@ -5503,6 +5845,9 @@
     <w:pPr>
       <w:spacing w:after="0" w:line="240" w:lineRule="auto"/>
     </w:pPr>
+    <w:rPr>
+      <w:rFonts w:ascii="Arial" w:hAnsi="Arial"/>
+    </w:rPr>
     <w:tblPr>
       <w:tblStyleRowBandSize w:val="1"/>
       <w:tblStyleColBandSize w:val="1"/>
@@ -5652,6 +5997,9 @@
     <w:pPr>
       <w:spacing w:after="0" w:line="240" w:lineRule="auto"/>
     </w:pPr>
+    <w:rPr>
+      <w:rFonts w:ascii="Arial" w:hAnsi="Arial"/>
+    </w:rPr>
     <w:tblPr>
       <w:tblStyleRowBandSize w:val="1"/>
       <w:tblStyleColBandSize w:val="1"/>
@@ -5801,6 +6149,9 @@
     <w:pPr>
       <w:spacing w:after="0" w:line="240" w:lineRule="auto"/>
     </w:pPr>
+    <w:rPr>
+      <w:rFonts w:ascii="Arial" w:hAnsi="Arial"/>
+    </w:rPr>
     <w:tblPr>
       <w:tblStyleRowBandSize w:val="1"/>
       <w:tblStyleColBandSize w:val="1"/>
@@ -5950,6 +6301,9 @@
     <w:pPr>
       <w:spacing w:after="0" w:line="240" w:lineRule="auto"/>
     </w:pPr>
+    <w:rPr>
+      <w:rFonts w:ascii="Arial" w:hAnsi="Arial"/>
+    </w:rPr>
     <w:tblPr>
       <w:tblStyleRowBandSize w:val="1"/>
       <w:tblStyleColBandSize w:val="1"/>
@@ -6099,6 +6453,9 @@
     <w:pPr>
       <w:spacing w:after="0" w:line="240" w:lineRule="auto"/>
     </w:pPr>
+    <w:rPr>
+      <w:rFonts w:ascii="Arial" w:hAnsi="Arial"/>
+    </w:rPr>
     <w:tblPr>
       <w:tblStyleRowBandSize w:val="1"/>
       <w:tblStyleColBandSize w:val="1"/>
@@ -6248,6 +6605,9 @@
     <w:pPr>
       <w:spacing w:after="0" w:line="240" w:lineRule="auto"/>
     </w:pPr>
+    <w:rPr>
+      <w:rFonts w:ascii="Arial" w:hAnsi="Arial"/>
+    </w:rPr>
     <w:tblPr>
       <w:tblStyleRowBandSize w:val="1"/>
       <w:tblStyleColBandSize w:val="1"/>
@@ -6397,6 +6757,9 @@
     <w:pPr>
       <w:spacing w:after="0" w:line="240" w:lineRule="auto"/>
     </w:pPr>
+    <w:rPr>
+      <w:rFonts w:ascii="Arial" w:hAnsi="Arial"/>
+    </w:rPr>
     <w:tblPr>
       <w:tblStyleRowBandSize w:val="1"/>
       <w:tblStyleColBandSize w:val="1"/>
@@ -6547,6 +6910,7 @@
       <w:spacing w:after="0" w:line="240" w:lineRule="auto"/>
     </w:pPr>
     <w:rPr>
+      <w:rFonts w:ascii="Arial" w:hAnsi="Arial"/>
       <w:color w:val="000000" w:themeColor="text1"/>
     </w:rPr>
     <w:tblPr>
@@ -6631,6 +6995,7 @@
       <w:spacing w:after="0" w:line="240" w:lineRule="auto"/>
     </w:pPr>
     <w:rPr>
+      <w:rFonts w:ascii="Arial" w:hAnsi="Arial"/>
       <w:color w:val="000000" w:themeColor="text1"/>
     </w:rPr>
     <w:tblPr>
@@ -6715,6 +7080,7 @@
       <w:spacing w:after="0" w:line="240" w:lineRule="auto"/>
     </w:pPr>
     <w:rPr>
+      <w:rFonts w:ascii="Arial" w:hAnsi="Arial"/>
       <w:color w:val="000000" w:themeColor="text1"/>
     </w:rPr>
     <w:tblPr>
@@ -6799,6 +7165,7 @@
       <w:spacing w:after="0" w:line="240" w:lineRule="auto"/>
     </w:pPr>
     <w:rPr>
+      <w:rFonts w:ascii="Arial" w:hAnsi="Arial"/>
       <w:color w:val="000000" w:themeColor="text1"/>
     </w:rPr>
     <w:tblPr>
@@ -6883,6 +7250,7 @@
       <w:spacing w:after="0" w:line="240" w:lineRule="auto"/>
     </w:pPr>
     <w:rPr>
+      <w:rFonts w:ascii="Arial" w:hAnsi="Arial"/>
       <w:color w:val="000000" w:themeColor="text1"/>
     </w:rPr>
     <w:tblPr>
@@ -6967,6 +7335,7 @@
       <w:spacing w:after="0" w:line="240" w:lineRule="auto"/>
     </w:pPr>
     <w:rPr>
+      <w:rFonts w:ascii="Arial" w:hAnsi="Arial"/>
       <w:color w:val="000000" w:themeColor="text1"/>
     </w:rPr>
     <w:tblPr>
@@ -7051,6 +7420,7 @@
       <w:spacing w:after="0" w:line="240" w:lineRule="auto"/>
     </w:pPr>
     <w:rPr>
+      <w:rFonts w:ascii="Arial" w:hAnsi="Arial"/>
       <w:color w:val="000000" w:themeColor="text1"/>
     </w:rPr>
     <w:tblPr>
@@ -7135,7 +7505,7 @@
       <w:spacing w:after="0" w:line="240" w:lineRule="auto"/>
     </w:pPr>
     <w:rPr>
-      <w:rFonts w:asciiTheme="majorHAnsi" w:eastAsiaTheme="majorEastAsia" w:hAnsiTheme="majorHAnsi" w:cstheme="majorBidi"/>
+      <w:rFonts w:asciiTheme="majorHAnsi" w:eastAsiaTheme="majorEastAsia" w:hAnsiTheme="majorHAnsi" w:cstheme="majorBidi" w:ascii="Arial" w:hAnsi="Arial"/>
       <w:color w:val="000000" w:themeColor="text1"/>
     </w:rPr>
     <w:tblPr>
@@ -7263,7 +7633,7 @@
       <w:spacing w:after="0" w:line="240" w:lineRule="auto"/>
     </w:pPr>
     <w:rPr>
-      <w:rFonts w:asciiTheme="majorHAnsi" w:eastAsiaTheme="majorEastAsia" w:hAnsiTheme="majorHAnsi" w:cstheme="majorBidi"/>
+      <w:rFonts w:asciiTheme="majorHAnsi" w:eastAsiaTheme="majorEastAsia" w:hAnsiTheme="majorHAnsi" w:cstheme="majorBidi" w:ascii="Arial" w:hAnsi="Arial"/>
       <w:color w:val="000000" w:themeColor="text1"/>
     </w:rPr>
     <w:tblPr>
@@ -7391,7 +7761,7 @@
       <w:spacing w:after="0" w:line="240" w:lineRule="auto"/>
     </w:pPr>
     <w:rPr>
-      <w:rFonts w:asciiTheme="majorHAnsi" w:eastAsiaTheme="majorEastAsia" w:hAnsiTheme="majorHAnsi" w:cstheme="majorBidi"/>
+      <w:rFonts w:asciiTheme="majorHAnsi" w:eastAsiaTheme="majorEastAsia" w:hAnsiTheme="majorHAnsi" w:cstheme="majorBidi" w:ascii="Arial" w:hAnsi="Arial"/>
       <w:color w:val="000000" w:themeColor="text1"/>
     </w:rPr>
     <w:tblPr>
@@ -7519,7 +7889,7 @@
       <w:spacing w:after="0" w:line="240" w:lineRule="auto"/>
     </w:pPr>
     <w:rPr>
-      <w:rFonts w:asciiTheme="majorHAnsi" w:eastAsiaTheme="majorEastAsia" w:hAnsiTheme="majorHAnsi" w:cstheme="majorBidi"/>
+      <w:rFonts w:asciiTheme="majorHAnsi" w:eastAsiaTheme="majorEastAsia" w:hAnsiTheme="majorHAnsi" w:cstheme="majorBidi" w:ascii="Arial" w:hAnsi="Arial"/>
       <w:color w:val="000000" w:themeColor="text1"/>
     </w:rPr>
     <w:tblPr>
@@ -7647,7 +8017,7 @@
       <w:spacing w:after="0" w:line="240" w:lineRule="auto"/>
     </w:pPr>
     <w:rPr>
-      <w:rFonts w:asciiTheme="majorHAnsi" w:eastAsiaTheme="majorEastAsia" w:hAnsiTheme="majorHAnsi" w:cstheme="majorBidi"/>
+      <w:rFonts w:asciiTheme="majorHAnsi" w:eastAsiaTheme="majorEastAsia" w:hAnsiTheme="majorHAnsi" w:cstheme="majorBidi" w:ascii="Arial" w:hAnsi="Arial"/>
       <w:color w:val="000000" w:themeColor="text1"/>
     </w:rPr>
     <w:tblPr>
@@ -7775,7 +8145,7 @@
       <w:spacing w:after="0" w:line="240" w:lineRule="auto"/>
     </w:pPr>
     <w:rPr>
-      <w:rFonts w:asciiTheme="majorHAnsi" w:eastAsiaTheme="majorEastAsia" w:hAnsiTheme="majorHAnsi" w:cstheme="majorBidi"/>
+      <w:rFonts w:asciiTheme="majorHAnsi" w:eastAsiaTheme="majorEastAsia" w:hAnsiTheme="majorHAnsi" w:cstheme="majorBidi" w:ascii="Arial" w:hAnsi="Arial"/>
       <w:color w:val="000000" w:themeColor="text1"/>
     </w:rPr>
     <w:tblPr>
@@ -7903,7 +8273,7 @@
       <w:spacing w:after="0" w:line="240" w:lineRule="auto"/>
     </w:pPr>
     <w:rPr>
-      <w:rFonts w:asciiTheme="majorHAnsi" w:eastAsiaTheme="majorEastAsia" w:hAnsiTheme="majorHAnsi" w:cstheme="majorBidi"/>
+      <w:rFonts w:asciiTheme="majorHAnsi" w:eastAsiaTheme="majorEastAsia" w:hAnsiTheme="majorHAnsi" w:cstheme="majorBidi" w:ascii="Arial" w:hAnsi="Arial"/>
       <w:color w:val="000000" w:themeColor="text1"/>
     </w:rPr>
     <w:tblPr>
@@ -8030,6 +8400,9 @@
     <w:pPr>
       <w:spacing w:after="0" w:line="240" w:lineRule="auto"/>
     </w:pPr>
+    <w:rPr>
+      <w:rFonts w:ascii="Arial" w:hAnsi="Arial"/>
+    </w:rPr>
     <w:tblPr>
       <w:tblStyleRowBandSize w:val="1"/>
       <w:tblStyleColBandSize w:val="1"/>
@@ -8103,6 +8476,9 @@
     <w:pPr>
       <w:spacing w:after="0" w:line="240" w:lineRule="auto"/>
     </w:pPr>
+    <w:rPr>
+      <w:rFonts w:ascii="Arial" w:hAnsi="Arial"/>
+    </w:rPr>
     <w:tblPr>
       <w:tblStyleRowBandSize w:val="1"/>
       <w:tblStyleColBandSize w:val="1"/>
@@ -8176,6 +8552,9 @@
     <w:pPr>
       <w:spacing w:after="0" w:line="240" w:lineRule="auto"/>
     </w:pPr>
+    <w:rPr>
+      <w:rFonts w:ascii="Arial" w:hAnsi="Arial"/>
+    </w:rPr>
     <w:tblPr>
       <w:tblStyleRowBandSize w:val="1"/>
       <w:tblStyleColBandSize w:val="1"/>
@@ -8249,6 +8628,9 @@
     <w:pPr>
       <w:spacing w:after="0" w:line="240" w:lineRule="auto"/>
     </w:pPr>
+    <w:rPr>
+      <w:rFonts w:ascii="Arial" w:hAnsi="Arial"/>
+    </w:rPr>
     <w:tblPr>
       <w:tblStyleRowBandSize w:val="1"/>
       <w:tblStyleColBandSize w:val="1"/>
@@ -8322,6 +8704,9 @@
     <w:pPr>
       <w:spacing w:after="0" w:line="240" w:lineRule="auto"/>
     </w:pPr>
+    <w:rPr>
+      <w:rFonts w:ascii="Arial" w:hAnsi="Arial"/>
+    </w:rPr>
     <w:tblPr>
       <w:tblStyleRowBandSize w:val="1"/>
       <w:tblStyleColBandSize w:val="1"/>
@@ -8395,6 +8780,9 @@
     <w:pPr>
       <w:spacing w:after="0" w:line="240" w:lineRule="auto"/>
     </w:pPr>
+    <w:rPr>
+      <w:rFonts w:ascii="Arial" w:hAnsi="Arial"/>
+    </w:rPr>
     <w:tblPr>
       <w:tblStyleRowBandSize w:val="1"/>
       <w:tblStyleColBandSize w:val="1"/>
@@ -8468,6 +8856,9 @@
     <w:pPr>
       <w:spacing w:after="0" w:line="240" w:lineRule="auto"/>
     </w:pPr>
+    <w:rPr>
+      <w:rFonts w:ascii="Arial" w:hAnsi="Arial"/>
+    </w:rPr>
     <w:tblPr>
       <w:tblStyleRowBandSize w:val="1"/>
       <w:tblStyleColBandSize w:val="1"/>
@@ -8542,7 +8933,7 @@
       <w:spacing w:after="0" w:line="240" w:lineRule="auto"/>
     </w:pPr>
     <w:rPr>
-      <w:rFonts w:asciiTheme="majorHAnsi" w:eastAsiaTheme="majorEastAsia" w:hAnsiTheme="majorHAnsi" w:cstheme="majorBidi"/>
+      <w:rFonts w:asciiTheme="majorHAnsi" w:eastAsiaTheme="majorEastAsia" w:hAnsiTheme="majorHAnsi" w:cstheme="majorBidi" w:ascii="Arial" w:hAnsi="Arial"/>
       <w:color w:val="000000" w:themeColor="text1"/>
     </w:rPr>
     <w:tblPr>
@@ -8667,7 +9058,7 @@
       <w:spacing w:after="0" w:line="240" w:lineRule="auto"/>
     </w:pPr>
     <w:rPr>
-      <w:rFonts w:asciiTheme="majorHAnsi" w:eastAsiaTheme="majorEastAsia" w:hAnsiTheme="majorHAnsi" w:cstheme="majorBidi"/>
+      <w:rFonts w:asciiTheme="majorHAnsi" w:eastAsiaTheme="majorEastAsia" w:hAnsiTheme="majorHAnsi" w:cstheme="majorBidi" w:ascii="Arial" w:hAnsi="Arial"/>
       <w:color w:val="000000" w:themeColor="text1"/>
     </w:rPr>
     <w:tblPr>
@@ -8792,7 +9183,7 @@
       <w:spacing w:after="0" w:line="240" w:lineRule="auto"/>
     </w:pPr>
     <w:rPr>
-      <w:rFonts w:asciiTheme="majorHAnsi" w:eastAsiaTheme="majorEastAsia" w:hAnsiTheme="majorHAnsi" w:cstheme="majorBidi"/>
+      <w:rFonts w:asciiTheme="majorHAnsi" w:eastAsiaTheme="majorEastAsia" w:hAnsiTheme="majorHAnsi" w:cstheme="majorBidi" w:ascii="Arial" w:hAnsi="Arial"/>
       <w:color w:val="000000" w:themeColor="text1"/>
     </w:rPr>
     <w:tblPr>
@@ -8917,7 +9308,7 @@
       <w:spacing w:after="0" w:line="240" w:lineRule="auto"/>
     </w:pPr>
     <w:rPr>
-      <w:rFonts w:asciiTheme="majorHAnsi" w:eastAsiaTheme="majorEastAsia" w:hAnsiTheme="majorHAnsi" w:cstheme="majorBidi"/>
+      <w:rFonts w:asciiTheme="majorHAnsi" w:eastAsiaTheme="majorEastAsia" w:hAnsiTheme="majorHAnsi" w:cstheme="majorBidi" w:ascii="Arial" w:hAnsi="Arial"/>
       <w:color w:val="000000" w:themeColor="text1"/>
     </w:rPr>
     <w:tblPr>
@@ -9042,7 +9433,7 @@
       <w:spacing w:after="0" w:line="240" w:lineRule="auto"/>
     </w:pPr>
     <w:rPr>
-      <w:rFonts w:asciiTheme="majorHAnsi" w:eastAsiaTheme="majorEastAsia" w:hAnsiTheme="majorHAnsi" w:cstheme="majorBidi"/>
+      <w:rFonts w:asciiTheme="majorHAnsi" w:eastAsiaTheme="majorEastAsia" w:hAnsiTheme="majorHAnsi" w:cstheme="majorBidi" w:ascii="Arial" w:hAnsi="Arial"/>
       <w:color w:val="000000" w:themeColor="text1"/>
     </w:rPr>
     <w:tblPr>
@@ -9167,7 +9558,7 @@
       <w:spacing w:after="0" w:line="240" w:lineRule="auto"/>
     </w:pPr>
     <w:rPr>
-      <w:rFonts w:asciiTheme="majorHAnsi" w:eastAsiaTheme="majorEastAsia" w:hAnsiTheme="majorHAnsi" w:cstheme="majorBidi"/>
+      <w:rFonts w:asciiTheme="majorHAnsi" w:eastAsiaTheme="majorEastAsia" w:hAnsiTheme="majorHAnsi" w:cstheme="majorBidi" w:ascii="Arial" w:hAnsi="Arial"/>
       <w:color w:val="000000" w:themeColor="text1"/>
     </w:rPr>
     <w:tblPr>
@@ -9292,7 +9683,7 @@
       <w:spacing w:after="0" w:line="240" w:lineRule="auto"/>
     </w:pPr>
     <w:rPr>
-      <w:rFonts w:asciiTheme="majorHAnsi" w:eastAsiaTheme="majorEastAsia" w:hAnsiTheme="majorHAnsi" w:cstheme="majorBidi"/>
+      <w:rFonts w:asciiTheme="majorHAnsi" w:eastAsiaTheme="majorEastAsia" w:hAnsiTheme="majorHAnsi" w:cstheme="majorBidi" w:ascii="Arial" w:hAnsi="Arial"/>
       <w:color w:val="000000" w:themeColor="text1"/>
     </w:rPr>
     <w:tblPr>
@@ -9416,6 +9807,9 @@
     <w:pPr>
       <w:spacing w:after="0" w:line="240" w:lineRule="auto"/>
     </w:pPr>
+    <w:rPr>
+      <w:rFonts w:ascii="Arial" w:hAnsi="Arial"/>
+    </w:rPr>
     <w:tblPr>
       <w:tblStyleRowBandSize w:val="1"/>
       <w:tblStyleColBandSize w:val="1"/>
@@ -9557,6 +9951,9 @@
     <w:pPr>
       <w:spacing w:after="0" w:line="240" w:lineRule="auto"/>
     </w:pPr>
+    <w:rPr>
+      <w:rFonts w:ascii="Arial" w:hAnsi="Arial"/>
+    </w:rPr>
     <w:tblPr>
       <w:tblStyleRowBandSize w:val="1"/>
       <w:tblStyleColBandSize w:val="1"/>
@@ -9698,6 +10095,9 @@
     <w:pPr>
       <w:spacing w:after="0" w:line="240" w:lineRule="auto"/>
     </w:pPr>
+    <w:rPr>
+      <w:rFonts w:ascii="Arial" w:hAnsi="Arial"/>
+    </w:rPr>
     <w:tblPr>
       <w:tblStyleRowBandSize w:val="1"/>
       <w:tblStyleColBandSize w:val="1"/>
@@ -9839,6 +10239,9 @@
     <w:pPr>
       <w:spacing w:after="0" w:line="240" w:lineRule="auto"/>
     </w:pPr>
+    <w:rPr>
+      <w:rFonts w:ascii="Arial" w:hAnsi="Arial"/>
+    </w:rPr>
     <w:tblPr>
       <w:tblStyleRowBandSize w:val="1"/>
       <w:tblStyleColBandSize w:val="1"/>
@@ -9980,6 +10383,9 @@
     <w:pPr>
       <w:spacing w:after="0" w:line="240" w:lineRule="auto"/>
     </w:pPr>
+    <w:rPr>
+      <w:rFonts w:ascii="Arial" w:hAnsi="Arial"/>
+    </w:rPr>
     <w:tblPr>
       <w:tblStyleRowBandSize w:val="1"/>
       <w:tblStyleColBandSize w:val="1"/>
@@ -10121,6 +10527,9 @@
     <w:pPr>
       <w:spacing w:after="0" w:line="240" w:lineRule="auto"/>
     </w:pPr>
+    <w:rPr>
+      <w:rFonts w:ascii="Arial" w:hAnsi="Arial"/>
+    </w:rPr>
     <w:tblPr>
       <w:tblStyleRowBandSize w:val="1"/>
       <w:tblStyleColBandSize w:val="1"/>
@@ -10262,6 +10671,9 @@
     <w:pPr>
       <w:spacing w:after="0" w:line="240" w:lineRule="auto"/>
     </w:pPr>
+    <w:rPr>
+      <w:rFonts w:ascii="Arial" w:hAnsi="Arial"/>
+    </w:rPr>
     <w:tblPr>
       <w:tblStyleRowBandSize w:val="1"/>
       <w:tblStyleColBandSize w:val="1"/>
@@ -10404,6 +10816,7 @@
       <w:spacing w:after="0" w:line="240" w:lineRule="auto"/>
     </w:pPr>
     <w:rPr>
+      <w:rFonts w:ascii="Arial" w:hAnsi="Arial"/>
       <w:color w:val="FFFFFF" w:themeColor="background1"/>
     </w:rPr>
     <w:tblPr>
@@ -10518,6 +10931,7 @@
       <w:spacing w:after="0" w:line="240" w:lineRule="auto"/>
     </w:pPr>
     <w:rPr>
+      <w:rFonts w:ascii="Arial" w:hAnsi="Arial"/>
       <w:color w:val="FFFFFF" w:themeColor="background1"/>
     </w:rPr>
     <w:tblPr>
@@ -10632,6 +11046,7 @@
       <w:spacing w:after="0" w:line="240" w:lineRule="auto"/>
     </w:pPr>
     <w:rPr>
+      <w:rFonts w:ascii="Arial" w:hAnsi="Arial"/>
       <w:color w:val="FFFFFF" w:themeColor="background1"/>
     </w:rPr>
     <w:tblPr>
@@ -10746,6 +11161,7 @@
       <w:spacing w:after="0" w:line="240" w:lineRule="auto"/>
     </w:pPr>
     <w:rPr>
+      <w:rFonts w:ascii="Arial" w:hAnsi="Arial"/>
       <w:color w:val="FFFFFF" w:themeColor="background1"/>
     </w:rPr>
     <w:tblPr>
@@ -10860,6 +11276,7 @@
       <w:spacing w:after="0" w:line="240" w:lineRule="auto"/>
     </w:pPr>
     <w:rPr>
+      <w:rFonts w:ascii="Arial" w:hAnsi="Arial"/>
       <w:color w:val="FFFFFF" w:themeColor="background1"/>
     </w:rPr>
     <w:tblPr>
@@ -10974,6 +11391,7 @@
       <w:spacing w:after="0" w:line="240" w:lineRule="auto"/>
     </w:pPr>
     <w:rPr>
+      <w:rFonts w:ascii="Arial" w:hAnsi="Arial"/>
       <w:color w:val="FFFFFF" w:themeColor="background1"/>
     </w:rPr>
     <w:tblPr>
@@ -11088,6 +11506,7 @@
       <w:spacing w:after="0" w:line="240" w:lineRule="auto"/>
     </w:pPr>
     <w:rPr>
+      <w:rFonts w:ascii="Arial" w:hAnsi="Arial"/>
       <w:color w:val="FFFFFF" w:themeColor="background1"/>
     </w:rPr>
     <w:tblPr>
@@ -11202,6 +11621,7 @@
       <w:spacing w:after="0" w:line="240" w:lineRule="auto"/>
     </w:pPr>
     <w:rPr>
+      <w:rFonts w:ascii="Arial" w:hAnsi="Arial"/>
       <w:color w:val="000000" w:themeColor="text1"/>
     </w:rPr>
     <w:tblPr>
@@ -11324,6 +11744,7 @@
       <w:spacing w:after="0" w:line="240" w:lineRule="auto"/>
     </w:pPr>
     <w:rPr>
+      <w:rFonts w:ascii="Arial" w:hAnsi="Arial"/>
       <w:color w:val="000000" w:themeColor="text1"/>
     </w:rPr>
     <w:tblPr>
@@ -11446,6 +11867,7 @@
       <w:spacing w:after="0" w:line="240" w:lineRule="auto"/>
     </w:pPr>
     <w:rPr>
+      <w:rFonts w:ascii="Arial" w:hAnsi="Arial"/>
       <w:color w:val="000000" w:themeColor="text1"/>
     </w:rPr>
     <w:tblPr>
@@ -11568,6 +11990,7 @@
       <w:spacing w:after="0" w:line="240" w:lineRule="auto"/>
     </w:pPr>
     <w:rPr>
+      <w:rFonts w:ascii="Arial" w:hAnsi="Arial"/>
       <w:color w:val="000000" w:themeColor="text1"/>
     </w:rPr>
     <w:tblPr>
@@ -11680,6 +12103,7 @@
       <w:spacing w:after="0" w:line="240" w:lineRule="auto"/>
     </w:pPr>
     <w:rPr>
+      <w:rFonts w:ascii="Arial" w:hAnsi="Arial"/>
       <w:color w:val="000000" w:themeColor="text1"/>
     </w:rPr>
     <w:tblPr>
@@ -11802,6 +12226,7 @@
       <w:spacing w:after="0" w:line="240" w:lineRule="auto"/>
     </w:pPr>
     <w:rPr>
+      <w:rFonts w:ascii="Arial" w:hAnsi="Arial"/>
       <w:color w:val="000000" w:themeColor="text1"/>
     </w:rPr>
     <w:tblPr>
@@ -11924,6 +12349,7 @@
       <w:spacing w:after="0" w:line="240" w:lineRule="auto"/>
     </w:pPr>
     <w:rPr>
+      <w:rFonts w:ascii="Arial" w:hAnsi="Arial"/>
       <w:color w:val="000000" w:themeColor="text1"/>
     </w:rPr>
     <w:tblPr>
@@ -12046,6 +12472,7 @@
       <w:spacing w:after="0" w:line="240" w:lineRule="auto"/>
     </w:pPr>
     <w:rPr>
+      <w:rFonts w:ascii="Arial" w:hAnsi="Arial"/>
       <w:color w:val="000000" w:themeColor="text1"/>
     </w:rPr>
     <w:tblPr>
@@ -12132,6 +12559,7 @@
       <w:spacing w:after="0" w:line="240" w:lineRule="auto"/>
     </w:pPr>
     <w:rPr>
+      <w:rFonts w:ascii="Arial" w:hAnsi="Arial"/>
       <w:color w:val="000000" w:themeColor="text1"/>
     </w:rPr>
     <w:tblPr>
@@ -12218,6 +12646,7 @@
       <w:spacing w:after="0" w:line="240" w:lineRule="auto"/>
     </w:pPr>
     <w:rPr>
+      <w:rFonts w:ascii="Arial" w:hAnsi="Arial"/>
       <w:color w:val="000000" w:themeColor="text1"/>
     </w:rPr>
     <w:tblPr>
@@ -12304,6 +12733,7 @@
       <w:spacing w:after="0" w:line="240" w:lineRule="auto"/>
     </w:pPr>
     <w:rPr>
+      <w:rFonts w:ascii="Arial" w:hAnsi="Arial"/>
       <w:color w:val="000000" w:themeColor="text1"/>
     </w:rPr>
     <w:tblPr>
@@ -12390,6 +12820,7 @@
       <w:spacing w:after="0" w:line="240" w:lineRule="auto"/>
     </w:pPr>
     <w:rPr>
+      <w:rFonts w:ascii="Arial" w:hAnsi="Arial"/>
       <w:color w:val="000000" w:themeColor="text1"/>
     </w:rPr>
     <w:tblPr>
@@ -12476,6 +12907,7 @@
       <w:spacing w:after="0" w:line="240" w:lineRule="auto"/>
     </w:pPr>
     <w:rPr>
+      <w:rFonts w:ascii="Arial" w:hAnsi="Arial"/>
       <w:color w:val="000000" w:themeColor="text1"/>
     </w:rPr>
     <w:tblPr>
@@ -12562,6 +12994,7 @@
       <w:spacing w:after="0" w:line="240" w:lineRule="auto"/>
     </w:pPr>
     <w:rPr>
+      <w:rFonts w:ascii="Arial" w:hAnsi="Arial"/>
       <w:color w:val="000000" w:themeColor="text1"/>
     </w:rPr>
     <w:tblPr>
@@ -12648,6 +13081,7 @@
       <w:spacing w:after="0" w:line="240" w:lineRule="auto"/>
     </w:pPr>
     <w:rPr>
+      <w:rFonts w:ascii="Arial" w:hAnsi="Arial"/>
       <w:color w:val="000000" w:themeColor="text1"/>
     </w:rPr>
     <w:tblPr>
@@ -12728,6 +13162,7 @@
       <w:spacing w:after="0" w:line="240" w:lineRule="auto"/>
     </w:pPr>
     <w:rPr>
+      <w:rFonts w:ascii="Arial" w:hAnsi="Arial"/>
       <w:color w:val="000000" w:themeColor="text1"/>
     </w:rPr>
     <w:tblPr>
@@ -12808,6 +13243,7 @@
       <w:spacing w:after="0" w:line="240" w:lineRule="auto"/>
     </w:pPr>
     <w:rPr>
+      <w:rFonts w:ascii="Arial" w:hAnsi="Arial"/>
       <w:color w:val="000000" w:themeColor="text1"/>
     </w:rPr>
     <w:tblPr>
@@ -12888,6 +13324,7 @@
       <w:spacing w:after="0" w:line="240" w:lineRule="auto"/>
     </w:pPr>
     <w:rPr>
+      <w:rFonts w:ascii="Arial" w:hAnsi="Arial"/>
       <w:color w:val="000000" w:themeColor="text1"/>
     </w:rPr>
     <w:tblPr>
@@ -12968,6 +13405,7 @@
       <w:spacing w:after="0" w:line="240" w:lineRule="auto"/>
     </w:pPr>
     <w:rPr>
+      <w:rFonts w:ascii="Arial" w:hAnsi="Arial"/>
       <w:color w:val="000000" w:themeColor="text1"/>
     </w:rPr>
     <w:tblPr>
@@ -13048,6 +13486,7 @@
       <w:spacing w:after="0" w:line="240" w:lineRule="auto"/>
     </w:pPr>
     <w:rPr>
+      <w:rFonts w:ascii="Arial" w:hAnsi="Arial"/>
       <w:color w:val="000000" w:themeColor="text1"/>
     </w:rPr>
     <w:tblPr>
@@ -13128,6 +13567,7 @@
       <w:spacing w:after="0" w:line="240" w:lineRule="auto"/>
     </w:pPr>
     <w:rPr>
+      <w:rFonts w:ascii="Arial" w:hAnsi="Arial"/>
       <w:color w:val="000000" w:themeColor="text1"/>
     </w:rPr>
     <w:tblPr>

</xml_diff>

<commit_message>
[skip deploy] Save owner-approved R3 production edition: eight systems and original P3 AOSR, 9 actual HTTP ZIPs / 123 verified buyer files
Scoped production release succeeded in run 39384126271. Approved buyer contents are immutable. Prices, 13-position catalog, emails and one-hour delivery verified. Preserve P5/P11/T2/T3 source trees. Four preexisting unrelated public-check failures remain explicitly classified in release evidence. General deployment intentionally skipped.
</commit_message>
<xml_diff>
--- a/products-storage/01-zakrytie-rabot/00-INSTRUKCIYA.docx
+++ b/products-storage/01-zakrytie-rabot/00-INSTRUKCIYA.docx
@@ -8,14 +8,21 @@
       </w:pPr>
       <w:r>
         <w:rPr>
-          <w:b/>
+          <w:rFonts w:ascii="Arial" w:hAnsi="Arial"/>
+          <w:color w:val="AE8031"/>
         </w:rPr>
-        <w:t>Как внедрить пакет «Закрытие работ»</w:t>
+        <w:t>Система получения оплаты за выполненные работы</w:t>
       </w:r>
     </w:p>
     <w:p>
+      <w:pPr>
+        <w:spacing w:after="60"/>
+      </w:pPr>
       <w:r>
-        <w:t>Провести выполненный объём через проверку, приёмку и запуск оплаты.</w:t>
+        <w:rPr>
+          <w:rFonts w:ascii="Arial" w:hAnsi="Arial"/>
+        </w:rPr>
+        <w:t>Подтвердить выполненный объём, оформить сдачу результата работ и предъявить обоснованное требование об оплате.</w:t>
       </w:r>
     </w:p>
     <w:p>
@@ -23,47 +30,70 @@
         <w:pStyle w:val="Heading1"/>
       </w:pPr>
       <w:r>
-        <w:t>Быстрый запуск за 60 минут</w:t>
+        <w:rPr>
+          <w:rFonts w:ascii="Arial" w:hAnsi="Arial"/>
+        </w:rPr>
+        <w:t>Организация документального сопровождения</w:t>
       </w:r>
     </w:p>
     <w:p>
       <w:pPr>
         <w:pStyle w:val="ListNumber"/>
+        <w:spacing w:after="60"/>
       </w:pPr>
       <w:r>
-        <w:t>Скопируйте папку и назовите её по объекту и договору.</w:t>
+        <w:rPr>
+          <w:rFonts w:ascii="Arial" w:hAnsi="Arial"/>
+        </w:rPr>
+        <w:t>Систематизируйте документы по объектам, договорам и отчётным периодам. Для каждого комплекта укажите номер договора и наименование объекта.</w:t>
       </w:r>
     </w:p>
     <w:p>
       <w:pPr>
         <w:pStyle w:val="ListNumber"/>
+        <w:spacing w:after="60"/>
       </w:pPr>
       <w:r>
-        <w:t>Назначьте владельца каждого реестра и резервного исполнителя.</w:t>
+        <w:rPr>
+          <w:rFonts w:ascii="Arial" w:hAnsi="Arial"/>
+        </w:rPr>
+        <w:t>Назначьте ответственных за учёт объёмов, передачу документов, устранение замечаний и контроль оплаты.</w:t>
       </w:r>
     </w:p>
     <w:p>
       <w:pPr>
         <w:pStyle w:val="ListNumber"/>
+        <w:spacing w:after="60"/>
       </w:pPr>
       <w:r>
-        <w:t>Заполните постоянные данные: стороны, договор, объект, каналы уведомлений.</w:t>
+        <w:rPr>
+          <w:rFonts w:ascii="Arial" w:hAnsi="Arial"/>
+        </w:rPr>
+        <w:t>Внесите реквизиты сторон, договора и объекта. Проверьте согласованные адреса и способы направления юридически значимых сообщений.</w:t>
       </w:r>
     </w:p>
     <w:p>
       <w:pPr>
         <w:pStyle w:val="ListNumber"/>
+        <w:spacing w:after="60"/>
       </w:pPr>
       <w:r>
-        <w:t>Выберите один текущий объём и проведите его по документам пакета.</w:t>
+        <w:rPr>
+          <w:rFonts w:ascii="Arial" w:hAnsi="Arial"/>
+        </w:rPr>
+        <w:t>Определите предъявляемый к сдаче объём. Сопоставьте журнал работ, смету, акты, исполнительную документацию и документы о передаче.</w:t>
       </w:r>
     </w:p>
     <w:p>
       <w:pPr>
         <w:pStyle w:val="ListNumber"/>
+        <w:spacing w:after="60"/>
       </w:pPr>
       <w:r>
-        <w:t>Поставьте контрольные даты в календарь и проводите короткую проверку дважды в неделю.</w:t>
+        <w:rPr>
+          <w:rFonts w:ascii="Arial" w:hAnsi="Arial"/>
+        </w:rPr>
+        <w:t>Зафиксируйте договорные сроки приёмки, устранения замечаний и оплаты. Назначьте даты внутреннего контроля до истечения соответствующих сроков.</w:t>
       </w:r>
     </w:p>
     <w:p>
@@ -71,6 +101,9 @@
         <w:pStyle w:val="Heading1"/>
       </w:pPr>
       <w:r>
+        <w:rPr>
+          <w:rFonts w:ascii="Arial" w:hAnsi="Arial"/>
+        </w:rPr>
         <w:t>Состав и назначение</w:t>
       </w:r>
     </w:p>
@@ -78,12 +111,13 @@
       <w:tblPr>
         <w:tblW w:type="auto" w:w="0"/>
         <w:jc w:val="center"/>
+        <w:tblLayout w:type="fixed"/>
         <w:tblLook w:firstColumn="1" w:firstRow="1" w:lastColumn="0" w:lastRow="0" w:noHBand="0" w:noVBand="1" w:val="04A0"/>
       </w:tblPr>
       <w:tblGrid>
-        <w:gridCol w:w="3120"/>
-        <w:gridCol w:w="3120"/>
-        <w:gridCol w:w="3120"/>
+        <w:gridCol w:w="3009"/>
+        <w:gridCol w:w="3009"/>
+        <w:gridCol w:w="3009"/>
       </w:tblGrid>
       <w:tr>
         <w:trPr>
@@ -92,7 +126,7 @@
         </w:trPr>
         <w:tc>
           <w:tcPr>
-            <w:tcW w:type="dxa" w:w="3120"/>
+            <w:tcW w:type="dxa" w:w="3009"/>
             <w:shd w:fill="E9E5DC"/>
           </w:tcPr>
           <w:p>
@@ -101,6 +135,7 @@
             </w:pPr>
             <w:r>
               <w:rPr>
+                <w:rFonts w:ascii="Arial" w:hAnsi="Arial"/>
                 <w:sz w:val="18"/>
               </w:rPr>
               <w:t>Файл</w:t>
@@ -109,7 +144,7 @@
         </w:tc>
         <w:tc>
           <w:tcPr>
-            <w:tcW w:type="dxa" w:w="3120"/>
+            <w:tcW w:type="dxa" w:w="3009"/>
             <w:shd w:fill="E9E5DC"/>
           </w:tcPr>
           <w:p>
@@ -118,6 +153,7 @@
             </w:pPr>
             <w:r>
               <w:rPr>
+                <w:rFonts w:ascii="Arial" w:hAnsi="Arial"/>
                 <w:sz w:val="18"/>
               </w:rPr>
               <w:t>Когда использовать</w:t>
@@ -126,7 +162,7 @@
         </w:tc>
         <w:tc>
           <w:tcPr>
-            <w:tcW w:type="dxa" w:w="3120"/>
+            <w:tcW w:type="dxa" w:w="3009"/>
             <w:shd w:fill="E9E5DC"/>
           </w:tcPr>
           <w:p>
@@ -135,6 +171,7 @@
             </w:pPr>
             <w:r>
               <w:rPr>
+                <w:rFonts w:ascii="Arial" w:hAnsi="Arial"/>
                 <w:sz w:val="18"/>
               </w:rPr>
               <w:t>Результат</w:t>
@@ -148,7 +185,7 @@
         </w:trPr>
         <w:tc>
           <w:tcPr>
-            <w:tcW w:type="dxa" w:w="3120"/>
+            <w:tcW w:type="dxa" w:w="3009"/>
           </w:tcPr>
           <w:p>
             <w:pPr>
@@ -156,15 +193,16 @@
             </w:pPr>
             <w:r>
               <w:rPr>
+                <w:rFonts w:ascii="Arial" w:hAnsi="Arial"/>
                 <w:sz w:val="18"/>
               </w:rPr>
-              <w:t>01-ks-2.docx</w:t>
+              <w:t>01-ks-2.xls</w:t>
             </w:r>
           </w:p>
         </w:tc>
         <w:tc>
           <w:tcPr>
-            <w:tcW w:type="dxa" w:w="3120"/>
+            <w:tcW w:type="dxa" w:w="3009"/>
           </w:tcPr>
           <w:p>
             <w:pPr>
@@ -172,6 +210,7 @@
             </w:pPr>
             <w:r>
               <w:rPr>
+                <w:rFonts w:ascii="Arial" w:hAnsi="Arial"/>
                 <w:sz w:val="18"/>
               </w:rPr>
               <w:t>При оформлении объёмов работ</w:t>
@@ -180,7 +219,7 @@
         </w:tc>
         <w:tc>
           <w:tcPr>
-            <w:tcW w:type="dxa" w:w="3120"/>
+            <w:tcW w:type="dxa" w:w="3009"/>
           </w:tcPr>
           <w:p>
             <w:pPr>
@@ -188,6 +227,7 @@
             </w:pPr>
             <w:r>
               <w:rPr>
+                <w:rFonts w:ascii="Arial" w:hAnsi="Arial"/>
                 <w:sz w:val="18"/>
               </w:rPr>
               <w:t>Проект КС-2 с проверенными объёмами</w:t>
@@ -201,7 +241,7 @@
         </w:trPr>
         <w:tc>
           <w:tcPr>
-            <w:tcW w:type="dxa" w:w="3120"/>
+            <w:tcW w:type="dxa" w:w="3009"/>
           </w:tcPr>
           <w:p>
             <w:pPr>
@@ -209,15 +249,16 @@
             </w:pPr>
             <w:r>
               <w:rPr>
+                <w:rFonts w:ascii="Arial" w:hAnsi="Arial"/>
                 <w:sz w:val="18"/>
               </w:rPr>
-              <w:t>02-ks-3.docx</w:t>
+              <w:t>02-ks-3.xls</w:t>
             </w:r>
           </w:p>
         </w:tc>
         <w:tc>
           <w:tcPr>
-            <w:tcW w:type="dxa" w:w="3120"/>
+            <w:tcW w:type="dxa" w:w="3009"/>
           </w:tcPr>
           <w:p>
             <w:pPr>
@@ -225,6 +266,7 @@
             </w:pPr>
             <w:r>
               <w:rPr>
+                <w:rFonts w:ascii="Arial" w:hAnsi="Arial"/>
                 <w:sz w:val="18"/>
               </w:rPr>
               <w:t>При своде стоимости по КС-2</w:t>
@@ -233,7 +275,7 @@
         </w:tc>
         <w:tc>
           <w:tcPr>
-            <w:tcW w:type="dxa" w:w="3120"/>
+            <w:tcW w:type="dxa" w:w="3009"/>
           </w:tcPr>
           <w:p>
             <w:pPr>
@@ -241,6 +283,7 @@
             </w:pPr>
             <w:r>
               <w:rPr>
+                <w:rFonts w:ascii="Arial" w:hAnsi="Arial"/>
                 <w:sz w:val="18"/>
               </w:rPr>
               <w:t>Проект КС-3 с проверенной суммой</w:t>
@@ -254,7 +297,7 @@
         </w:trPr>
         <w:tc>
           <w:tcPr>
-            <w:tcW w:type="dxa" w:w="3120"/>
+            <w:tcW w:type="dxa" w:w="3009"/>
           </w:tcPr>
           <w:p>
             <w:pPr>
@@ -262,6 +305,7 @@
             </w:pPr>
             <w:r>
               <w:rPr>
+                <w:rFonts w:ascii="Arial" w:hAnsi="Arial"/>
                 <w:sz w:val="18"/>
               </w:rPr>
               <w:t>03-akt-vypolnennyh-rabot.docx</w:t>
@@ -270,7 +314,7 @@
         </w:tc>
         <w:tc>
           <w:tcPr>
-            <w:tcW w:type="dxa" w:w="3120"/>
+            <w:tcW w:type="dxa" w:w="3009"/>
           </w:tcPr>
           <w:p>
             <w:pPr>
@@ -278,6 +322,7 @@
             </w:pPr>
             <w:r>
               <w:rPr>
+                <w:rFonts w:ascii="Arial" w:hAnsi="Arial"/>
                 <w:sz w:val="18"/>
               </w:rPr>
               <w:t>Для фиксации выполненных работ</w:t>
@@ -286,7 +331,7 @@
         </w:tc>
         <w:tc>
           <w:tcPr>
-            <w:tcW w:type="dxa" w:w="3120"/>
+            <w:tcW w:type="dxa" w:w="3009"/>
           </w:tcPr>
           <w:p>
             <w:pPr>
@@ -294,6 +339,7 @@
             </w:pPr>
             <w:r>
               <w:rPr>
+                <w:rFonts w:ascii="Arial" w:hAnsi="Arial"/>
                 <w:sz w:val="18"/>
               </w:rPr>
               <w:t>Акт с датой и подписями</w:t>
@@ -307,7 +353,7 @@
         </w:trPr>
         <w:tc>
           <w:tcPr>
-            <w:tcW w:type="dxa" w:w="3120"/>
+            <w:tcW w:type="dxa" w:w="3009"/>
           </w:tcPr>
           <w:p>
             <w:pPr>
@@ -315,6 +361,7 @@
             </w:pPr>
             <w:r>
               <w:rPr>
+                <w:rFonts w:ascii="Arial" w:hAnsi="Arial"/>
                 <w:sz w:val="18"/>
               </w:rPr>
               <w:t>04-akt-priemki.docx</w:t>
@@ -323,7 +370,7 @@
         </w:tc>
         <w:tc>
           <w:tcPr>
-            <w:tcW w:type="dxa" w:w="3120"/>
+            <w:tcW w:type="dxa" w:w="3009"/>
           </w:tcPr>
           <w:p>
             <w:pPr>
@@ -331,6 +378,7 @@
             </w:pPr>
             <w:r>
               <w:rPr>
+                <w:rFonts w:ascii="Arial" w:hAnsi="Arial"/>
                 <w:sz w:val="18"/>
               </w:rPr>
               <w:t>При согласовании результата работ</w:t>
@@ -339,7 +387,7 @@
         </w:tc>
         <w:tc>
           <w:tcPr>
-            <w:tcW w:type="dxa" w:w="3120"/>
+            <w:tcW w:type="dxa" w:w="3009"/>
           </w:tcPr>
           <w:p>
             <w:pPr>
@@ -347,6 +395,7 @@
             </w:pPr>
             <w:r>
               <w:rPr>
+                <w:rFonts w:ascii="Arial" w:hAnsi="Arial"/>
                 <w:sz w:val="18"/>
               </w:rPr>
               <w:t>Акт приёмки с замечаниями или подписями</w:t>
@@ -360,7 +409,7 @@
         </w:trPr>
         <w:tc>
           <w:tcPr>
-            <w:tcW w:type="dxa" w:w="3120"/>
+            <w:tcW w:type="dxa" w:w="3009"/>
           </w:tcPr>
           <w:p>
             <w:pPr>
@@ -368,6 +417,7 @@
             </w:pPr>
             <w:r>
               <w:rPr>
+                <w:rFonts w:ascii="Arial" w:hAnsi="Arial"/>
                 <w:sz w:val="18"/>
               </w:rPr>
               <w:t>05-peredatochnyy-akt.docx</w:t>
@@ -376,7 +426,7 @@
         </w:tc>
         <w:tc>
           <w:tcPr>
-            <w:tcW w:type="dxa" w:w="3120"/>
+            <w:tcW w:type="dxa" w:w="3009"/>
           </w:tcPr>
           <w:p>
             <w:pPr>
@@ -384,6 +434,7 @@
             </w:pPr>
             <w:r>
               <w:rPr>
+                <w:rFonts w:ascii="Arial" w:hAnsi="Arial"/>
                 <w:sz w:val="18"/>
               </w:rPr>
               <w:t>При передаче пакета заказчику</w:t>
@@ -392,7 +443,7 @@
         </w:tc>
         <w:tc>
           <w:tcPr>
-            <w:tcW w:type="dxa" w:w="3120"/>
+            <w:tcW w:type="dxa" w:w="3009"/>
           </w:tcPr>
           <w:p>
             <w:pPr>
@@ -400,6 +451,7 @@
             </w:pPr>
             <w:r>
               <w:rPr>
+                <w:rFonts w:ascii="Arial" w:hAnsi="Arial"/>
                 <w:sz w:val="18"/>
               </w:rPr>
               <w:t>Состав переданного и подтверждение вручения</w:t>
@@ -413,7 +465,7 @@
         </w:trPr>
         <w:tc>
           <w:tcPr>
-            <w:tcW w:type="dxa" w:w="3120"/>
+            <w:tcW w:type="dxa" w:w="3009"/>
           </w:tcPr>
           <w:p>
             <w:pPr>
@@ -421,15 +473,16 @@
             </w:pPr>
             <w:r>
               <w:rPr>
+                <w:rFonts w:ascii="Arial" w:hAnsi="Arial"/>
                 <w:sz w:val="18"/>
               </w:rPr>
-              <w:t>06-zhurnal-obemov.xlsx</w:t>
+              <w:t>06-zhurnal-ucheta-rabot-ks-6a.xls</w:t>
             </w:r>
           </w:p>
         </w:tc>
         <w:tc>
           <w:tcPr>
-            <w:tcW w:type="dxa" w:w="3120"/>
+            <w:tcW w:type="dxa" w:w="3009"/>
           </w:tcPr>
           <w:p>
             <w:pPr>
@@ -437,15 +490,16 @@
             </w:pPr>
             <w:r>
               <w:rPr>
+                <w:rFonts w:ascii="Arial" w:hAnsi="Arial"/>
                 <w:sz w:val="18"/>
               </w:rPr>
-              <w:t>Для фиксации выполненных объёмов</w:t>
+              <w:t>Для учёта выполненных работ</w:t>
             </w:r>
           </w:p>
         </w:tc>
         <w:tc>
           <w:tcPr>
-            <w:tcW w:type="dxa" w:w="3120"/>
+            <w:tcW w:type="dxa" w:w="3009"/>
           </w:tcPr>
           <w:p>
             <w:pPr>
@@ -453,9 +507,10 @@
             </w:pPr>
             <w:r>
               <w:rPr>
+                <w:rFonts w:ascii="Arial" w:hAnsi="Arial"/>
                 <w:sz w:val="18"/>
               </w:rPr>
-              <w:t>Журнал и ссылки на доказательства</w:t>
+              <w:t>Журнал по форме КС-6а</w:t>
             </w:r>
           </w:p>
         </w:tc>
@@ -466,7 +521,7 @@
         </w:trPr>
         <w:tc>
           <w:tcPr>
-            <w:tcW w:type="dxa" w:w="3120"/>
+            <w:tcW w:type="dxa" w:w="3009"/>
           </w:tcPr>
           <w:p>
             <w:pPr>
@@ -474,6 +529,63 @@
             </w:pPr>
             <w:r>
               <w:rPr>
+                <w:rFonts w:ascii="Arial" w:hAnsi="Arial"/>
+                <w:sz w:val="18"/>
+              </w:rPr>
+              <w:t>06A-rabochiy-reestr-obemov.xlsx</w:t>
+            </w:r>
+          </w:p>
+        </w:tc>
+        <w:tc>
+          <w:tcPr>
+            <w:tcW w:type="dxa" w:w="3009"/>
+          </w:tcPr>
+          <w:p>
+            <w:pPr>
+              <w:spacing w:after="0"/>
+            </w:pPr>
+            <w:r>
+              <w:rPr>
+                <w:rFonts w:ascii="Arial" w:hAnsi="Arial"/>
+                <w:sz w:val="18"/>
+              </w:rPr>
+              <w:t>Для оперативного учёта объёмов</w:t>
+            </w:r>
+          </w:p>
+        </w:tc>
+        <w:tc>
+          <w:tcPr>
+            <w:tcW w:type="dxa" w:w="3009"/>
+          </w:tcPr>
+          <w:p>
+            <w:pPr>
+              <w:spacing w:after="0"/>
+            </w:pPr>
+            <w:r>
+              <w:rPr>
+                <w:rFonts w:ascii="Arial" w:hAnsi="Arial"/>
+                <w:sz w:val="18"/>
+              </w:rPr>
+              <w:t>Записи и ссылки на подтверждения</w:t>
+            </w:r>
+          </w:p>
+        </w:tc>
+      </w:tr>
+      <w:tr>
+        <w:trPr>
+          <w:cantSplit/>
+        </w:trPr>
+        <w:tc>
+          <w:tcPr>
+            <w:tcW w:type="dxa" w:w="3009"/>
+          </w:tcPr>
+          <w:p>
+            <w:pPr>
+              <w:spacing w:after="0"/>
+            </w:pPr>
+            <w:r>
+              <w:rPr>
+                <w:rFonts w:ascii="Arial" w:hAnsi="Arial"/>
                 <w:sz w:val="18"/>
               </w:rPr>
               <w:t>07-reestr-zamechaniy.xlsx</w:t>
@@ -482,7 +594,7 @@
         </w:tc>
         <w:tc>
           <w:tcPr>
-            <w:tcW w:type="dxa" w:w="3120"/>
+            <w:tcW w:type="dxa" w:w="3009"/>
           </w:tcPr>
           <w:p>
             <w:pPr>
@@ -490,6 +602,7 @@
             </w:pPr>
             <w:r>
               <w:rPr>
+                <w:rFonts w:ascii="Arial" w:hAnsi="Arial"/>
                 <w:sz w:val="18"/>
               </w:rPr>
               <w:t>Для учёта и закрытия замечаний</w:t>
@@ -498,7 +611,7 @@
         </w:tc>
         <w:tc>
           <w:tcPr>
-            <w:tcW w:type="dxa" w:w="3120"/>
+            <w:tcW w:type="dxa" w:w="3009"/>
           </w:tcPr>
           <w:p>
             <w:pPr>
@@ -506,6 +619,7 @@
             </w:pPr>
             <w:r>
               <w:rPr>
+                <w:rFonts w:ascii="Arial" w:hAnsi="Arial"/>
                 <w:sz w:val="18"/>
               </w:rPr>
               <w:t>Статусы, сроки и доказательства закрытия</w:t>
@@ -519,7 +633,7 @@
         </w:trPr>
         <w:tc>
           <w:tcPr>
-            <w:tcW w:type="dxa" w:w="3120"/>
+            <w:tcW w:type="dxa" w:w="3009"/>
           </w:tcPr>
           <w:p>
             <w:pPr>
@@ -527,6 +641,7 @@
             </w:pPr>
             <w:r>
               <w:rPr>
+                <w:rFonts w:ascii="Arial" w:hAnsi="Arial"/>
                 <w:sz w:val="18"/>
               </w:rPr>
               <w:t>08-reestr-peredachi.xlsx</w:t>
@@ -535,7 +650,7 @@
         </w:tc>
         <w:tc>
           <w:tcPr>
-            <w:tcW w:type="dxa" w:w="3120"/>
+            <w:tcW w:type="dxa" w:w="3009"/>
           </w:tcPr>
           <w:p>
             <w:pPr>
@@ -543,6 +658,7 @@
             </w:pPr>
             <w:r>
               <w:rPr>
+                <w:rFonts w:ascii="Arial" w:hAnsi="Arial"/>
                 <w:sz w:val="18"/>
               </w:rPr>
               <w:t>Для фиксации состава и передачи</w:t>
@@ -551,7 +667,7 @@
         </w:tc>
         <w:tc>
           <w:tcPr>
-            <w:tcW w:type="dxa" w:w="3120"/>
+            <w:tcW w:type="dxa" w:w="3009"/>
           </w:tcPr>
           <w:p>
             <w:pPr>
@@ -559,6 +675,7 @@
             </w:pPr>
             <w:r>
               <w:rPr>
+                <w:rFonts w:ascii="Arial" w:hAnsi="Arial"/>
                 <w:sz w:val="18"/>
               </w:rPr>
               <w:t>Дата, канал, получатель и подтверждение</w:t>
@@ -572,7 +689,7 @@
         </w:trPr>
         <w:tc>
           <w:tcPr>
-            <w:tcW w:type="dxa" w:w="3120"/>
+            <w:tcW w:type="dxa" w:w="3009"/>
           </w:tcPr>
           <w:p>
             <w:pPr>
@@ -580,6 +697,7 @@
             </w:pPr>
             <w:r>
               <w:rPr>
+                <w:rFonts w:ascii="Arial" w:hAnsi="Arial"/>
                 <w:sz w:val="18"/>
               </w:rPr>
               <w:t>09-checklist-peredachi.pdf</w:t>
@@ -588,7 +706,7 @@
         </w:tc>
         <w:tc>
           <w:tcPr>
-            <w:tcW w:type="dxa" w:w="3120"/>
+            <w:tcW w:type="dxa" w:w="3009"/>
           </w:tcPr>
           <w:p>
             <w:pPr>
@@ -596,6 +714,7 @@
             </w:pPr>
             <w:r>
               <w:rPr>
+                <w:rFonts w:ascii="Arial" w:hAnsi="Arial"/>
                 <w:sz w:val="18"/>
               </w:rPr>
               <w:t>Перед передачей комплекта</w:t>
@@ -604,7 +723,7 @@
         </w:tc>
         <w:tc>
           <w:tcPr>
-            <w:tcW w:type="dxa" w:w="3120"/>
+            <w:tcW w:type="dxa" w:w="3009"/>
           </w:tcPr>
           <w:p>
             <w:pPr>
@@ -612,9 +731,10 @@
             </w:pPr>
             <w:r>
               <w:rPr>
+                <w:rFonts w:ascii="Arial" w:hAnsi="Arial"/>
                 <w:sz w:val="18"/>
               </w:rPr>
-              <w:t>Отмеченные проверки и пробелы</w:t>
+              <w:t>Результаты проверки состава и оформления документов</w:t>
             </w:r>
           </w:p>
         </w:tc>
@@ -625,7 +745,7 @@
         </w:trPr>
         <w:tc>
           <w:tcPr>
-            <w:tcW w:type="dxa" w:w="3120"/>
+            <w:tcW w:type="dxa" w:w="3009"/>
           </w:tcPr>
           <w:p>
             <w:pPr>
@@ -633,6 +753,7 @@
             </w:pPr>
             <w:r>
               <w:rPr>
+                <w:rFonts w:ascii="Arial" w:hAnsi="Arial"/>
                 <w:sz w:val="18"/>
               </w:rPr>
               <w:t>10-sroki-hraneniya.pdf</w:t>
@@ -641,7 +762,7 @@
         </w:tc>
         <w:tc>
           <w:tcPr>
-            <w:tcW w:type="dxa" w:w="3120"/>
+            <w:tcW w:type="dxa" w:w="3009"/>
           </w:tcPr>
           <w:p>
             <w:pPr>
@@ -649,6 +770,7 @@
             </w:pPr>
             <w:r>
               <w:rPr>
+                <w:rFonts w:ascii="Arial" w:hAnsi="Arial"/>
                 <w:sz w:val="18"/>
               </w:rPr>
               <w:t>Для организации хранения и подтверждений передачи</w:t>
@@ -657,7 +779,7 @@
         </w:tc>
         <w:tc>
           <w:tcPr>
-            <w:tcW w:type="dxa" w:w="3120"/>
+            <w:tcW w:type="dxa" w:w="3009"/>
           </w:tcPr>
           <w:p>
             <w:pPr>
@@ -665,6 +787,7 @@
             </w:pPr>
             <w:r>
               <w:rPr>
+                <w:rFonts w:ascii="Arial" w:hAnsi="Arial"/>
                 <w:sz w:val="18"/>
               </w:rPr>
               <w:t>Определены правила хранения по виду документов</w:t>
@@ -678,7 +801,7 @@
         </w:trPr>
         <w:tc>
           <w:tcPr>
-            <w:tcW w:type="dxa" w:w="3120"/>
+            <w:tcW w:type="dxa" w:w="3009"/>
           </w:tcPr>
           <w:p>
             <w:pPr>
@@ -686,6 +809,7 @@
             </w:pPr>
             <w:r>
               <w:rPr>
+                <w:rFonts w:ascii="Arial" w:hAnsi="Arial"/>
                 <w:sz w:val="18"/>
               </w:rPr>
               <w:t>11-slovar-poley.docx</w:t>
@@ -694,17 +818,20 @@
         </w:tc>
         <w:tc>
           <w:tcPr>
-            <w:tcW w:type="dxa" w:w="3120"/>
+            <w:tcW w:type="dxa" w:w="3009"/>
           </w:tcPr>
           <w:p>
             <w:r>
+              <w:rPr>
+                <w:rFonts w:ascii="Arial" w:hAnsi="Arial"/>
+              </w:rPr>
               <w:t>Для заполнения форм: значения полей и источники данных</w:t>
             </w:r>
           </w:p>
         </w:tc>
         <w:tc>
           <w:tcPr>
-            <w:tcW w:type="dxa" w:w="3120"/>
+            <w:tcW w:type="dxa" w:w="3009"/>
           </w:tcPr>
           <w:p>
             <w:pPr>
@@ -712,6 +839,7 @@
             </w:pPr>
             <w:r>
               <w:rPr>
+                <w:rFonts w:ascii="Arial" w:hAnsi="Arial"/>
                 <w:sz w:val="18"/>
               </w:rPr>
               <w:t>Проверены исходные данные для заполнения</w:t>
@@ -725,7 +853,7 @@
         </w:trPr>
         <w:tc>
           <w:tcPr>
-            <w:tcW w:type="dxa" w:w="3120"/>
+            <w:tcW w:type="dxa" w:w="3009"/>
           </w:tcPr>
           <w:p>
             <w:pPr>
@@ -733,6 +861,7 @@
             </w:pPr>
             <w:r>
               <w:rPr>
+                <w:rFonts w:ascii="Arial" w:hAnsi="Arial"/>
                 <w:sz w:val="18"/>
               </w:rPr>
               <w:t>12-pretenziya-na-neoplatu-po-ks-2.docx</w:t>
@@ -741,7 +870,7 @@
         </w:tc>
         <w:tc>
           <w:tcPr>
-            <w:tcW w:type="dxa" w:w="3120"/>
+            <w:tcW w:type="dxa" w:w="3009"/>
           </w:tcPr>
           <w:p>
             <w:pPr>
@@ -749,6 +878,7 @@
             </w:pPr>
             <w:r>
               <w:rPr>
+                <w:rFonts w:ascii="Arial" w:hAnsi="Arial"/>
                 <w:sz w:val="18"/>
               </w:rPr>
               <w:t>После проверки приёмки, срока оплаты и претензионного порядка</w:t>
@@ -757,7 +887,7 @@
         </w:tc>
         <w:tc>
           <w:tcPr>
-            <w:tcW w:type="dxa" w:w="3120"/>
+            <w:tcW w:type="dxa" w:w="3009"/>
           </w:tcPr>
           <w:p>
             <w:pPr>
@@ -765,6 +895,7 @@
             </w:pPr>
             <w:r>
               <w:rPr>
+                <w:rFonts w:ascii="Arial" w:hAnsi="Arial"/>
                 <w:sz w:val="18"/>
               </w:rPr>
               <w:t>Адаптированная претензия с приложениями</w:t>
@@ -778,7 +909,7 @@
         </w:trPr>
         <w:tc>
           <w:tcPr>
-            <w:tcW w:type="dxa" w:w="3120"/>
+            <w:tcW w:type="dxa" w:w="3009"/>
           </w:tcPr>
           <w:p>
             <w:pPr>
@@ -786,6 +917,7 @@
             </w:pPr>
             <w:r>
               <w:rPr>
+                <w:rFonts w:ascii="Arial" w:hAnsi="Arial"/>
                 <w:sz w:val="18"/>
               </w:rPr>
               <w:t>13-uvedomlenie-o-prosrochke-oplaty.docx</w:t>
@@ -794,7 +926,7 @@
         </w:tc>
         <w:tc>
           <w:tcPr>
-            <w:tcW w:type="dxa" w:w="3120"/>
+            <w:tcW w:type="dxa" w:w="3009"/>
           </w:tcPr>
           <w:p>
             <w:pPr>
@@ -802,6 +934,7 @@
             </w:pPr>
             <w:r>
               <w:rPr>
+                <w:rFonts w:ascii="Arial" w:hAnsi="Arial"/>
                 <w:sz w:val="18"/>
               </w:rPr>
               <w:t>При наступлении просрочки оплаты по договору</w:t>
@@ -810,7 +943,7 @@
         </w:tc>
         <w:tc>
           <w:tcPr>
-            <w:tcW w:type="dxa" w:w="3120"/>
+            <w:tcW w:type="dxa" w:w="3009"/>
           </w:tcPr>
           <w:p>
             <w:pPr>
@@ -818,6 +951,7 @@
             </w:pPr>
             <w:r>
               <w:rPr>
+                <w:rFonts w:ascii="Arial" w:hAnsi="Arial"/>
                 <w:sz w:val="18"/>
               </w:rPr>
               <w:t>Адаптированное уведомление и доказательство отправки</w:t>
@@ -831,7 +965,7 @@
         </w:trPr>
         <w:tc>
           <w:tcPr>
-            <w:tcW w:type="dxa" w:w="3120"/>
+            <w:tcW w:type="dxa" w:w="3009"/>
           </w:tcPr>
           <w:p>
             <w:pPr>
@@ -839,6 +973,7 @@
             </w:pPr>
             <w:r>
               <w:rPr>
+                <w:rFonts w:ascii="Arial" w:hAnsi="Arial"/>
                 <w:sz w:val="18"/>
               </w:rPr>
               <w:t>14-raschet-procentov-395-gk.xlsx</w:t>
@@ -847,7 +982,7 @@
         </w:tc>
         <w:tc>
           <w:tcPr>
-            <w:tcW w:type="dxa" w:w="3120"/>
+            <w:tcW w:type="dxa" w:w="3009"/>
           </w:tcPr>
           <w:p>
             <w:pPr>
@@ -855,6 +990,7 @@
             </w:pPr>
             <w:r>
               <w:rPr>
+                <w:rFonts w:ascii="Arial" w:hAnsi="Arial"/>
                 <w:sz w:val="18"/>
               </w:rPr>
               <w:t>Для расчёта процентов по ст. 395 ГК РФ по периодам</w:t>
@@ -863,7 +999,7 @@
         </w:tc>
         <w:tc>
           <w:tcPr>
-            <w:tcW w:type="dxa" w:w="3120"/>
+            <w:tcW w:type="dxa" w:w="3009"/>
           </w:tcPr>
           <w:p>
             <w:pPr>
@@ -871,6 +1007,7 @@
             </w:pPr>
             <w:r>
               <w:rPr>
+                <w:rFonts w:ascii="Arial" w:hAnsi="Arial"/>
                 <w:sz w:val="18"/>
               </w:rPr>
               <w:t>Проверенный расчёт с исходными данными</w:t>
@@ -884,7 +1021,7 @@
         </w:trPr>
         <w:tc>
           <w:tcPr>
-            <w:tcW w:type="dxa" w:w="3120"/>
+            <w:tcW w:type="dxa" w:w="3009"/>
           </w:tcPr>
           <w:p>
             <w:pPr>
@@ -892,6 +1029,7 @@
             </w:pPr>
             <w:r>
               <w:rPr>
+                <w:rFonts w:ascii="Arial" w:hAnsi="Arial"/>
                 <w:sz w:val="18"/>
               </w:rPr>
               <w:t>15-algoritm-pri-zaderzhke-oplaty.docx</w:t>
@@ -900,7 +1038,7 @@
         </w:tc>
         <w:tc>
           <w:tcPr>
-            <w:tcW w:type="dxa" w:w="3120"/>
+            <w:tcW w:type="dxa" w:w="3009"/>
           </w:tcPr>
           <w:p>
             <w:pPr>
@@ -908,6 +1046,7 @@
             </w:pPr>
             <w:r>
               <w:rPr>
+                <w:rFonts w:ascii="Arial" w:hAnsi="Arial"/>
                 <w:sz w:val="18"/>
               </w:rPr>
               <w:t>Для выбора следующего шага при задержке оплаты</w:t>
@@ -916,7 +1055,7 @@
         </w:tc>
         <w:tc>
           <w:tcPr>
-            <w:tcW w:type="dxa" w:w="3120"/>
+            <w:tcW w:type="dxa" w:w="3009"/>
           </w:tcPr>
           <w:p>
             <w:pPr>
@@ -924,6 +1063,7 @@
             </w:pPr>
             <w:r>
               <w:rPr>
+                <w:rFonts w:ascii="Arial" w:hAnsi="Arial"/>
                 <w:sz w:val="18"/>
               </w:rPr>
               <w:t>План действий и контроль сроков</w:t>
@@ -937,7 +1077,7 @@
         </w:trPr>
         <w:tc>
           <w:tcPr>
-            <w:tcW w:type="dxa" w:w="3120"/>
+            <w:tcW w:type="dxa" w:w="3009"/>
           </w:tcPr>
           <w:p>
             <w:pPr>
@@ -945,6 +1085,7 @@
             </w:pPr>
             <w:r>
               <w:rPr>
+                <w:rFonts w:ascii="Arial" w:hAnsi="Arial"/>
                 <w:sz w:val="18"/>
               </w:rPr>
               <w:t>16-iskovoe-zayavlenie-o-vzyskanii.docx</w:t>
@@ -953,7 +1094,7 @@
         </w:tc>
         <w:tc>
           <w:tcPr>
-            <w:tcW w:type="dxa" w:w="3120"/>
+            <w:tcW w:type="dxa" w:w="3009"/>
           </w:tcPr>
           <w:p>
             <w:pPr>
@@ -961,6 +1102,7 @@
             </w:pPr>
             <w:r>
               <w:rPr>
+                <w:rFonts w:ascii="Arial" w:hAnsi="Arial"/>
                 <w:sz w:val="18"/>
               </w:rPr>
               <w:t>Перед подготовкой обращения в арбитражный суд</w:t>
@@ -969,7 +1111,7 @@
         </w:tc>
         <w:tc>
           <w:tcPr>
-            <w:tcW w:type="dxa" w:w="3120"/>
+            <w:tcW w:type="dxa" w:w="3009"/>
           </w:tcPr>
           <w:p>
             <w:pPr>
@@ -977,6 +1119,7 @@
             </w:pPr>
             <w:r>
               <w:rPr>
+                <w:rFonts w:ascii="Arial" w:hAnsi="Arial"/>
                 <w:sz w:val="18"/>
               </w:rPr>
               <w:t>Адаптированный проект иска и список приложений</w:t>
@@ -990,54 +1133,81 @@
         <w:pStyle w:val="Heading1"/>
       </w:pPr>
       <w:r>
+        <w:rPr>
+          <w:rFonts w:ascii="Arial" w:hAnsi="Arial"/>
+        </w:rPr>
         <w:t>Правила адаптации</w:t>
       </w:r>
     </w:p>
     <w:p>
       <w:pPr>
         <w:pStyle w:val="ListBullet"/>
+        <w:spacing w:after="60"/>
       </w:pPr>
       <w:r>
+        <w:rPr>
+          <w:rFonts w:ascii="Arial" w:hAnsi="Arial"/>
+        </w:rPr>
         <w:t>Заполните поля в квадратных и двойных фигурных скобках, затем удалите обозначения полей и подсказки. Проверьте заполненную форму перед отправкой.</w:t>
       </w:r>
     </w:p>
     <w:p>
       <w:pPr>
         <w:pStyle w:val="ListBullet"/>
+        <w:spacing w:after="60"/>
       </w:pPr>
       <w:r>
+        <w:rPr>
+          <w:rFonts w:ascii="Arial" w:hAnsi="Arial"/>
+        </w:rPr>
         <w:t>Термины и сроки должны совпадать с договором.</w:t>
       </w:r>
     </w:p>
     <w:p>
       <w:pPr>
         <w:pStyle w:val="ListBullet"/>
+        <w:spacing w:after="60"/>
       </w:pPr>
       <w:r>
+        <w:rPr>
+          <w:rFonts w:ascii="Arial" w:hAnsi="Arial"/>
+        </w:rPr>
         <w:t>Не меняйте факты задним числом; выпускайте новую версию.</w:t>
       </w:r>
     </w:p>
     <w:p>
       <w:pPr>
         <w:pStyle w:val="ListBullet"/>
+        <w:spacing w:after="60"/>
       </w:pPr>
       <w:r>
+        <w:rPr>
+          <w:rFonts w:ascii="Arial" w:hAnsi="Arial"/>
+        </w:rPr>
         <w:t>Сохраняйте подтверждение доставки рядом с отправленным файлом.</w:t>
       </w:r>
     </w:p>
     <w:p>
       <w:pPr>
         <w:pStyle w:val="ListBullet"/>
+        <w:spacing w:after="60"/>
       </w:pPr>
       <w:r>
+        <w:rPr>
+          <w:rFonts w:ascii="Arial" w:hAnsi="Arial"/>
+        </w:rPr>
         <w:t>Сопоставьте формулировки с условиями договора и подтверждающими документами объекта.</w:t>
       </w:r>
     </w:p>
     <w:p>
       <w:pPr>
         <w:pStyle w:val="ListBullet"/>
+        <w:spacing w:after="60"/>
       </w:pPr>
       <w:r>
+        <w:rPr>
+          <w:rFonts w:ascii="Arial" w:hAnsi="Arial"/>
+        </w:rPr>
         <w:t>Сверьте правовые нормы и реквизиты на дату использования; ставки, сроки и порядок берите из источников, указанных в соответствующем файле.</w:t>
       </w:r>
     </w:p>
@@ -1046,25 +1216,21 @@
         <w:pStyle w:val="Heading1"/>
       </w:pPr>
       <w:r>
-        <w:t>Структура папки объекта</w:t>
-      </w:r>
-    </w:p>
-    <w:p>
-      <w:r>
-        <w:t>01_Исходные → 02_Рабочие версии → 03_На согласовании → 04_Подписано → 05_Доказательства передачи → 06_Оплата</w:t>
+        <w:rPr>
+          <w:rFonts w:ascii="Arial" w:hAnsi="Arial"/>
+        </w:rPr>
+        <w:t>Контроль результата</w:t>
       </w:r>
     </w:p>
     <w:p>
       <w:pPr>
-        <w:pStyle w:val="Heading1"/>
+        <w:spacing w:after="60"/>
       </w:pPr>
       <w:r>
-        <w:t>Контроль результата</w:t>
-      </w:r>
-    </w:p>
-    <w:p>
-      <w:r>
-        <w:t>Пакет внедрён, когда по каждому объёму зафиксированы основание, факт выполнения и доказательства в журнале 06, суммы согласованы в формах 01–03, состав и передача отмечены в 05 и 08, замечания отражены в 07. Срок оплаты берите из договора и проверяйте по словарю 11. Частичные оплаты сверяйте с банковскими выписками перед расчётом в 14.</w:t>
+        <w:rPr>
+          <w:rFonts w:ascii="Arial" w:hAnsi="Arial"/>
+        </w:rPr>
+        <w:t>По каждому предъявляемому объёму проверьте основание, подтверждающие документы, стоимость, дату передачи и срок оплаты. Форма КС-6а — файл 06; оперативный учёт объёмов и подтверждений — 06A. Реестр 07 содержит замечания, реестр 08 — передачу документов. До расчёта процентов в файле 14 сверьте остаток с банковскими выписками.</w:t>
       </w:r>
     </w:p>
     <w:p>
@@ -1073,6 +1239,7 @@
       </w:pPr>
       <w:r>
         <w:rPr>
+          <w:rFonts w:ascii="Arial" w:hAnsi="Arial"/>
           <w:color w:val="000000"/>
           <w:sz w:val="20"/>
         </w:rPr>
@@ -1080,27 +1247,42 @@
       </w:r>
     </w:p>
     <w:p>
-      <w:pPr/>
+      <w:pPr>
+        <w:spacing w:after="60"/>
+      </w:pPr>
       <w:r>
-        <w:t>Файлы 01 и 02 воспроизводят реквизиты и структуру унифицированных форм № КС-2 (ОКУД 0322005) и № КС-3 (ОКУД 0322001), утвержденных постановлением Госкомстата России от 11.11.1999 № 100. Перед применением сверьте форму с договором и принятой учетной политикой. Унифицированные формы первичных документов в общем случае не являются обязательными с 2013 года; конкретные требования договора и законодательства для вашего случая проверяются отдельно.</w:t>
+        <w:rPr>
+          <w:rFonts w:ascii="Arial" w:hAnsi="Arial"/>
+        </w:rPr>
+        <w:t>Файлы 01-ks-2.xls, 02-ks-3.xls и 06-zhurnal-ucheta-rabot-ks-6a.xls — опубликованные бланки КС-2, КС-3 и КС-6а по постановлению Госкомстата России от 11.11.1999 № 100. Текст, графы и оформление сохранены. Заполните их в Excel по документам объекта; применимость проверьте по договору и учётной политике.</w:t>
       </w:r>
     </w:p>
     <w:p>
-      <w:pPr/>
+      <w:pPr>
+        <w:spacing w:after="60"/>
+      </w:pPr>
       <w:r>
-        <w:t>КС-2 содержит восемь граф, включая отдельные номер позиции сметы и номер единичной расценки. КС-3 содержит шесть граф, включая код, суммы с начала работ и года и за отчетный период. Заполните реквизиты участников, расчетные суммы, ОКПО и подписи. Если поле не относится к вашей ситуации, отразите это в порядке, согласованном сторонами; не удаляйте графы без согласования.</w:t>
+        <w:rPr>
+          <w:rFonts w:ascii="Arial" w:hAnsi="Arial"/>
+        </w:rPr>
+        <w:t>При заполнении сохраните все предусмотренные графы, реквизиты и подписные строки. Дополнительные расчёты и пояснения оформляйте отдельными приложениями. Пустые поля заполняйте в соответствии с согласованным порядком документооборота.</w:t>
       </w:r>
     </w:p>
     <w:p>
-      <w:pPr/>
+      <w:pPr>
+        <w:spacing w:after="60"/>
+      </w:pPr>
       <w:r>
-        <w:t>Операционный журнал 06 служит сверке объема и доказательств; он не является унифицированной формой КС-6а. Файлы 03–05 и 07–16 — рабочие и договорные документы комплекта, а не формы, утвержденные Госкомстатом или Минстроем. Если договор требует другую форму или специальный порядок приемки, применяйте его. Источник КС-2 и КС-3: https://www.consultant.ru/document/cons_doc_LAW_26303/ .</w:t>
+        <w:rPr>
+          <w:rFonts w:ascii="Arial" w:hAnsi="Arial"/>
+        </w:rPr>
+        <w:t>Файл 06A предназначен для оперативного учёта объёмов и подтверждений. Форму КС-6а заполняйте в файле 06 по документам объекта. Источник бланков КС-2, КС-3 и КС-6а: https://www.consultant.ru/document/cons_doc_LAW_26303/ .</w:t>
       </w:r>
     </w:p>
     <w:sectPr>
       <w:headerReference w:type="default" r:id="rId9"/>
       <w:footerReference w:type="default" r:id="rId10"/>
-      <w:pgSz w:w="12240" w:h="15840"/>
+      <w:pgSz w:w="11906" w:h="16838"/>
       <w:pgMar w:top="1440" w:right="1440" w:bottom="1440" w:left="1440" w:header="708" w:footer="708" w:gutter="0"/>
       <w:cols w:space="720"/>
       <w:docGrid w:linePitch="360"/>
@@ -1137,10 +1319,8 @@
     <w:r>
       <w:rPr>
         <w:rFonts w:ascii="Arial" w:hAnsi="Arial"/>
-        <w:color w:val="646464"/>
-        <w:sz w:val="16"/>
-      </w:rPr>
-      <w:t>МАРЖА В БЕТОНЕ  /  ФОРМЫ И ПОРЯДОК</w:t>
+      </w:rPr>
+      <w:t>НА СТОРОНЕ ПОДРЯДЧИКА  /  ФОРМЫ И ПОРЯДОК</w:t>
     </w:r>
   </w:p>
 </w:hdr>
@@ -1514,7 +1694,7 @@
     </w:pPr>
     <w:rPr>
       <w:rFonts w:ascii="Arial" w:hAnsi="Arial"/>
-      <w:sz w:val="22"/>
+      <w:sz w:val="21"/>
     </w:rPr>
   </w:style>
   <w:style w:type="paragraph" w:styleId="Header">
@@ -1531,6 +1711,9 @@
       </w:tabs>
       <w:spacing w:after="0" w:line="240" w:lineRule="auto"/>
     </w:pPr>
+    <w:rPr>
+      <w:rFonts w:ascii="Arial" w:hAnsi="Arial"/>
+    </w:rPr>
   </w:style>
   <w:style w:type="character" w:customStyle="1" w:styleId="HeaderChar">
     <w:name w:val="Header Char"/>
@@ -1538,6 +1721,9 @@
     <w:link w:val="Header"/>
     <w:uiPriority w:val="99"/>
     <w:rsid w:val="00E618BF"/>
+    <w:rPr>
+      <w:rFonts w:ascii="Arial" w:hAnsi="Arial"/>
+    </w:rPr>
   </w:style>
   <w:style w:type="paragraph" w:styleId="Footer">
     <w:name w:val="footer"/>
@@ -1553,6 +1739,9 @@
       </w:tabs>
       <w:spacing w:after="0" w:line="240" w:lineRule="auto"/>
     </w:pPr>
+    <w:rPr>
+      <w:rFonts w:ascii="Arial" w:hAnsi="Arial"/>
+    </w:rPr>
   </w:style>
   <w:style w:type="character" w:customStyle="1" w:styleId="FooterChar">
     <w:name w:val="Footer Char"/>
@@ -1560,6 +1749,9 @@
     <w:link w:val="Footer"/>
     <w:uiPriority w:val="99"/>
     <w:rsid w:val="00E618BF"/>
+    <w:rPr>
+      <w:rFonts w:ascii="Arial" w:hAnsi="Arial"/>
+    </w:rPr>
   </w:style>
   <w:style w:type="paragraph" w:styleId="Heading1">
     <w:name w:val="heading 1"/>
@@ -1624,7 +1816,7 @@
       <w:outlineLvl w:val="2"/>
     </w:pPr>
     <w:rPr>
-      <w:rFonts w:asciiTheme="majorHAnsi" w:eastAsiaTheme="majorEastAsia" w:hAnsiTheme="majorHAnsi" w:cstheme="majorBidi"/>
+      <w:rFonts w:asciiTheme="majorHAnsi" w:eastAsiaTheme="majorEastAsia" w:hAnsiTheme="majorHAnsi" w:cstheme="majorBidi" w:ascii="Arial" w:hAnsi="Arial"/>
       <w:b/>
       <w:bCs/>
       <w:color w:val="4F81BD" w:themeColor="accent1"/>
@@ -1647,7 +1839,7 @@
       <w:outlineLvl w:val="3"/>
     </w:pPr>
     <w:rPr>
-      <w:rFonts w:asciiTheme="majorHAnsi" w:eastAsiaTheme="majorEastAsia" w:hAnsiTheme="majorHAnsi" w:cstheme="majorBidi"/>
+      <w:rFonts w:asciiTheme="majorHAnsi" w:eastAsiaTheme="majorEastAsia" w:hAnsiTheme="majorHAnsi" w:cstheme="majorBidi" w:ascii="Arial" w:hAnsi="Arial"/>
       <w:b/>
       <w:bCs/>
       <w:i/>
@@ -1672,7 +1864,7 @@
       <w:outlineLvl w:val="4"/>
     </w:pPr>
     <w:rPr>
-      <w:rFonts w:asciiTheme="majorHAnsi" w:eastAsiaTheme="majorEastAsia" w:hAnsiTheme="majorHAnsi" w:cstheme="majorBidi"/>
+      <w:rFonts w:asciiTheme="majorHAnsi" w:eastAsiaTheme="majorEastAsia" w:hAnsiTheme="majorHAnsi" w:cstheme="majorBidi" w:ascii="Arial" w:hAnsi="Arial"/>
       <w:color w:val="243F60" w:themeColor="accent1" w:themeShade="7F"/>
     </w:rPr>
   </w:style>
@@ -1693,7 +1885,7 @@
       <w:outlineLvl w:val="5"/>
     </w:pPr>
     <w:rPr>
-      <w:rFonts w:asciiTheme="majorHAnsi" w:eastAsiaTheme="majorEastAsia" w:hAnsiTheme="majorHAnsi" w:cstheme="majorBidi"/>
+      <w:rFonts w:asciiTheme="majorHAnsi" w:eastAsiaTheme="majorEastAsia" w:hAnsiTheme="majorHAnsi" w:cstheme="majorBidi" w:ascii="Arial" w:hAnsi="Arial"/>
       <w:i/>
       <w:iCs/>
       <w:color w:val="243F60" w:themeColor="accent1" w:themeShade="7F"/>
@@ -1716,7 +1908,7 @@
       <w:outlineLvl w:val="6"/>
     </w:pPr>
     <w:rPr>
-      <w:rFonts w:asciiTheme="majorHAnsi" w:eastAsiaTheme="majorEastAsia" w:hAnsiTheme="majorHAnsi" w:cstheme="majorBidi"/>
+      <w:rFonts w:asciiTheme="majorHAnsi" w:eastAsiaTheme="majorEastAsia" w:hAnsiTheme="majorHAnsi" w:cstheme="majorBidi" w:ascii="Arial" w:hAnsi="Arial"/>
       <w:i/>
       <w:iCs/>
       <w:color w:val="404040" w:themeColor="text1" w:themeTint="BF"/>
@@ -1739,7 +1931,7 @@
       <w:outlineLvl w:val="7"/>
     </w:pPr>
     <w:rPr>
-      <w:rFonts w:asciiTheme="majorHAnsi" w:eastAsiaTheme="majorEastAsia" w:hAnsiTheme="majorHAnsi" w:cstheme="majorBidi"/>
+      <w:rFonts w:asciiTheme="majorHAnsi" w:eastAsiaTheme="majorEastAsia" w:hAnsiTheme="majorHAnsi" w:cstheme="majorBidi" w:ascii="Arial" w:hAnsi="Arial"/>
       <w:color w:val="4F81BD" w:themeColor="accent1"/>
       <w:sz w:val="20"/>
       <w:szCs w:val="20"/>
@@ -1762,7 +1954,7 @@
       <w:outlineLvl w:val="8"/>
     </w:pPr>
     <w:rPr>
-      <w:rFonts w:asciiTheme="majorHAnsi" w:eastAsiaTheme="majorEastAsia" w:hAnsiTheme="majorHAnsi" w:cstheme="majorBidi"/>
+      <w:rFonts w:asciiTheme="majorHAnsi" w:eastAsiaTheme="majorEastAsia" w:hAnsiTheme="majorHAnsi" w:cstheme="majorBidi" w:ascii="Arial" w:hAnsi="Arial"/>
       <w:i/>
       <w:iCs/>
       <w:color w:val="404040" w:themeColor="text1" w:themeTint="BF"/>
@@ -1775,12 +1967,18 @@
     <w:uiPriority w:val="1"/>
     <w:semiHidden/>
     <w:unhideWhenUsed/>
+    <w:rPr>
+      <w:rFonts w:ascii="Arial" w:hAnsi="Arial"/>
+    </w:rPr>
   </w:style>
   <w:style w:type="table" w:default="1" w:styleId="TableNormal">
     <w:name w:val="Normal Table"/>
     <w:uiPriority w:val="99"/>
     <w:semiHidden/>
     <w:unhideWhenUsed/>
+    <w:rPr>
+      <w:rFonts w:ascii="Arial" w:hAnsi="Arial"/>
+    </w:rPr>
     <w:tblPr>
       <w:tblInd w:w="0" w:type="dxa"/>
       <w:tblCellMar>
@@ -1805,6 +2003,9 @@
     <w:pPr>
       <w:spacing w:after="0" w:line="240" w:lineRule="auto"/>
     </w:pPr>
+    <w:rPr>
+      <w:rFonts w:ascii="Arial" w:hAnsi="Arial"/>
+    </w:rPr>
   </w:style>
   <w:style w:type="character" w:customStyle="1" w:styleId="Heading1Char">
     <w:name w:val="Heading 1 Char"/>
@@ -1813,7 +2014,7 @@
     <w:uiPriority w:val="9"/>
     <w:rsid w:val="00FC693F"/>
     <w:rPr>
-      <w:rFonts w:asciiTheme="majorHAnsi" w:eastAsiaTheme="majorEastAsia" w:hAnsiTheme="majorHAnsi" w:cstheme="majorBidi"/>
+      <w:rFonts w:asciiTheme="majorHAnsi" w:eastAsiaTheme="majorEastAsia" w:hAnsiTheme="majorHAnsi" w:cstheme="majorBidi" w:ascii="Arial" w:hAnsi="Arial"/>
       <w:b/>
       <w:bCs/>
       <w:color w:val="365F91" w:themeColor="accent1" w:themeShade="BF"/>
@@ -1828,7 +2029,7 @@
     <w:uiPriority w:val="9"/>
     <w:rsid w:val="00FC693F"/>
     <w:rPr>
-      <w:rFonts w:asciiTheme="majorHAnsi" w:eastAsiaTheme="majorEastAsia" w:hAnsiTheme="majorHAnsi" w:cstheme="majorBidi"/>
+      <w:rFonts w:asciiTheme="majorHAnsi" w:eastAsiaTheme="majorEastAsia" w:hAnsiTheme="majorHAnsi" w:cstheme="majorBidi" w:ascii="Arial" w:hAnsi="Arial"/>
       <w:b/>
       <w:bCs/>
       <w:color w:val="4F81BD" w:themeColor="accent1"/>
@@ -1843,7 +2044,7 @@
     <w:uiPriority w:val="9"/>
     <w:rsid w:val="00FC693F"/>
     <w:rPr>
-      <w:rFonts w:asciiTheme="majorHAnsi" w:eastAsiaTheme="majorEastAsia" w:hAnsiTheme="majorHAnsi" w:cstheme="majorBidi"/>
+      <w:rFonts w:asciiTheme="majorHAnsi" w:eastAsiaTheme="majorEastAsia" w:hAnsiTheme="majorHAnsi" w:cstheme="majorBidi" w:ascii="Arial" w:hAnsi="Arial"/>
       <w:b/>
       <w:bCs/>
       <w:color w:val="4F81BD" w:themeColor="accent1"/>
@@ -1880,7 +2081,7 @@
     <w:uiPriority w:val="10"/>
     <w:rsid w:val="00FC693F"/>
     <w:rPr>
-      <w:rFonts w:asciiTheme="majorHAnsi" w:eastAsiaTheme="majorEastAsia" w:hAnsiTheme="majorHAnsi" w:cstheme="majorBidi"/>
+      <w:rFonts w:asciiTheme="majorHAnsi" w:eastAsiaTheme="majorEastAsia" w:hAnsiTheme="majorHAnsi" w:cstheme="majorBidi" w:ascii="Arial" w:hAnsi="Arial"/>
       <w:color w:val="17365D" w:themeColor="text2" w:themeShade="BF"/>
       <w:spacing w:val="5"/>
       <w:kern w:val="28"/>
@@ -1902,7 +2103,7 @@
       </w:numPr>
     </w:pPr>
     <w:rPr>
-      <w:rFonts w:asciiTheme="majorHAnsi" w:eastAsiaTheme="majorEastAsia" w:hAnsiTheme="majorHAnsi" w:cstheme="majorBidi"/>
+      <w:rFonts w:asciiTheme="majorHAnsi" w:eastAsiaTheme="majorEastAsia" w:hAnsiTheme="majorHAnsi" w:cstheme="majorBidi" w:ascii="Arial" w:hAnsi="Arial"/>
       <w:i/>
       <w:iCs/>
       <w:color w:val="4F81BD" w:themeColor="accent1"/>
@@ -1918,7 +2119,7 @@
     <w:uiPriority w:val="11"/>
     <w:rsid w:val="00FC693F"/>
     <w:rPr>
-      <w:rFonts w:asciiTheme="majorHAnsi" w:eastAsiaTheme="majorEastAsia" w:hAnsiTheme="majorHAnsi" w:cstheme="majorBidi"/>
+      <w:rFonts w:asciiTheme="majorHAnsi" w:eastAsiaTheme="majorEastAsia" w:hAnsiTheme="majorHAnsi" w:cstheme="majorBidi" w:ascii="Arial" w:hAnsi="Arial"/>
       <w:i/>
       <w:iCs/>
       <w:color w:val="4F81BD" w:themeColor="accent1"/>
@@ -1937,6 +2138,9 @@
       <w:ind w:left="720"/>
       <w:contextualSpacing/>
     </w:pPr>
+    <w:rPr>
+      <w:rFonts w:ascii="Arial" w:hAnsi="Arial"/>
+    </w:rPr>
   </w:style>
   <w:style w:type="paragraph" w:styleId="BodyText">
     <w:name w:val="Body Text"/>
@@ -1948,6 +2152,9 @@
     <w:pPr>
       <w:spacing w:after="120"/>
     </w:pPr>
+    <w:rPr>
+      <w:rFonts w:ascii="Arial" w:hAnsi="Arial"/>
+    </w:rPr>
   </w:style>
   <w:style w:type="character" w:customStyle="1" w:styleId="BodyTextChar">
     <w:name w:val="Body Text Char"/>
@@ -1955,6 +2162,9 @@
     <w:link w:val="BodyText"/>
     <w:uiPriority w:val="99"/>
     <w:rsid w:val="00AA1D8D"/>
+    <w:rPr>
+      <w:rFonts w:ascii="Arial" w:hAnsi="Arial"/>
+    </w:rPr>
   </w:style>
   <w:style w:type="paragraph" w:styleId="BodyText2">
     <w:name w:val="Body Text 2"/>
@@ -1966,6 +2176,9 @@
     <w:pPr>
       <w:spacing w:after="120" w:line="480" w:lineRule="auto"/>
     </w:pPr>
+    <w:rPr>
+      <w:rFonts w:ascii="Arial" w:hAnsi="Arial"/>
+    </w:rPr>
   </w:style>
   <w:style w:type="character" w:customStyle="1" w:styleId="BodyText2Char">
     <w:name w:val="Body Text 2 Char"/>
@@ -1973,6 +2186,9 @@
     <w:link w:val="BodyText2"/>
     <w:uiPriority w:val="99"/>
     <w:rsid w:val="00AA1D8D"/>
+    <w:rPr>
+      <w:rFonts w:ascii="Arial" w:hAnsi="Arial"/>
+    </w:rPr>
   </w:style>
   <w:style w:type="paragraph" w:styleId="BodyText3">
     <w:name w:val="Body Text 3"/>
@@ -1985,6 +2201,7 @@
       <w:spacing w:after="120"/>
     </w:pPr>
     <w:rPr>
+      <w:rFonts w:ascii="Arial" w:hAnsi="Arial"/>
       <w:sz w:val="16"/>
       <w:szCs w:val="16"/>
     </w:rPr>
@@ -1996,6 +2213,7 @@
     <w:uiPriority w:val="99"/>
     <w:rsid w:val="00AA1D8D"/>
     <w:rPr>
+      <w:rFonts w:ascii="Arial" w:hAnsi="Arial"/>
       <w:sz w:val="16"/>
       <w:szCs w:val="16"/>
     </w:rPr>
@@ -2010,6 +2228,9 @@
       <w:ind w:left="360" w:hanging="360"/>
       <w:contextualSpacing/>
     </w:pPr>
+    <w:rPr>
+      <w:rFonts w:ascii="Arial" w:hAnsi="Arial"/>
+    </w:rPr>
   </w:style>
   <w:style w:type="paragraph" w:styleId="List2">
     <w:name w:val="List 2"/>
@@ -2021,6 +2242,9 @@
       <w:ind w:left="720" w:hanging="360"/>
       <w:contextualSpacing/>
     </w:pPr>
+    <w:rPr>
+      <w:rFonts w:ascii="Arial" w:hAnsi="Arial"/>
+    </w:rPr>
   </w:style>
   <w:style w:type="paragraph" w:styleId="List3">
     <w:name w:val="List 3"/>
@@ -2032,6 +2256,9 @@
       <w:ind w:left="1080" w:hanging="360"/>
       <w:contextualSpacing/>
     </w:pPr>
+    <w:rPr>
+      <w:rFonts w:ascii="Arial" w:hAnsi="Arial"/>
+    </w:rPr>
   </w:style>
   <w:style w:type="paragraph" w:styleId="ListBullet">
     <w:name w:val="List Bullet"/>
@@ -2045,6 +2272,9 @@
       </w:numPr>
       <w:contextualSpacing/>
     </w:pPr>
+    <w:rPr>
+      <w:rFonts w:ascii="Arial" w:hAnsi="Arial"/>
+    </w:rPr>
   </w:style>
   <w:style w:type="paragraph" w:styleId="ListBullet2">
     <w:name w:val="List Bullet 2"/>
@@ -2058,6 +2288,9 @@
       </w:numPr>
       <w:contextualSpacing/>
     </w:pPr>
+    <w:rPr>
+      <w:rFonts w:ascii="Arial" w:hAnsi="Arial"/>
+    </w:rPr>
   </w:style>
   <w:style w:type="paragraph" w:styleId="ListBullet3">
     <w:name w:val="List Bullet 3"/>
@@ -2071,6 +2304,9 @@
       </w:numPr>
       <w:contextualSpacing/>
     </w:pPr>
+    <w:rPr>
+      <w:rFonts w:ascii="Arial" w:hAnsi="Arial"/>
+    </w:rPr>
   </w:style>
   <w:style w:type="paragraph" w:styleId="ListNumber">
     <w:name w:val="List Number"/>
@@ -2084,6 +2320,9 @@
       </w:numPr>
       <w:contextualSpacing/>
     </w:pPr>
+    <w:rPr>
+      <w:rFonts w:ascii="Arial" w:hAnsi="Arial"/>
+    </w:rPr>
   </w:style>
   <w:style w:type="paragraph" w:styleId="ListNumber2">
     <w:name w:val="List Number 2"/>
@@ -2097,6 +2336,9 @@
       </w:numPr>
       <w:contextualSpacing/>
     </w:pPr>
+    <w:rPr>
+      <w:rFonts w:ascii="Arial" w:hAnsi="Arial"/>
+    </w:rPr>
   </w:style>
   <w:style w:type="paragraph" w:styleId="ListNumber3">
     <w:name w:val="List Number 3"/>
@@ -2110,6 +2352,9 @@
       </w:numPr>
       <w:contextualSpacing/>
     </w:pPr>
+    <w:rPr>
+      <w:rFonts w:ascii="Arial" w:hAnsi="Arial"/>
+    </w:rPr>
   </w:style>
   <w:style w:type="paragraph" w:styleId="ListContinue">
     <w:name w:val="List Continue"/>
@@ -2122,6 +2367,9 @@
       <w:ind w:left="360"/>
       <w:contextualSpacing/>
     </w:pPr>
+    <w:rPr>
+      <w:rFonts w:ascii="Arial" w:hAnsi="Arial"/>
+    </w:rPr>
   </w:style>
   <w:style w:type="paragraph" w:styleId="ListContinue2">
     <w:name w:val="List Continue 2"/>
@@ -2134,6 +2382,9 @@
       <w:ind w:left="720"/>
       <w:contextualSpacing/>
     </w:pPr>
+    <w:rPr>
+      <w:rFonts w:ascii="Arial" w:hAnsi="Arial"/>
+    </w:rPr>
   </w:style>
   <w:style w:type="paragraph" w:styleId="ListContinue3">
     <w:name w:val="List Continue 3"/>
@@ -2146,6 +2397,9 @@
       <w:ind w:left="1080"/>
       <w:contextualSpacing/>
     </w:pPr>
+    <w:rPr>
+      <w:rFonts w:ascii="Arial" w:hAnsi="Arial"/>
+    </w:rPr>
   </w:style>
   <w:style w:type="paragraph" w:styleId="MacroText">
     <w:name w:val="macro"/>
@@ -2165,7 +2419,7 @@
       </w:tabs>
     </w:pPr>
     <w:rPr>
-      <w:rFonts w:ascii="Courier" w:hAnsi="Courier"/>
+      <w:rFonts w:ascii="Arial" w:hAnsi="Arial"/>
       <w:sz w:val="20"/>
       <w:szCs w:val="20"/>
     </w:rPr>
@@ -2177,7 +2431,7 @@
     <w:uiPriority w:val="99"/>
     <w:rsid w:val="0029639D"/>
     <w:rPr>
-      <w:rFonts w:ascii="Courier" w:hAnsi="Courier"/>
+      <w:rFonts w:ascii="Arial" w:hAnsi="Arial"/>
       <w:sz w:val="20"/>
       <w:szCs w:val="20"/>
     </w:rPr>
@@ -2191,6 +2445,7 @@
     <w:qFormat/>
     <w:rsid w:val="00FC693F"/>
     <w:rPr>
+      <w:rFonts w:ascii="Arial" w:hAnsi="Arial"/>
       <w:i/>
       <w:iCs/>
       <w:color w:val="000000" w:themeColor="text1"/>
@@ -2203,6 +2458,7 @@
     <w:uiPriority w:val="29"/>
     <w:rsid w:val="00FC693F"/>
     <w:rPr>
+      <w:rFonts w:ascii="Arial" w:hAnsi="Arial"/>
       <w:i/>
       <w:iCs/>
       <w:color w:val="000000" w:themeColor="text1"/>
@@ -2216,7 +2472,7 @@
     <w:semiHidden/>
     <w:rsid w:val="00FC693F"/>
     <w:rPr>
-      <w:rFonts w:asciiTheme="majorHAnsi" w:eastAsiaTheme="majorEastAsia" w:hAnsiTheme="majorHAnsi" w:cstheme="majorBidi"/>
+      <w:rFonts w:asciiTheme="majorHAnsi" w:eastAsiaTheme="majorEastAsia" w:hAnsiTheme="majorHAnsi" w:cstheme="majorBidi" w:ascii="Arial" w:hAnsi="Arial"/>
       <w:b/>
       <w:bCs/>
       <w:i/>
@@ -2232,7 +2488,7 @@
     <w:semiHidden/>
     <w:rsid w:val="00FC693F"/>
     <w:rPr>
-      <w:rFonts w:asciiTheme="majorHAnsi" w:eastAsiaTheme="majorEastAsia" w:hAnsiTheme="majorHAnsi" w:cstheme="majorBidi"/>
+      <w:rFonts w:asciiTheme="majorHAnsi" w:eastAsiaTheme="majorEastAsia" w:hAnsiTheme="majorHAnsi" w:cstheme="majorBidi" w:ascii="Arial" w:hAnsi="Arial"/>
       <w:color w:val="243F60" w:themeColor="accent1" w:themeShade="7F"/>
     </w:rPr>
   </w:style>
@@ -2244,7 +2500,7 @@
     <w:semiHidden/>
     <w:rsid w:val="00FC693F"/>
     <w:rPr>
-      <w:rFonts w:asciiTheme="majorHAnsi" w:eastAsiaTheme="majorEastAsia" w:hAnsiTheme="majorHAnsi" w:cstheme="majorBidi"/>
+      <w:rFonts w:asciiTheme="majorHAnsi" w:eastAsiaTheme="majorEastAsia" w:hAnsiTheme="majorHAnsi" w:cstheme="majorBidi" w:ascii="Arial" w:hAnsi="Arial"/>
       <w:i/>
       <w:iCs/>
       <w:color w:val="243F60" w:themeColor="accent1" w:themeShade="7F"/>
@@ -2258,7 +2514,7 @@
     <w:semiHidden/>
     <w:rsid w:val="00FC693F"/>
     <w:rPr>
-      <w:rFonts w:asciiTheme="majorHAnsi" w:eastAsiaTheme="majorEastAsia" w:hAnsiTheme="majorHAnsi" w:cstheme="majorBidi"/>
+      <w:rFonts w:asciiTheme="majorHAnsi" w:eastAsiaTheme="majorEastAsia" w:hAnsiTheme="majorHAnsi" w:cstheme="majorBidi" w:ascii="Arial" w:hAnsi="Arial"/>
       <w:i/>
       <w:iCs/>
       <w:color w:val="404040" w:themeColor="text1" w:themeTint="BF"/>
@@ -2272,7 +2528,7 @@
     <w:semiHidden/>
     <w:rsid w:val="00FC693F"/>
     <w:rPr>
-      <w:rFonts w:asciiTheme="majorHAnsi" w:eastAsiaTheme="majorEastAsia" w:hAnsiTheme="majorHAnsi" w:cstheme="majorBidi"/>
+      <w:rFonts w:asciiTheme="majorHAnsi" w:eastAsiaTheme="majorEastAsia" w:hAnsiTheme="majorHAnsi" w:cstheme="majorBidi" w:ascii="Arial" w:hAnsi="Arial"/>
       <w:color w:val="4F81BD" w:themeColor="accent1"/>
       <w:sz w:val="20"/>
       <w:szCs w:val="20"/>
@@ -2286,7 +2542,7 @@
     <w:semiHidden/>
     <w:rsid w:val="00FC693F"/>
     <w:rPr>
-      <w:rFonts w:asciiTheme="majorHAnsi" w:eastAsiaTheme="majorEastAsia" w:hAnsiTheme="majorHAnsi" w:cstheme="majorBidi"/>
+      <w:rFonts w:asciiTheme="majorHAnsi" w:eastAsiaTheme="majorEastAsia" w:hAnsiTheme="majorHAnsi" w:cstheme="majorBidi" w:ascii="Arial" w:hAnsi="Arial"/>
       <w:i/>
       <w:iCs/>
       <w:color w:val="404040" w:themeColor="text1" w:themeTint="BF"/>
@@ -2307,6 +2563,7 @@
       <w:spacing w:line="240" w:lineRule="auto"/>
     </w:pPr>
     <w:rPr>
+      <w:rFonts w:ascii="Arial" w:hAnsi="Arial"/>
       <w:b/>
       <w:bCs/>
       <w:color w:val="4F81BD" w:themeColor="accent1"/>
@@ -2321,6 +2578,7 @@
     <w:qFormat/>
     <w:rsid w:val="00FC693F"/>
     <w:rPr>
+      <w:rFonts w:ascii="Arial" w:hAnsi="Arial"/>
       <w:b/>
       <w:bCs/>
     </w:rPr>
@@ -2332,6 +2590,7 @@
     <w:qFormat/>
     <w:rsid w:val="00FC693F"/>
     <w:rPr>
+      <w:rFonts w:ascii="Arial" w:hAnsi="Arial"/>
       <w:i/>
       <w:iCs/>
     </w:rPr>
@@ -2352,6 +2611,7 @@
       <w:ind w:left="936" w:right="936"/>
     </w:pPr>
     <w:rPr>
+      <w:rFonts w:ascii="Arial" w:hAnsi="Arial"/>
       <w:b/>
       <w:bCs/>
       <w:i/>
@@ -2366,6 +2626,7 @@
     <w:uiPriority w:val="30"/>
     <w:rsid w:val="00FC693F"/>
     <w:rPr>
+      <w:rFonts w:ascii="Arial" w:hAnsi="Arial"/>
       <w:b/>
       <w:bCs/>
       <w:i/>
@@ -2380,6 +2641,7 @@
     <w:qFormat/>
     <w:rsid w:val="00FC693F"/>
     <w:rPr>
+      <w:rFonts w:ascii="Arial" w:hAnsi="Arial"/>
       <w:i/>
       <w:iCs/>
       <w:color w:val="808080" w:themeColor="text1" w:themeTint="7F"/>
@@ -2392,6 +2654,7 @@
     <w:qFormat/>
     <w:rsid w:val="00FC693F"/>
     <w:rPr>
+      <w:rFonts w:ascii="Arial" w:hAnsi="Arial"/>
       <w:b/>
       <w:bCs/>
       <w:i/>
@@ -2406,6 +2669,7 @@
     <w:qFormat/>
     <w:rsid w:val="00FC693F"/>
     <w:rPr>
+      <w:rFonts w:ascii="Arial" w:hAnsi="Arial"/>
       <w:smallCaps/>
       <w:color w:val="C0504D" w:themeColor="accent2"/>
       <w:u w:val="single"/>
@@ -2418,6 +2682,7 @@
     <w:qFormat/>
     <w:rsid w:val="00FC693F"/>
     <w:rPr>
+      <w:rFonts w:ascii="Arial" w:hAnsi="Arial"/>
       <w:b/>
       <w:bCs/>
       <w:smallCaps/>
@@ -2433,6 +2698,7 @@
     <w:qFormat/>
     <w:rsid w:val="00FC693F"/>
     <w:rPr>
+      <w:rFonts w:ascii="Arial" w:hAnsi="Arial"/>
       <w:b/>
       <w:bCs/>
       <w:smallCaps/>
@@ -2451,6 +2717,9 @@
     <w:pPr>
       <w:outlineLvl w:val="9"/>
     </w:pPr>
+    <w:rPr>
+      <w:rFonts w:ascii="Arial" w:hAnsi="Arial"/>
+    </w:rPr>
   </w:style>
   <w:style w:type="table" w:styleId="TableGrid">
     <w:name w:val="Table Grid"/>
@@ -2460,6 +2729,9 @@
     <w:pPr>
       <w:spacing w:after="0" w:line="240" w:lineRule="auto"/>
     </w:pPr>
+    <w:rPr>
+      <w:rFonts w:ascii="Arial" w:hAnsi="Arial"/>
+    </w:rPr>
     <w:tblPr>
       <w:tblInd w:w="0" w:type="dxa"/>
       <w:tblBorders>
@@ -2487,6 +2759,7 @@
       <w:spacing w:after="0" w:line="240" w:lineRule="auto"/>
     </w:pPr>
     <w:rPr>
+      <w:rFonts w:ascii="Arial" w:hAnsi="Arial"/>
       <w:color w:val="000000" w:themeColor="text1" w:themeShade="BF"/>
     </w:rPr>
     <w:tblPr>
@@ -2590,6 +2863,7 @@
       <w:spacing w:after="0" w:line="240" w:lineRule="auto"/>
     </w:pPr>
     <w:rPr>
+      <w:rFonts w:ascii="Arial" w:hAnsi="Arial"/>
       <w:color w:val="365F91" w:themeColor="accent1" w:themeShade="BF"/>
     </w:rPr>
     <w:tblPr>
@@ -2693,6 +2967,7 @@
       <w:spacing w:after="0" w:line="240" w:lineRule="auto"/>
     </w:pPr>
     <w:rPr>
+      <w:rFonts w:ascii="Arial" w:hAnsi="Arial"/>
       <w:color w:val="943634" w:themeColor="accent2" w:themeShade="BF"/>
     </w:rPr>
     <w:tblPr>
@@ -2796,6 +3071,7 @@
       <w:spacing w:after="0" w:line="240" w:lineRule="auto"/>
     </w:pPr>
     <w:rPr>
+      <w:rFonts w:ascii="Arial" w:hAnsi="Arial"/>
       <w:color w:val="76923C" w:themeColor="accent3" w:themeShade="BF"/>
     </w:rPr>
     <w:tblPr>
@@ -2899,6 +3175,7 @@
       <w:spacing w:after="0" w:line="240" w:lineRule="auto"/>
     </w:pPr>
     <w:rPr>
+      <w:rFonts w:ascii="Arial" w:hAnsi="Arial"/>
       <w:color w:val="5F497A" w:themeColor="accent4" w:themeShade="BF"/>
     </w:rPr>
     <w:tblPr>
@@ -3002,6 +3279,7 @@
       <w:spacing w:after="0" w:line="240" w:lineRule="auto"/>
     </w:pPr>
     <w:rPr>
+      <w:rFonts w:ascii="Arial" w:hAnsi="Arial"/>
       <w:color w:val="31849B" w:themeColor="accent5" w:themeShade="BF"/>
     </w:rPr>
     <w:tblPr>
@@ -3105,6 +3383,7 @@
       <w:spacing w:after="0" w:line="240" w:lineRule="auto"/>
     </w:pPr>
     <w:rPr>
+      <w:rFonts w:ascii="Arial" w:hAnsi="Arial"/>
       <w:color w:val="E36C0A" w:themeColor="accent6" w:themeShade="BF"/>
     </w:rPr>
     <w:tblPr>
@@ -3207,6 +3486,9 @@
     <w:pPr>
       <w:spacing w:after="0" w:line="240" w:lineRule="auto"/>
     </w:pPr>
+    <w:rPr>
+      <w:rFonts w:ascii="Arial" w:hAnsi="Arial"/>
+    </w:rPr>
     <w:tblPr>
       <w:tblStyleRowBandSize w:val="1"/>
       <w:tblStyleColBandSize w:val="1"/>
@@ -3299,6 +3581,9 @@
     <w:pPr>
       <w:spacing w:after="0" w:line="240" w:lineRule="auto"/>
     </w:pPr>
+    <w:rPr>
+      <w:rFonts w:ascii="Arial" w:hAnsi="Arial"/>
+    </w:rPr>
     <w:tblPr>
       <w:tblStyleRowBandSize w:val="1"/>
       <w:tblStyleColBandSize w:val="1"/>
@@ -3391,6 +3676,9 @@
     <w:pPr>
       <w:spacing w:after="0" w:line="240" w:lineRule="auto"/>
     </w:pPr>
+    <w:rPr>
+      <w:rFonts w:ascii="Arial" w:hAnsi="Arial"/>
+    </w:rPr>
     <w:tblPr>
       <w:tblStyleRowBandSize w:val="1"/>
       <w:tblStyleColBandSize w:val="1"/>
@@ -3483,6 +3771,9 @@
     <w:pPr>
       <w:spacing w:after="0" w:line="240" w:lineRule="auto"/>
     </w:pPr>
+    <w:rPr>
+      <w:rFonts w:ascii="Arial" w:hAnsi="Arial"/>
+    </w:rPr>
     <w:tblPr>
       <w:tblStyleRowBandSize w:val="1"/>
       <w:tblStyleColBandSize w:val="1"/>
@@ -3575,6 +3866,9 @@
     <w:pPr>
       <w:spacing w:after="0" w:line="240" w:lineRule="auto"/>
     </w:pPr>
+    <w:rPr>
+      <w:rFonts w:ascii="Arial" w:hAnsi="Arial"/>
+    </w:rPr>
     <w:tblPr>
       <w:tblStyleRowBandSize w:val="1"/>
       <w:tblStyleColBandSize w:val="1"/>
@@ -3667,6 +3961,9 @@
     <w:pPr>
       <w:spacing w:after="0" w:line="240" w:lineRule="auto"/>
     </w:pPr>
+    <w:rPr>
+      <w:rFonts w:ascii="Arial" w:hAnsi="Arial"/>
+    </w:rPr>
     <w:tblPr>
       <w:tblStyleRowBandSize w:val="1"/>
       <w:tblStyleColBandSize w:val="1"/>
@@ -3759,6 +4056,9 @@
     <w:pPr>
       <w:spacing w:after="0" w:line="240" w:lineRule="auto"/>
     </w:pPr>
+    <w:rPr>
+      <w:rFonts w:ascii="Arial" w:hAnsi="Arial"/>
+    </w:rPr>
     <w:tblPr>
       <w:tblStyleRowBandSize w:val="1"/>
       <w:tblStyleColBandSize w:val="1"/>
@@ -3851,6 +4151,9 @@
     <w:pPr>
       <w:spacing w:after="0" w:line="240" w:lineRule="auto"/>
     </w:pPr>
+    <w:rPr>
+      <w:rFonts w:ascii="Arial" w:hAnsi="Arial"/>
+    </w:rPr>
     <w:tblPr>
       <w:tblStyleRowBandSize w:val="1"/>
       <w:tblStyleColBandSize w:val="1"/>
@@ -3981,6 +4284,9 @@
     <w:pPr>
       <w:spacing w:after="0" w:line="240" w:lineRule="auto"/>
     </w:pPr>
+    <w:rPr>
+      <w:rFonts w:ascii="Arial" w:hAnsi="Arial"/>
+    </w:rPr>
     <w:tblPr>
       <w:tblStyleRowBandSize w:val="1"/>
       <w:tblStyleColBandSize w:val="1"/>
@@ -4111,6 +4417,9 @@
     <w:pPr>
       <w:spacing w:after="0" w:line="240" w:lineRule="auto"/>
     </w:pPr>
+    <w:rPr>
+      <w:rFonts w:ascii="Arial" w:hAnsi="Arial"/>
+    </w:rPr>
     <w:tblPr>
       <w:tblStyleRowBandSize w:val="1"/>
       <w:tblStyleColBandSize w:val="1"/>
@@ -4241,6 +4550,9 @@
     <w:pPr>
       <w:spacing w:after="0" w:line="240" w:lineRule="auto"/>
     </w:pPr>
+    <w:rPr>
+      <w:rFonts w:ascii="Arial" w:hAnsi="Arial"/>
+    </w:rPr>
     <w:tblPr>
       <w:tblStyleRowBandSize w:val="1"/>
       <w:tblStyleColBandSize w:val="1"/>
@@ -4371,6 +4683,9 @@
     <w:pPr>
       <w:spacing w:after="0" w:line="240" w:lineRule="auto"/>
     </w:pPr>
+    <w:rPr>
+      <w:rFonts w:ascii="Arial" w:hAnsi="Arial"/>
+    </w:rPr>
     <w:tblPr>
       <w:tblStyleRowBandSize w:val="1"/>
       <w:tblStyleColBandSize w:val="1"/>
@@ -4501,6 +4816,9 @@
     <w:pPr>
       <w:spacing w:after="0" w:line="240" w:lineRule="auto"/>
     </w:pPr>
+    <w:rPr>
+      <w:rFonts w:ascii="Arial" w:hAnsi="Arial"/>
+    </w:rPr>
     <w:tblPr>
       <w:tblStyleRowBandSize w:val="1"/>
       <w:tblStyleColBandSize w:val="1"/>
@@ -4631,6 +4949,9 @@
     <w:pPr>
       <w:spacing w:after="0" w:line="240" w:lineRule="auto"/>
     </w:pPr>
+    <w:rPr>
+      <w:rFonts w:ascii="Arial" w:hAnsi="Arial"/>
+    </w:rPr>
     <w:tblPr>
       <w:tblStyleRowBandSize w:val="1"/>
       <w:tblStyleColBandSize w:val="1"/>
@@ -4761,6 +5082,9 @@
     <w:pPr>
       <w:spacing w:after="0" w:line="240" w:lineRule="auto"/>
     </w:pPr>
+    <w:rPr>
+      <w:rFonts w:ascii="Arial" w:hAnsi="Arial"/>
+    </w:rPr>
     <w:tblPr>
       <w:tblStyleRowBandSize w:val="1"/>
       <w:tblStyleColBandSize w:val="1"/>
@@ -4867,6 +5191,9 @@
     <w:pPr>
       <w:spacing w:after="0" w:line="240" w:lineRule="auto"/>
     </w:pPr>
+    <w:rPr>
+      <w:rFonts w:ascii="Arial" w:hAnsi="Arial"/>
+    </w:rPr>
     <w:tblPr>
       <w:tblStyleRowBandSize w:val="1"/>
       <w:tblStyleColBandSize w:val="1"/>
@@ -4973,6 +5300,9 @@
     <w:pPr>
       <w:spacing w:after="0" w:line="240" w:lineRule="auto"/>
     </w:pPr>
+    <w:rPr>
+      <w:rFonts w:ascii="Arial" w:hAnsi="Arial"/>
+    </w:rPr>
     <w:tblPr>
       <w:tblStyleRowBandSize w:val="1"/>
       <w:tblStyleColBandSize w:val="1"/>
@@ -5079,6 +5409,9 @@
     <w:pPr>
       <w:spacing w:after="0" w:line="240" w:lineRule="auto"/>
     </w:pPr>
+    <w:rPr>
+      <w:rFonts w:ascii="Arial" w:hAnsi="Arial"/>
+    </w:rPr>
     <w:tblPr>
       <w:tblStyleRowBandSize w:val="1"/>
       <w:tblStyleColBandSize w:val="1"/>
@@ -5185,6 +5518,9 @@
     <w:pPr>
       <w:spacing w:after="0" w:line="240" w:lineRule="auto"/>
     </w:pPr>
+    <w:rPr>
+      <w:rFonts w:ascii="Arial" w:hAnsi="Arial"/>
+    </w:rPr>
     <w:tblPr>
       <w:tblStyleRowBandSize w:val="1"/>
       <w:tblStyleColBandSize w:val="1"/>
@@ -5291,6 +5627,9 @@
     <w:pPr>
       <w:spacing w:after="0" w:line="240" w:lineRule="auto"/>
     </w:pPr>
+    <w:rPr>
+      <w:rFonts w:ascii="Arial" w:hAnsi="Arial"/>
+    </w:rPr>
     <w:tblPr>
       <w:tblStyleRowBandSize w:val="1"/>
       <w:tblStyleColBandSize w:val="1"/>
@@ -5397,6 +5736,9 @@
     <w:pPr>
       <w:spacing w:after="0" w:line="240" w:lineRule="auto"/>
     </w:pPr>
+    <w:rPr>
+      <w:rFonts w:ascii="Arial" w:hAnsi="Arial"/>
+    </w:rPr>
     <w:tblPr>
       <w:tblStyleRowBandSize w:val="1"/>
       <w:tblStyleColBandSize w:val="1"/>
@@ -5503,6 +5845,9 @@
     <w:pPr>
       <w:spacing w:after="0" w:line="240" w:lineRule="auto"/>
     </w:pPr>
+    <w:rPr>
+      <w:rFonts w:ascii="Arial" w:hAnsi="Arial"/>
+    </w:rPr>
     <w:tblPr>
       <w:tblStyleRowBandSize w:val="1"/>
       <w:tblStyleColBandSize w:val="1"/>
@@ -5652,6 +5997,9 @@
     <w:pPr>
       <w:spacing w:after="0" w:line="240" w:lineRule="auto"/>
     </w:pPr>
+    <w:rPr>
+      <w:rFonts w:ascii="Arial" w:hAnsi="Arial"/>
+    </w:rPr>
     <w:tblPr>
       <w:tblStyleRowBandSize w:val="1"/>
       <w:tblStyleColBandSize w:val="1"/>
@@ -5801,6 +6149,9 @@
     <w:pPr>
       <w:spacing w:after="0" w:line="240" w:lineRule="auto"/>
     </w:pPr>
+    <w:rPr>
+      <w:rFonts w:ascii="Arial" w:hAnsi="Arial"/>
+    </w:rPr>
     <w:tblPr>
       <w:tblStyleRowBandSize w:val="1"/>
       <w:tblStyleColBandSize w:val="1"/>
@@ -5950,6 +6301,9 @@
     <w:pPr>
       <w:spacing w:after="0" w:line="240" w:lineRule="auto"/>
     </w:pPr>
+    <w:rPr>
+      <w:rFonts w:ascii="Arial" w:hAnsi="Arial"/>
+    </w:rPr>
     <w:tblPr>
       <w:tblStyleRowBandSize w:val="1"/>
       <w:tblStyleColBandSize w:val="1"/>
@@ -6099,6 +6453,9 @@
     <w:pPr>
       <w:spacing w:after="0" w:line="240" w:lineRule="auto"/>
     </w:pPr>
+    <w:rPr>
+      <w:rFonts w:ascii="Arial" w:hAnsi="Arial"/>
+    </w:rPr>
     <w:tblPr>
       <w:tblStyleRowBandSize w:val="1"/>
       <w:tblStyleColBandSize w:val="1"/>
@@ -6248,6 +6605,9 @@
     <w:pPr>
       <w:spacing w:after="0" w:line="240" w:lineRule="auto"/>
     </w:pPr>
+    <w:rPr>
+      <w:rFonts w:ascii="Arial" w:hAnsi="Arial"/>
+    </w:rPr>
     <w:tblPr>
       <w:tblStyleRowBandSize w:val="1"/>
       <w:tblStyleColBandSize w:val="1"/>
@@ -6397,6 +6757,9 @@
     <w:pPr>
       <w:spacing w:after="0" w:line="240" w:lineRule="auto"/>
     </w:pPr>
+    <w:rPr>
+      <w:rFonts w:ascii="Arial" w:hAnsi="Arial"/>
+    </w:rPr>
     <w:tblPr>
       <w:tblStyleRowBandSize w:val="1"/>
       <w:tblStyleColBandSize w:val="1"/>
@@ -6547,6 +6910,7 @@
       <w:spacing w:after="0" w:line="240" w:lineRule="auto"/>
     </w:pPr>
     <w:rPr>
+      <w:rFonts w:ascii="Arial" w:hAnsi="Arial"/>
       <w:color w:val="000000" w:themeColor="text1"/>
     </w:rPr>
     <w:tblPr>
@@ -6631,6 +6995,7 @@
       <w:spacing w:after="0" w:line="240" w:lineRule="auto"/>
     </w:pPr>
     <w:rPr>
+      <w:rFonts w:ascii="Arial" w:hAnsi="Arial"/>
       <w:color w:val="000000" w:themeColor="text1"/>
     </w:rPr>
     <w:tblPr>
@@ -6715,6 +7080,7 @@
       <w:spacing w:after="0" w:line="240" w:lineRule="auto"/>
     </w:pPr>
     <w:rPr>
+      <w:rFonts w:ascii="Arial" w:hAnsi="Arial"/>
       <w:color w:val="000000" w:themeColor="text1"/>
     </w:rPr>
     <w:tblPr>
@@ -6799,6 +7165,7 @@
       <w:spacing w:after="0" w:line="240" w:lineRule="auto"/>
     </w:pPr>
     <w:rPr>
+      <w:rFonts w:ascii="Arial" w:hAnsi="Arial"/>
       <w:color w:val="000000" w:themeColor="text1"/>
     </w:rPr>
     <w:tblPr>
@@ -6883,6 +7250,7 @@
       <w:spacing w:after="0" w:line="240" w:lineRule="auto"/>
     </w:pPr>
     <w:rPr>
+      <w:rFonts w:ascii="Arial" w:hAnsi="Arial"/>
       <w:color w:val="000000" w:themeColor="text1"/>
     </w:rPr>
     <w:tblPr>
@@ -6967,6 +7335,7 @@
       <w:spacing w:after="0" w:line="240" w:lineRule="auto"/>
     </w:pPr>
     <w:rPr>
+      <w:rFonts w:ascii="Arial" w:hAnsi="Arial"/>
       <w:color w:val="000000" w:themeColor="text1"/>
     </w:rPr>
     <w:tblPr>
@@ -7051,6 +7420,7 @@
       <w:spacing w:after="0" w:line="240" w:lineRule="auto"/>
     </w:pPr>
     <w:rPr>
+      <w:rFonts w:ascii="Arial" w:hAnsi="Arial"/>
       <w:color w:val="000000" w:themeColor="text1"/>
     </w:rPr>
     <w:tblPr>
@@ -7135,7 +7505,7 @@
       <w:spacing w:after="0" w:line="240" w:lineRule="auto"/>
     </w:pPr>
     <w:rPr>
-      <w:rFonts w:asciiTheme="majorHAnsi" w:eastAsiaTheme="majorEastAsia" w:hAnsiTheme="majorHAnsi" w:cstheme="majorBidi"/>
+      <w:rFonts w:asciiTheme="majorHAnsi" w:eastAsiaTheme="majorEastAsia" w:hAnsiTheme="majorHAnsi" w:cstheme="majorBidi" w:ascii="Arial" w:hAnsi="Arial"/>
       <w:color w:val="000000" w:themeColor="text1"/>
     </w:rPr>
     <w:tblPr>
@@ -7263,7 +7633,7 @@
       <w:spacing w:after="0" w:line="240" w:lineRule="auto"/>
     </w:pPr>
     <w:rPr>
-      <w:rFonts w:asciiTheme="majorHAnsi" w:eastAsiaTheme="majorEastAsia" w:hAnsiTheme="majorHAnsi" w:cstheme="majorBidi"/>
+      <w:rFonts w:asciiTheme="majorHAnsi" w:eastAsiaTheme="majorEastAsia" w:hAnsiTheme="majorHAnsi" w:cstheme="majorBidi" w:ascii="Arial" w:hAnsi="Arial"/>
       <w:color w:val="000000" w:themeColor="text1"/>
     </w:rPr>
     <w:tblPr>
@@ -7391,7 +7761,7 @@
       <w:spacing w:after="0" w:line="240" w:lineRule="auto"/>
     </w:pPr>
     <w:rPr>
-      <w:rFonts w:asciiTheme="majorHAnsi" w:eastAsiaTheme="majorEastAsia" w:hAnsiTheme="majorHAnsi" w:cstheme="majorBidi"/>
+      <w:rFonts w:asciiTheme="majorHAnsi" w:eastAsiaTheme="majorEastAsia" w:hAnsiTheme="majorHAnsi" w:cstheme="majorBidi" w:ascii="Arial" w:hAnsi="Arial"/>
       <w:color w:val="000000" w:themeColor="text1"/>
     </w:rPr>
     <w:tblPr>
@@ -7519,7 +7889,7 @@
       <w:spacing w:after="0" w:line="240" w:lineRule="auto"/>
     </w:pPr>
     <w:rPr>
-      <w:rFonts w:asciiTheme="majorHAnsi" w:eastAsiaTheme="majorEastAsia" w:hAnsiTheme="majorHAnsi" w:cstheme="majorBidi"/>
+      <w:rFonts w:asciiTheme="majorHAnsi" w:eastAsiaTheme="majorEastAsia" w:hAnsiTheme="majorHAnsi" w:cstheme="majorBidi" w:ascii="Arial" w:hAnsi="Arial"/>
       <w:color w:val="000000" w:themeColor="text1"/>
     </w:rPr>
     <w:tblPr>
@@ -7647,7 +8017,7 @@
       <w:spacing w:after="0" w:line="240" w:lineRule="auto"/>
     </w:pPr>
     <w:rPr>
-      <w:rFonts w:asciiTheme="majorHAnsi" w:eastAsiaTheme="majorEastAsia" w:hAnsiTheme="majorHAnsi" w:cstheme="majorBidi"/>
+      <w:rFonts w:asciiTheme="majorHAnsi" w:eastAsiaTheme="majorEastAsia" w:hAnsiTheme="majorHAnsi" w:cstheme="majorBidi" w:ascii="Arial" w:hAnsi="Arial"/>
       <w:color w:val="000000" w:themeColor="text1"/>
     </w:rPr>
     <w:tblPr>
@@ -7775,7 +8145,7 @@
       <w:spacing w:after="0" w:line="240" w:lineRule="auto"/>
     </w:pPr>
     <w:rPr>
-      <w:rFonts w:asciiTheme="majorHAnsi" w:eastAsiaTheme="majorEastAsia" w:hAnsiTheme="majorHAnsi" w:cstheme="majorBidi"/>
+      <w:rFonts w:asciiTheme="majorHAnsi" w:eastAsiaTheme="majorEastAsia" w:hAnsiTheme="majorHAnsi" w:cstheme="majorBidi" w:ascii="Arial" w:hAnsi="Arial"/>
       <w:color w:val="000000" w:themeColor="text1"/>
     </w:rPr>
     <w:tblPr>
@@ -7903,7 +8273,7 @@
       <w:spacing w:after="0" w:line="240" w:lineRule="auto"/>
     </w:pPr>
     <w:rPr>
-      <w:rFonts w:asciiTheme="majorHAnsi" w:eastAsiaTheme="majorEastAsia" w:hAnsiTheme="majorHAnsi" w:cstheme="majorBidi"/>
+      <w:rFonts w:asciiTheme="majorHAnsi" w:eastAsiaTheme="majorEastAsia" w:hAnsiTheme="majorHAnsi" w:cstheme="majorBidi" w:ascii="Arial" w:hAnsi="Arial"/>
       <w:color w:val="000000" w:themeColor="text1"/>
     </w:rPr>
     <w:tblPr>
@@ -8030,6 +8400,9 @@
     <w:pPr>
       <w:spacing w:after="0" w:line="240" w:lineRule="auto"/>
     </w:pPr>
+    <w:rPr>
+      <w:rFonts w:ascii="Arial" w:hAnsi="Arial"/>
+    </w:rPr>
     <w:tblPr>
       <w:tblStyleRowBandSize w:val="1"/>
       <w:tblStyleColBandSize w:val="1"/>
@@ -8103,6 +8476,9 @@
     <w:pPr>
       <w:spacing w:after="0" w:line="240" w:lineRule="auto"/>
     </w:pPr>
+    <w:rPr>
+      <w:rFonts w:ascii="Arial" w:hAnsi="Arial"/>
+    </w:rPr>
     <w:tblPr>
       <w:tblStyleRowBandSize w:val="1"/>
       <w:tblStyleColBandSize w:val="1"/>
@@ -8176,6 +8552,9 @@
     <w:pPr>
       <w:spacing w:after="0" w:line="240" w:lineRule="auto"/>
     </w:pPr>
+    <w:rPr>
+      <w:rFonts w:ascii="Arial" w:hAnsi="Arial"/>
+    </w:rPr>
     <w:tblPr>
       <w:tblStyleRowBandSize w:val="1"/>
       <w:tblStyleColBandSize w:val="1"/>
@@ -8249,6 +8628,9 @@
     <w:pPr>
       <w:spacing w:after="0" w:line="240" w:lineRule="auto"/>
     </w:pPr>
+    <w:rPr>
+      <w:rFonts w:ascii="Arial" w:hAnsi="Arial"/>
+    </w:rPr>
     <w:tblPr>
       <w:tblStyleRowBandSize w:val="1"/>
       <w:tblStyleColBandSize w:val="1"/>
@@ -8322,6 +8704,9 @@
     <w:pPr>
       <w:spacing w:after="0" w:line="240" w:lineRule="auto"/>
     </w:pPr>
+    <w:rPr>
+      <w:rFonts w:ascii="Arial" w:hAnsi="Arial"/>
+    </w:rPr>
     <w:tblPr>
       <w:tblStyleRowBandSize w:val="1"/>
       <w:tblStyleColBandSize w:val="1"/>
@@ -8395,6 +8780,9 @@
     <w:pPr>
       <w:spacing w:after="0" w:line="240" w:lineRule="auto"/>
     </w:pPr>
+    <w:rPr>
+      <w:rFonts w:ascii="Arial" w:hAnsi="Arial"/>
+    </w:rPr>
     <w:tblPr>
       <w:tblStyleRowBandSize w:val="1"/>
       <w:tblStyleColBandSize w:val="1"/>
@@ -8468,6 +8856,9 @@
     <w:pPr>
       <w:spacing w:after="0" w:line="240" w:lineRule="auto"/>
     </w:pPr>
+    <w:rPr>
+      <w:rFonts w:ascii="Arial" w:hAnsi="Arial"/>
+    </w:rPr>
     <w:tblPr>
       <w:tblStyleRowBandSize w:val="1"/>
       <w:tblStyleColBandSize w:val="1"/>
@@ -8542,7 +8933,7 @@
       <w:spacing w:after="0" w:line="240" w:lineRule="auto"/>
     </w:pPr>
     <w:rPr>
-      <w:rFonts w:asciiTheme="majorHAnsi" w:eastAsiaTheme="majorEastAsia" w:hAnsiTheme="majorHAnsi" w:cstheme="majorBidi"/>
+      <w:rFonts w:asciiTheme="majorHAnsi" w:eastAsiaTheme="majorEastAsia" w:hAnsiTheme="majorHAnsi" w:cstheme="majorBidi" w:ascii="Arial" w:hAnsi="Arial"/>
       <w:color w:val="000000" w:themeColor="text1"/>
     </w:rPr>
     <w:tblPr>
@@ -8667,7 +9058,7 @@
       <w:spacing w:after="0" w:line="240" w:lineRule="auto"/>
     </w:pPr>
     <w:rPr>
-      <w:rFonts w:asciiTheme="majorHAnsi" w:eastAsiaTheme="majorEastAsia" w:hAnsiTheme="majorHAnsi" w:cstheme="majorBidi"/>
+      <w:rFonts w:asciiTheme="majorHAnsi" w:eastAsiaTheme="majorEastAsia" w:hAnsiTheme="majorHAnsi" w:cstheme="majorBidi" w:ascii="Arial" w:hAnsi="Arial"/>
       <w:color w:val="000000" w:themeColor="text1"/>
     </w:rPr>
     <w:tblPr>
@@ -8792,7 +9183,7 @@
       <w:spacing w:after="0" w:line="240" w:lineRule="auto"/>
     </w:pPr>
     <w:rPr>
-      <w:rFonts w:asciiTheme="majorHAnsi" w:eastAsiaTheme="majorEastAsia" w:hAnsiTheme="majorHAnsi" w:cstheme="majorBidi"/>
+      <w:rFonts w:asciiTheme="majorHAnsi" w:eastAsiaTheme="majorEastAsia" w:hAnsiTheme="majorHAnsi" w:cstheme="majorBidi" w:ascii="Arial" w:hAnsi="Arial"/>
       <w:color w:val="000000" w:themeColor="text1"/>
     </w:rPr>
     <w:tblPr>
@@ -8917,7 +9308,7 @@
       <w:spacing w:after="0" w:line="240" w:lineRule="auto"/>
     </w:pPr>
     <w:rPr>
-      <w:rFonts w:asciiTheme="majorHAnsi" w:eastAsiaTheme="majorEastAsia" w:hAnsiTheme="majorHAnsi" w:cstheme="majorBidi"/>
+      <w:rFonts w:asciiTheme="majorHAnsi" w:eastAsiaTheme="majorEastAsia" w:hAnsiTheme="majorHAnsi" w:cstheme="majorBidi" w:ascii="Arial" w:hAnsi="Arial"/>
       <w:color w:val="000000" w:themeColor="text1"/>
     </w:rPr>
     <w:tblPr>
@@ -9042,7 +9433,7 @@
       <w:spacing w:after="0" w:line="240" w:lineRule="auto"/>
     </w:pPr>
     <w:rPr>
-      <w:rFonts w:asciiTheme="majorHAnsi" w:eastAsiaTheme="majorEastAsia" w:hAnsiTheme="majorHAnsi" w:cstheme="majorBidi"/>
+      <w:rFonts w:asciiTheme="majorHAnsi" w:eastAsiaTheme="majorEastAsia" w:hAnsiTheme="majorHAnsi" w:cstheme="majorBidi" w:ascii="Arial" w:hAnsi="Arial"/>
       <w:color w:val="000000" w:themeColor="text1"/>
     </w:rPr>
     <w:tblPr>
@@ -9167,7 +9558,7 @@
       <w:spacing w:after="0" w:line="240" w:lineRule="auto"/>
     </w:pPr>
     <w:rPr>
-      <w:rFonts w:asciiTheme="majorHAnsi" w:eastAsiaTheme="majorEastAsia" w:hAnsiTheme="majorHAnsi" w:cstheme="majorBidi"/>
+      <w:rFonts w:asciiTheme="majorHAnsi" w:eastAsiaTheme="majorEastAsia" w:hAnsiTheme="majorHAnsi" w:cstheme="majorBidi" w:ascii="Arial" w:hAnsi="Arial"/>
       <w:color w:val="000000" w:themeColor="text1"/>
     </w:rPr>
     <w:tblPr>
@@ -9292,7 +9683,7 @@
       <w:spacing w:after="0" w:line="240" w:lineRule="auto"/>
     </w:pPr>
     <w:rPr>
-      <w:rFonts w:asciiTheme="majorHAnsi" w:eastAsiaTheme="majorEastAsia" w:hAnsiTheme="majorHAnsi" w:cstheme="majorBidi"/>
+      <w:rFonts w:asciiTheme="majorHAnsi" w:eastAsiaTheme="majorEastAsia" w:hAnsiTheme="majorHAnsi" w:cstheme="majorBidi" w:ascii="Arial" w:hAnsi="Arial"/>
       <w:color w:val="000000" w:themeColor="text1"/>
     </w:rPr>
     <w:tblPr>
@@ -9416,6 +9807,9 @@
     <w:pPr>
       <w:spacing w:after="0" w:line="240" w:lineRule="auto"/>
     </w:pPr>
+    <w:rPr>
+      <w:rFonts w:ascii="Arial" w:hAnsi="Arial"/>
+    </w:rPr>
     <w:tblPr>
       <w:tblStyleRowBandSize w:val="1"/>
       <w:tblStyleColBandSize w:val="1"/>
@@ -9557,6 +9951,9 @@
     <w:pPr>
       <w:spacing w:after="0" w:line="240" w:lineRule="auto"/>
     </w:pPr>
+    <w:rPr>
+      <w:rFonts w:ascii="Arial" w:hAnsi="Arial"/>
+    </w:rPr>
     <w:tblPr>
       <w:tblStyleRowBandSize w:val="1"/>
       <w:tblStyleColBandSize w:val="1"/>
@@ -9698,6 +10095,9 @@
     <w:pPr>
       <w:spacing w:after="0" w:line="240" w:lineRule="auto"/>
     </w:pPr>
+    <w:rPr>
+      <w:rFonts w:ascii="Arial" w:hAnsi="Arial"/>
+    </w:rPr>
     <w:tblPr>
       <w:tblStyleRowBandSize w:val="1"/>
       <w:tblStyleColBandSize w:val="1"/>
@@ -9839,6 +10239,9 @@
     <w:pPr>
       <w:spacing w:after="0" w:line="240" w:lineRule="auto"/>
     </w:pPr>
+    <w:rPr>
+      <w:rFonts w:ascii="Arial" w:hAnsi="Arial"/>
+    </w:rPr>
     <w:tblPr>
       <w:tblStyleRowBandSize w:val="1"/>
       <w:tblStyleColBandSize w:val="1"/>
@@ -9980,6 +10383,9 @@
     <w:pPr>
       <w:spacing w:after="0" w:line="240" w:lineRule="auto"/>
     </w:pPr>
+    <w:rPr>
+      <w:rFonts w:ascii="Arial" w:hAnsi="Arial"/>
+    </w:rPr>
     <w:tblPr>
       <w:tblStyleRowBandSize w:val="1"/>
       <w:tblStyleColBandSize w:val="1"/>
@@ -10121,6 +10527,9 @@
     <w:pPr>
       <w:spacing w:after="0" w:line="240" w:lineRule="auto"/>
     </w:pPr>
+    <w:rPr>
+      <w:rFonts w:ascii="Arial" w:hAnsi="Arial"/>
+    </w:rPr>
     <w:tblPr>
       <w:tblStyleRowBandSize w:val="1"/>
       <w:tblStyleColBandSize w:val="1"/>
@@ -10262,6 +10671,9 @@
     <w:pPr>
       <w:spacing w:after="0" w:line="240" w:lineRule="auto"/>
     </w:pPr>
+    <w:rPr>
+      <w:rFonts w:ascii="Arial" w:hAnsi="Arial"/>
+    </w:rPr>
     <w:tblPr>
       <w:tblStyleRowBandSize w:val="1"/>
       <w:tblStyleColBandSize w:val="1"/>
@@ -10404,6 +10816,7 @@
       <w:spacing w:after="0" w:line="240" w:lineRule="auto"/>
     </w:pPr>
     <w:rPr>
+      <w:rFonts w:ascii="Arial" w:hAnsi="Arial"/>
       <w:color w:val="FFFFFF" w:themeColor="background1"/>
     </w:rPr>
     <w:tblPr>
@@ -10518,6 +10931,7 @@
       <w:spacing w:after="0" w:line="240" w:lineRule="auto"/>
     </w:pPr>
     <w:rPr>
+      <w:rFonts w:ascii="Arial" w:hAnsi="Arial"/>
       <w:color w:val="FFFFFF" w:themeColor="background1"/>
     </w:rPr>
     <w:tblPr>
@@ -10632,6 +11046,7 @@
       <w:spacing w:after="0" w:line="240" w:lineRule="auto"/>
     </w:pPr>
     <w:rPr>
+      <w:rFonts w:ascii="Arial" w:hAnsi="Arial"/>
       <w:color w:val="FFFFFF" w:themeColor="background1"/>
     </w:rPr>
     <w:tblPr>
@@ -10746,6 +11161,7 @@
       <w:spacing w:after="0" w:line="240" w:lineRule="auto"/>
     </w:pPr>
     <w:rPr>
+      <w:rFonts w:ascii="Arial" w:hAnsi="Arial"/>
       <w:color w:val="FFFFFF" w:themeColor="background1"/>
     </w:rPr>
     <w:tblPr>
@@ -10860,6 +11276,7 @@
       <w:spacing w:after="0" w:line="240" w:lineRule="auto"/>
     </w:pPr>
     <w:rPr>
+      <w:rFonts w:ascii="Arial" w:hAnsi="Arial"/>
       <w:color w:val="FFFFFF" w:themeColor="background1"/>
     </w:rPr>
     <w:tblPr>
@@ -10974,6 +11391,7 @@
       <w:spacing w:after="0" w:line="240" w:lineRule="auto"/>
     </w:pPr>
     <w:rPr>
+      <w:rFonts w:ascii="Arial" w:hAnsi="Arial"/>
       <w:color w:val="FFFFFF" w:themeColor="background1"/>
     </w:rPr>
     <w:tblPr>
@@ -11088,6 +11506,7 @@
       <w:spacing w:after="0" w:line="240" w:lineRule="auto"/>
     </w:pPr>
     <w:rPr>
+      <w:rFonts w:ascii="Arial" w:hAnsi="Arial"/>
       <w:color w:val="FFFFFF" w:themeColor="background1"/>
     </w:rPr>
     <w:tblPr>
@@ -11202,6 +11621,7 @@
       <w:spacing w:after="0" w:line="240" w:lineRule="auto"/>
     </w:pPr>
     <w:rPr>
+      <w:rFonts w:ascii="Arial" w:hAnsi="Arial"/>
       <w:color w:val="000000" w:themeColor="text1"/>
     </w:rPr>
     <w:tblPr>
@@ -11324,6 +11744,7 @@
       <w:spacing w:after="0" w:line="240" w:lineRule="auto"/>
     </w:pPr>
     <w:rPr>
+      <w:rFonts w:ascii="Arial" w:hAnsi="Arial"/>
       <w:color w:val="000000" w:themeColor="text1"/>
     </w:rPr>
     <w:tblPr>
@@ -11446,6 +11867,7 @@
       <w:spacing w:after="0" w:line="240" w:lineRule="auto"/>
     </w:pPr>
     <w:rPr>
+      <w:rFonts w:ascii="Arial" w:hAnsi="Arial"/>
       <w:color w:val="000000" w:themeColor="text1"/>
     </w:rPr>
     <w:tblPr>
@@ -11568,6 +11990,7 @@
       <w:spacing w:after="0" w:line="240" w:lineRule="auto"/>
     </w:pPr>
     <w:rPr>
+      <w:rFonts w:ascii="Arial" w:hAnsi="Arial"/>
       <w:color w:val="000000" w:themeColor="text1"/>
     </w:rPr>
     <w:tblPr>
@@ -11680,6 +12103,7 @@
       <w:spacing w:after="0" w:line="240" w:lineRule="auto"/>
     </w:pPr>
     <w:rPr>
+      <w:rFonts w:ascii="Arial" w:hAnsi="Arial"/>
       <w:color w:val="000000" w:themeColor="text1"/>
     </w:rPr>
     <w:tblPr>
@@ -11802,6 +12226,7 @@
       <w:spacing w:after="0" w:line="240" w:lineRule="auto"/>
     </w:pPr>
     <w:rPr>
+      <w:rFonts w:ascii="Arial" w:hAnsi="Arial"/>
       <w:color w:val="000000" w:themeColor="text1"/>
     </w:rPr>
     <w:tblPr>
@@ -11924,6 +12349,7 @@
       <w:spacing w:after="0" w:line="240" w:lineRule="auto"/>
     </w:pPr>
     <w:rPr>
+      <w:rFonts w:ascii="Arial" w:hAnsi="Arial"/>
       <w:color w:val="000000" w:themeColor="text1"/>
     </w:rPr>
     <w:tblPr>
@@ -12046,6 +12472,7 @@
       <w:spacing w:after="0" w:line="240" w:lineRule="auto"/>
     </w:pPr>
     <w:rPr>
+      <w:rFonts w:ascii="Arial" w:hAnsi="Arial"/>
       <w:color w:val="000000" w:themeColor="text1"/>
     </w:rPr>
     <w:tblPr>
@@ -12132,6 +12559,7 @@
       <w:spacing w:after="0" w:line="240" w:lineRule="auto"/>
     </w:pPr>
     <w:rPr>
+      <w:rFonts w:ascii="Arial" w:hAnsi="Arial"/>
       <w:color w:val="000000" w:themeColor="text1"/>
     </w:rPr>
     <w:tblPr>
@@ -12218,6 +12646,7 @@
       <w:spacing w:after="0" w:line="240" w:lineRule="auto"/>
     </w:pPr>
     <w:rPr>
+      <w:rFonts w:ascii="Arial" w:hAnsi="Arial"/>
       <w:color w:val="000000" w:themeColor="text1"/>
     </w:rPr>
     <w:tblPr>
@@ -12304,6 +12733,7 @@
       <w:spacing w:after="0" w:line="240" w:lineRule="auto"/>
     </w:pPr>
     <w:rPr>
+      <w:rFonts w:ascii="Arial" w:hAnsi="Arial"/>
       <w:color w:val="000000" w:themeColor="text1"/>
     </w:rPr>
     <w:tblPr>
@@ -12390,6 +12820,7 @@
       <w:spacing w:after="0" w:line="240" w:lineRule="auto"/>
     </w:pPr>
     <w:rPr>
+      <w:rFonts w:ascii="Arial" w:hAnsi="Arial"/>
       <w:color w:val="000000" w:themeColor="text1"/>
     </w:rPr>
     <w:tblPr>
@@ -12476,6 +12907,7 @@
       <w:spacing w:after="0" w:line="240" w:lineRule="auto"/>
     </w:pPr>
     <w:rPr>
+      <w:rFonts w:ascii="Arial" w:hAnsi="Arial"/>
       <w:color w:val="000000" w:themeColor="text1"/>
     </w:rPr>
     <w:tblPr>
@@ -12562,6 +12994,7 @@
       <w:spacing w:after="0" w:line="240" w:lineRule="auto"/>
     </w:pPr>
     <w:rPr>
+      <w:rFonts w:ascii="Arial" w:hAnsi="Arial"/>
       <w:color w:val="000000" w:themeColor="text1"/>
     </w:rPr>
     <w:tblPr>
@@ -12648,6 +13081,7 @@
       <w:spacing w:after="0" w:line="240" w:lineRule="auto"/>
     </w:pPr>
     <w:rPr>
+      <w:rFonts w:ascii="Arial" w:hAnsi="Arial"/>
       <w:color w:val="000000" w:themeColor="text1"/>
     </w:rPr>
     <w:tblPr>
@@ -12728,6 +13162,7 @@
       <w:spacing w:after="0" w:line="240" w:lineRule="auto"/>
     </w:pPr>
     <w:rPr>
+      <w:rFonts w:ascii="Arial" w:hAnsi="Arial"/>
       <w:color w:val="000000" w:themeColor="text1"/>
     </w:rPr>
     <w:tblPr>
@@ -12808,6 +13243,7 @@
       <w:spacing w:after="0" w:line="240" w:lineRule="auto"/>
     </w:pPr>
     <w:rPr>
+      <w:rFonts w:ascii="Arial" w:hAnsi="Arial"/>
       <w:color w:val="000000" w:themeColor="text1"/>
     </w:rPr>
     <w:tblPr>
@@ -12888,6 +13324,7 @@
       <w:spacing w:after="0" w:line="240" w:lineRule="auto"/>
     </w:pPr>
     <w:rPr>
+      <w:rFonts w:ascii="Arial" w:hAnsi="Arial"/>
       <w:color w:val="000000" w:themeColor="text1"/>
     </w:rPr>
     <w:tblPr>
@@ -12968,6 +13405,7 @@
       <w:spacing w:after="0" w:line="240" w:lineRule="auto"/>
     </w:pPr>
     <w:rPr>
+      <w:rFonts w:ascii="Arial" w:hAnsi="Arial"/>
       <w:color w:val="000000" w:themeColor="text1"/>
     </w:rPr>
     <w:tblPr>
@@ -13048,6 +13486,7 @@
       <w:spacing w:after="0" w:line="240" w:lineRule="auto"/>
     </w:pPr>
     <w:rPr>
+      <w:rFonts w:ascii="Arial" w:hAnsi="Arial"/>
       <w:color w:val="000000" w:themeColor="text1"/>
     </w:rPr>
     <w:tblPr>
@@ -13128,6 +13567,7 @@
       <w:spacing w:after="0" w:line="240" w:lineRule="auto"/>
     </w:pPr>
     <w:rPr>
+      <w:rFonts w:ascii="Arial" w:hAnsi="Arial"/>
       <w:color w:val="000000" w:themeColor="text1"/>
     </w:rPr>
     <w:tblPr>

</xml_diff>